<commit_message>
CV-Redesign: modernes zweispaltiges Layout (Header-Band, Sidebar, Akzentfarben) + PNG-Vorschau
</commit_message>
<xml_diff>
--- a/bewerbung/Lebenslauf_Burak_Uecoez.docx
+++ b/bewerbung/Lebenslauf_Burak_Uecoez.docx
@@ -2,1897 +2,2072 @@
 <file path=word/document.xml><?xml version="1.0" encoding="utf-8"?>
 <w:document xmlns:wpc="http://schemas.microsoft.com/office/word/2010/wordprocessingCanvas" xmlns:mo="http://schemas.microsoft.com/office/mac/office/2008/main" xmlns:mc="http://schemas.openxmlformats.org/markup-compatibility/2006" xmlns:mv="urn:schemas-microsoft-com:mac:vml" xmlns:o="urn:schemas-microsoft-com:office:office" xmlns:r="http://schemas.openxmlformats.org/officeDocument/2006/relationships" xmlns:m="http://schemas.openxmlformats.org/officeDocument/2006/math" xmlns:v="urn:schemas-microsoft-com:vml" xmlns:wp14="http://schemas.microsoft.com/office/word/2010/wordprocessingDrawing" xmlns:wp="http://schemas.openxmlformats.org/drawingml/2006/wordprocessingDrawing" xmlns:w10="urn:schemas-microsoft-com:office:word" xmlns:w="http://schemas.openxmlformats.org/wordprocessingml/2006/main" xmlns:w14="http://schemas.microsoft.com/office/word/2010/wordml" xmlns:wpg="http://schemas.microsoft.com/office/word/2010/wordprocessingGroup" xmlns:wpi="http://schemas.microsoft.com/office/word/2010/wordprocessingInk" xmlns:wne="http://schemas.microsoft.com/office/word/2006/wordml" xmlns:wps="http://schemas.microsoft.com/office/word/2010/wordprocessingShape" mc:Ignorable="w14 wp14">
   <w:body>
+    <w:tbl>
+      <w:tblPr>
+        <w:tblW w:type="auto" w:w="0"/>
+        <w:jc w:val="center"/>
+        <w:tblLook w:firstColumn="1" w:firstRow="1" w:lastColumn="0" w:lastRow="0" w:noHBand="0" w:noVBand="1" w:val="04A0"/>
+        <w:tblLayout w:type="fixed"/>
+      </w:tblPr>
+      <w:tblGrid>
+        <w:gridCol w:w="10432"/>
+      </w:tblGrid>
+      <w:tr>
+        <w:tc>
+          <w:tcPr>
+            <w:tcW w:type="dxa" w:w="10432"/>
+            <w:shd w:val="clear" w:color="auto" w:fill="162A43"/>
+            <w:tcMar>
+              <w:top w:w="300" w:type="dxa"/>
+              <w:bottom w:w="260" w:type="dxa"/>
+              <w:start w:w="360" w:type="dxa"/>
+              <w:end w:w="360" w:type="dxa"/>
+              <w:left w:w="360" w:type="dxa"/>
+              <w:right w:w="360" w:type="dxa"/>
+            </w:tcMar>
+          </w:tcPr>
+          <w:p>
+            <w:pPr>
+              <w:spacing w:before="0" w:after="40" w:line="240" w:lineRule="auto"/>
+            </w:pPr>
+            <w:r>
+              <w:rPr>
+                <w:rFonts w:ascii="Calibri" w:hAnsi="Calibri"/>
+                <w:b/>
+                <w:i w:val="0"/>
+                <w:color w:val="FFFFFF"/>
+                <w:sz w:val="54"/>
+                <w:spacing w:val="10"/>
+              </w:rPr>
+              <w:t xml:space="preserve">BURAK </w:t>
+            </w:r>
+            <w:r>
+              <w:rPr>
+                <w:rFonts w:ascii="Calibri" w:hAnsi="Calibri"/>
+                <w:b/>
+                <w:i w:val="0"/>
+                <w:color w:val="8FB4D9"/>
+                <w:sz w:val="54"/>
+                <w:spacing w:val="10"/>
+              </w:rPr>
+              <w:t>ÜÇÖZ</w:t>
+            </w:r>
+          </w:p>
+          <w:p>
+            <w:pPr>
+              <w:spacing w:before="40" w:after="0" w:line="240" w:lineRule="auto"/>
+            </w:pPr>
+            <w:r>
+              <w:rPr>
+                <w:rFonts w:ascii="Calibri" w:hAnsi="Calibri"/>
+                <w:b w:val="0"/>
+                <w:i w:val="0"/>
+                <w:color w:val="E8ECF1"/>
+                <w:sz w:val="23"/>
+                <w:spacing w:val="14"/>
+                <w:caps w:val="true"/>
+              </w:rPr>
+              <w:t>Technischer Vertrieb im Aussendienst</w:t>
+            </w:r>
+          </w:p>
+          <w:p>
+            <w:pPr>
+              <w:spacing w:before="20" w:after="0" w:line="240" w:lineRule="auto"/>
+            </w:pPr>
+            <w:r>
+              <w:rPr>
+                <w:rFonts w:ascii="Calibri" w:hAnsi="Calibri"/>
+                <w:b w:val="0"/>
+                <w:i w:val="0"/>
+                <w:color w:val="9FB2C7"/>
+                <w:sz w:val="20"/>
+                <w:spacing w:val="10"/>
+              </w:rPr>
+              <w:t>Gebietsverkauf  ·  Neukundenakquise  ·  Key-Account</w:t>
+            </w:r>
+          </w:p>
+        </w:tc>
+      </w:tr>
+    </w:tbl>
     <w:p>
       <w:pPr>
-        <w:spacing w:before="0" w:after="0" w:line="240" w:lineRule="auto"/>
-      </w:pPr>
-      <w:r>
-        <w:rPr>
-          <w:rFonts w:ascii="Calibri" w:hAnsi="Calibri"/>
-          <w:b/>
-          <w:i w:val="0"/>
-          <w:color w:val="1A1A1A"/>
-          <w:sz w:val="48"/>
-        </w:rPr>
-        <w:t xml:space="preserve">Burak </w:t>
-      </w:r>
-      <w:r>
-        <w:rPr>
-          <w:rFonts w:ascii="Calibri" w:hAnsi="Calibri"/>
-          <w:b/>
-          <w:i w:val="0"/>
-          <w:color w:val="1F3A5F"/>
-          <w:sz w:val="48"/>
-        </w:rPr>
-        <w:t>Üçöz</w:t>
-      </w:r>
-    </w:p>
-    <w:p>
-      <w:pPr>
-        <w:spacing w:before="0" w:after="40" w:line="240" w:lineRule="auto"/>
-      </w:pPr>
-      <w:r>
-        <w:rPr>
-          <w:rFonts w:ascii="Calibri" w:hAnsi="Calibri"/>
-          <w:b w:val="0"/>
-          <w:i w:val="0"/>
-          <w:color w:val="6E6E6E"/>
-          <w:sz w:val="23"/>
-        </w:rPr>
-        <w:t>Technischer Vertrieb im Aussendienst · Gebietsverkauf · Neukundenakquise</w:t>
-      </w:r>
-    </w:p>
-    <w:p>
-      <w:pPr>
-        <w:pBdr>
-          <w:bottom w:val="single" w:sz="6" w:space="4" w:color="BFBFBF"/>
-        </w:pBdr>
+        <w:spacing w:before="0" w:after="80" w:line="120" w:lineRule="auto"/>
       </w:pPr>
     </w:p>
-    <w:p>
-      <w:pPr>
-        <w:spacing w:before="80" w:after="40" w:line="240" w:lineRule="auto"/>
-      </w:pPr>
-      <w:r>
-        <w:rPr>
-          <w:rFonts w:ascii="Calibri" w:hAnsi="Calibri"/>
-          <w:b/>
-          <w:i w:val="0"/>
-          <w:color w:val="1F3A5F"/>
-          <w:sz w:val="19"/>
-        </w:rPr>
-        <w:t xml:space="preserve">Adresse: </w:t>
-      </w:r>
-      <w:r>
-        <w:rPr>
-          <w:rFonts w:ascii="Calibri" w:hAnsi="Calibri"/>
-          <w:b w:val="0"/>
-          <w:i/>
-          <w:color w:val="6E6E6E"/>
-          <w:sz w:val="19"/>
-          <w:shd w:val="clear" w:color="auto" w:fill="EDE3C8"/>
-        </w:rPr>
-        <w:t>〈Strasse Nr., PLZ Ort〉</w:t>
-      </w:r>
-      <w:r>
-        <w:rPr>
-          <w:rFonts w:ascii="Calibri" w:hAnsi="Calibri"/>
-          <w:b w:val="0"/>
-          <w:i w:val="0"/>
-          <w:color w:val="1A1A1A"/>
-          <w:sz w:val="19"/>
-        </w:rPr>
-        <w:t xml:space="preserve">    </w:t>
-      </w:r>
-      <w:r>
-        <w:rPr>
-          <w:rFonts w:ascii="Calibri" w:hAnsi="Calibri"/>
-          <w:b/>
-          <w:i w:val="0"/>
-          <w:color w:val="1F3A5F"/>
-          <w:sz w:val="19"/>
-        </w:rPr>
-        <w:t xml:space="preserve">Tel: </w:t>
-      </w:r>
-      <w:r>
-        <w:rPr>
-          <w:rFonts w:ascii="Calibri" w:hAnsi="Calibri"/>
-          <w:b w:val="0"/>
-          <w:i/>
-          <w:color w:val="6E6E6E"/>
-          <w:sz w:val="19"/>
-          <w:shd w:val="clear" w:color="auto" w:fill="EDE3C8"/>
-        </w:rPr>
-        <w:t>〈+41 ...〉</w:t>
-      </w:r>
-      <w:r>
-        <w:rPr>
-          <w:rFonts w:ascii="Calibri" w:hAnsi="Calibri"/>
-          <w:b w:val="0"/>
-          <w:i w:val="0"/>
-          <w:color w:val="1A1A1A"/>
-          <w:sz w:val="19"/>
-        </w:rPr>
-        <w:t xml:space="preserve">    </w:t>
-      </w:r>
-    </w:p>
-    <w:p>
-      <w:pPr>
-        <w:spacing w:before="0" w:after="40" w:line="240" w:lineRule="auto"/>
-      </w:pPr>
-      <w:r>
-        <w:rPr>
-          <w:rFonts w:ascii="Calibri" w:hAnsi="Calibri"/>
-          <w:b/>
-          <w:i w:val="0"/>
-          <w:color w:val="1F3A5F"/>
-          <w:sz w:val="19"/>
-        </w:rPr>
-        <w:t xml:space="preserve">E-Mail: </w:t>
-      </w:r>
-      <w:r>
-        <w:rPr>
-          <w:rFonts w:ascii="Calibri" w:hAnsi="Calibri"/>
-          <w:b w:val="0"/>
-          <w:i/>
-          <w:color w:val="6E6E6E"/>
-          <w:sz w:val="19"/>
-          <w:shd w:val="clear" w:color="auto" w:fill="EDE3C8"/>
-        </w:rPr>
-        <w:t>〈b.s.uecoez@gmail.com〉</w:t>
-      </w:r>
-      <w:r>
-        <w:rPr>
-          <w:rFonts w:ascii="Calibri" w:hAnsi="Calibri"/>
-          <w:b w:val="0"/>
-          <w:i w:val="0"/>
-          <w:color w:val="1A1A1A"/>
-          <w:sz w:val="19"/>
-        </w:rPr>
-        <w:t xml:space="preserve">    </w:t>
-      </w:r>
-      <w:r>
-        <w:rPr>
-          <w:rFonts w:ascii="Calibri" w:hAnsi="Calibri"/>
-          <w:b/>
-          <w:i w:val="0"/>
-          <w:color w:val="1F3A5F"/>
-          <w:sz w:val="19"/>
-        </w:rPr>
-        <w:t xml:space="preserve">LinkedIn: </w:t>
-      </w:r>
-      <w:r>
-        <w:rPr>
-          <w:rFonts w:ascii="Calibri" w:hAnsi="Calibri"/>
-          <w:b w:val="0"/>
-          <w:i/>
-          <w:color w:val="6E6E6E"/>
-          <w:sz w:val="19"/>
-          <w:shd w:val="clear" w:color="auto" w:fill="EDE3C8"/>
-        </w:rPr>
-        <w:t>〈linkedin.com/in/...〉</w:t>
-      </w:r>
-      <w:r>
-        <w:rPr>
-          <w:rFonts w:ascii="Calibri" w:hAnsi="Calibri"/>
-          <w:b w:val="0"/>
-          <w:i w:val="0"/>
-          <w:color w:val="1A1A1A"/>
-          <w:sz w:val="19"/>
-        </w:rPr>
-        <w:t xml:space="preserve">    </w:t>
-      </w:r>
-    </w:p>
-    <w:p>
-      <w:pPr>
-        <w:spacing w:before="0" w:after="80" w:line="240" w:lineRule="auto"/>
-      </w:pPr>
-      <w:r>
-        <w:rPr>
-          <w:rFonts w:ascii="Calibri" w:hAnsi="Calibri"/>
-          <w:b/>
-          <w:i w:val="0"/>
-          <w:color w:val="1F3A5F"/>
-          <w:sz w:val="19"/>
-        </w:rPr>
-        <w:t xml:space="preserve">Geburtsdatum: </w:t>
-      </w:r>
-      <w:r>
-        <w:rPr>
-          <w:rFonts w:ascii="Calibri" w:hAnsi="Calibri"/>
-          <w:b w:val="0"/>
-          <w:i/>
-          <w:color w:val="6E6E6E"/>
-          <w:sz w:val="19"/>
-          <w:shd w:val="clear" w:color="auto" w:fill="EDE3C8"/>
-        </w:rPr>
-        <w:t>〈TT.MM.JJJJ〉</w:t>
-      </w:r>
-      <w:r>
-        <w:rPr>
-          <w:rFonts w:ascii="Calibri" w:hAnsi="Calibri"/>
-          <w:b w:val="0"/>
-          <w:i w:val="0"/>
-          <w:color w:val="1A1A1A"/>
-          <w:sz w:val="19"/>
-        </w:rPr>
-        <w:t xml:space="preserve">    </w:t>
-      </w:r>
-      <w:r>
-        <w:rPr>
-          <w:rFonts w:ascii="Calibri" w:hAnsi="Calibri"/>
-          <w:b/>
-          <w:i w:val="0"/>
-          <w:color w:val="1F3A5F"/>
-          <w:sz w:val="19"/>
-        </w:rPr>
-        <w:t xml:space="preserve">Nationalität: </w:t>
-      </w:r>
-      <w:r>
-        <w:rPr>
-          <w:rFonts w:ascii="Calibri" w:hAnsi="Calibri"/>
-          <w:b w:val="0"/>
-          <w:i/>
-          <w:color w:val="6E6E6E"/>
-          <w:sz w:val="19"/>
-          <w:shd w:val="clear" w:color="auto" w:fill="EDE3C8"/>
-        </w:rPr>
-        <w:t>〈...〉</w:t>
-      </w:r>
-      <w:r>
-        <w:rPr>
-          <w:rFonts w:ascii="Calibri" w:hAnsi="Calibri"/>
-          <w:b w:val="0"/>
-          <w:i w:val="0"/>
-          <w:color w:val="1A1A1A"/>
-          <w:sz w:val="19"/>
-        </w:rPr>
-        <w:t xml:space="preserve">    </w:t>
-      </w:r>
-      <w:r>
-        <w:rPr>
-          <w:rFonts w:ascii="Calibri" w:hAnsi="Calibri"/>
-          <w:b/>
-          <w:i w:val="0"/>
-          <w:color w:val="1F3A5F"/>
-          <w:sz w:val="19"/>
-        </w:rPr>
-        <w:t xml:space="preserve">Bürgerort/Bewilligung: </w:t>
-      </w:r>
-      <w:r>
-        <w:rPr>
-          <w:rFonts w:ascii="Calibri" w:hAnsi="Calibri"/>
-          <w:b w:val="0"/>
-          <w:i/>
-          <w:color w:val="6E6E6E"/>
-          <w:sz w:val="19"/>
-          <w:shd w:val="clear" w:color="auto" w:fill="EDE3C8"/>
-        </w:rPr>
-        <w:t>〈...〉</w:t>
-      </w:r>
-      <w:r>
-        <w:rPr>
-          <w:rFonts w:ascii="Calibri" w:hAnsi="Calibri"/>
-          <w:b w:val="0"/>
-          <w:i w:val="0"/>
-          <w:color w:val="1A1A1A"/>
-          <w:sz w:val="19"/>
-        </w:rPr>
-        <w:t xml:space="preserve">    </w:t>
-      </w:r>
-    </w:p>
-    <w:p>
-      <w:pPr>
-        <w:pBdr>
-          <w:bottom w:val="single" w:sz="6" w:space="4" w:color="BFBFBF"/>
-        </w:pBdr>
-      </w:pPr>
-    </w:p>
-    <w:p>
-      <w:pPr>
-        <w:spacing w:before="40" w:after="120" w:line="240" w:lineRule="auto"/>
-      </w:pPr>
-      <w:r>
-        <w:rPr>
-          <w:rFonts w:ascii="Calibri" w:hAnsi="Calibri"/>
-          <w:b w:val="0"/>
-          <w:i/>
-          <w:color w:val="6E6E6E"/>
-          <w:sz w:val="16"/>
-        </w:rPr>
-        <w:t>Hinweis: Alle Kontaktangaben müssen deckungsgleich mit LinkedIn sein – das wird vor dem Gespräch geprüft.</w:t>
-      </w:r>
-    </w:p>
-    <w:p>
-      <w:pPr>
-        <w:spacing w:before="200" w:after="80" w:line="240" w:lineRule="auto"/>
-        <w:pBdr>
-          <w:bottom w:val="single" w:sz="6" w:space="4" w:color="BFBFBF"/>
-        </w:pBdr>
-      </w:pPr>
-      <w:r>
-        <w:rPr>
-          <w:rFonts w:ascii="Calibri" w:hAnsi="Calibri"/>
-          <w:b/>
-          <w:i w:val="0"/>
-          <w:color w:val="1F3A5F"/>
-          <w:sz w:val="22"/>
-          <w:spacing w:val="20"/>
-        </w:rPr>
-        <w:t>KURZPROFIL</w:t>
-      </w:r>
-    </w:p>
-    <w:p>
-      <w:pPr>
-        <w:spacing w:before="0" w:after="120" w:line="276" w:lineRule="auto"/>
-      </w:pPr>
-      <w:r>
-        <w:rPr>
-          <w:rFonts w:ascii="Calibri" w:hAnsi="Calibri"/>
-          <w:b w:val="0"/>
-          <w:i w:val="0"/>
-          <w:color w:val="1A1A1A"/>
-          <w:sz w:val="21"/>
-        </w:rPr>
-        <w:t xml:space="preserve">Technischer Vertriebsprofi mit Schwerpunkt Aussendienst und Gebietsverkauf erklärungsbedürftiger Produkte. Eigenverantwortung für ein Gebietsbudget von rund </w:t>
-      </w:r>
-      <w:r>
-        <w:rPr>
-          <w:rFonts w:ascii="Calibri" w:hAnsi="Calibri"/>
-          <w:b/>
-          <w:i w:val="0"/>
-          <w:color w:val="1A1A1A"/>
-          <w:sz w:val="21"/>
-        </w:rPr>
-        <w:t>CHF 2,5 Mio.</w:t>
-      </w:r>
-      <w:r>
-        <w:rPr>
-          <w:rFonts w:ascii="Calibri" w:hAnsi="Calibri"/>
-          <w:b w:val="0"/>
-          <w:i w:val="0"/>
-          <w:color w:val="1A1A1A"/>
-          <w:sz w:val="21"/>
-        </w:rPr>
-        <w:t xml:space="preserve"> Stärken in Neukundenakquise, technischer Beratung und langfristiger Kundenbindung. Führungserfahrung vorhanden und als persönliche Reife eingebracht – der Fokus bleibt klar auf Gebiets- und Kundenverantwortung. Verlässlich, abschlussstark und auf nachhaltige Geschäftsbeziehungen ausgerichtet.</w:t>
-      </w:r>
-    </w:p>
-    <w:p>
-      <w:pPr>
-        <w:spacing w:before="200" w:after="80" w:line="240" w:lineRule="auto"/>
-        <w:pBdr>
-          <w:bottom w:val="single" w:sz="6" w:space="4" w:color="BFBFBF"/>
-        </w:pBdr>
-      </w:pPr>
-      <w:r>
-        <w:rPr>
-          <w:rFonts w:ascii="Calibri" w:hAnsi="Calibri"/>
-          <w:b/>
-          <w:i w:val="0"/>
-          <w:color w:val="1F3A5F"/>
-          <w:sz w:val="22"/>
-          <w:spacing w:val="20"/>
-        </w:rPr>
-        <w:t>BERUFSERFAHRUNG</w:t>
-      </w:r>
-    </w:p>
-    <w:p>
-      <w:pPr>
-        <w:tabs>
-          <w:tab w:pos="9638" w:val="right"/>
-        </w:tabs>
-        <w:spacing w:before="120" w:after="0" w:line="240" w:lineRule="auto"/>
-      </w:pPr>
-      <w:r>
-        <w:rPr>
-          <w:rFonts w:ascii="Calibri" w:hAnsi="Calibri"/>
-          <w:b/>
-          <w:i w:val="0"/>
-          <w:color w:val="1A1A1A"/>
-          <w:sz w:val="22"/>
-        </w:rPr>
-        <w:t>Gebietsverkaufsleiter / Area Sales Manager</w:t>
-      </w:r>
-      <w:r>
-        <w:rPr>
-          <w:rFonts w:ascii="Calibri" w:hAnsi="Calibri"/>
-          <w:b w:val="0"/>
-          <w:i w:val="0"/>
-          <w:color w:val="1A1A1A"/>
-          <w:sz w:val="20"/>
-        </w:rPr>
-        <w:tab/>
-      </w:r>
-      <w:r>
-        <w:rPr>
-          <w:rFonts w:ascii="Calibri" w:hAnsi="Calibri"/>
-          <w:b w:val="0"/>
-          <w:i/>
-          <w:color w:val="6E6E6E"/>
-          <w:sz w:val="20"/>
-          <w:shd w:val="clear" w:color="auto" w:fill="EDE3C8"/>
-        </w:rPr>
-        <w:t>〈MM.JJJJ – heute〉</w:t>
-      </w:r>
-    </w:p>
-    <w:p>
-      <w:pPr>
-        <w:spacing w:before="0" w:after="40" w:line="240" w:lineRule="auto"/>
-      </w:pPr>
-      <w:r>
-        <w:rPr>
-          <w:rFonts w:ascii="Calibri" w:hAnsi="Calibri"/>
-          <w:b/>
-          <w:i w:val="0"/>
-          <w:color w:val="1F3A5F"/>
-          <w:sz w:val="21"/>
-        </w:rPr>
-        <w:t>Cortexia SA</w:t>
-      </w:r>
-      <w:r>
-        <w:rPr>
-          <w:rFonts w:ascii="Calibri" w:hAnsi="Calibri"/>
-          <w:b w:val="0"/>
-          <w:i w:val="0"/>
-          <w:color w:val="6E6E6E"/>
-          <w:sz w:val="21"/>
-        </w:rPr>
-        <w:t xml:space="preserve">  ·  </w:t>
-      </w:r>
-      <w:r>
-        <w:rPr>
-          <w:rFonts w:ascii="Calibri" w:hAnsi="Calibri"/>
-          <w:b w:val="0"/>
-          <w:i/>
-          <w:color w:val="6E6E6E"/>
-          <w:sz w:val="20"/>
-          <w:shd w:val="clear" w:color="auto" w:fill="EDE3C8"/>
-        </w:rPr>
-        <w:t>〈Region / Ort〉</w:t>
-      </w:r>
-      <w:r>
-        <w:rPr>
-          <w:rFonts w:ascii="Calibri" w:hAnsi="Calibri"/>
-          <w:b w:val="0"/>
-          <w:i w:val="0"/>
-          <w:color w:val="1A1A1A"/>
-          <w:sz w:val="18"/>
-        </w:rPr>
-        <w:t xml:space="preserve">   </w:t>
-      </w:r>
-      <w:r>
-        <w:rPr>
-          <w:rFonts w:ascii="Calibri" w:hAnsi="Calibri"/>
-          <w:b/>
-          <w:i w:val="0"/>
-          <w:color w:val="1F3A5F"/>
-          <w:sz w:val="17"/>
-        </w:rPr>
-        <w:t>◆ Ankerstation</w:t>
-      </w:r>
-    </w:p>
-    <w:p>
-      <w:pPr>
-        <w:spacing w:before="0" w:after="20" w:line="264" w:lineRule="auto"/>
-        <w:ind w:left="283" w:hanging="283"/>
-      </w:pPr>
-      <w:r>
-        <w:rPr>
-          <w:rFonts w:ascii="Calibri" w:hAnsi="Calibri"/>
-          <w:b w:val="0"/>
-          <w:i w:val="0"/>
-          <w:color w:val="1A1A1A"/>
-          <w:sz w:val="20"/>
-        </w:rPr>
-        <w:t xml:space="preserve">–  </w:t>
-      </w:r>
-      <w:r>
-        <w:rPr>
-          <w:rFonts w:ascii="Calibri" w:hAnsi="Calibri"/>
-          <w:b w:val="0"/>
-          <w:i w:val="0"/>
-          <w:color w:val="1A1A1A"/>
-          <w:sz w:val="20"/>
-        </w:rPr>
-        <w:t xml:space="preserve">Eigenverantwortliche Betreuung und Entwicklung des Verkaufsgebiets mit einem </w:t>
-      </w:r>
-      <w:r>
-        <w:rPr>
-          <w:rFonts w:ascii="Calibri" w:hAnsi="Calibri"/>
-          <w:b w:val="0"/>
-          <w:i w:val="0"/>
-          <w:color w:val="1A1A1A"/>
-          <w:sz w:val="20"/>
-        </w:rPr>
-        <w:t>Budgetvolumen von rund CHF 2,5 Mio.</w:t>
-      </w:r>
-    </w:p>
-    <w:p>
-      <w:pPr>
-        <w:spacing w:before="0" w:after="20" w:line="264" w:lineRule="auto"/>
-        <w:ind w:left="283" w:hanging="283"/>
-      </w:pPr>
-      <w:r>
-        <w:rPr>
-          <w:rFonts w:ascii="Calibri" w:hAnsi="Calibri"/>
-          <w:b w:val="0"/>
-          <w:i w:val="0"/>
-          <w:color w:val="1A1A1A"/>
-          <w:sz w:val="20"/>
-        </w:rPr>
-        <w:t xml:space="preserve">–  </w:t>
-      </w:r>
-      <w:r>
-        <w:rPr>
-          <w:rFonts w:ascii="Calibri" w:hAnsi="Calibri"/>
-          <w:b w:val="0"/>
-          <w:i w:val="0"/>
-          <w:color w:val="1A1A1A"/>
-          <w:sz w:val="20"/>
-        </w:rPr>
-        <w:t xml:space="preserve">Neukundenakquise und Ausbau bestehender Kundenbeziehungen; gewonnen: </w:t>
-      </w:r>
-      <w:r>
-        <w:rPr>
-          <w:rFonts w:ascii="Calibri" w:hAnsi="Calibri"/>
-          <w:b w:val="0"/>
-          <w:i/>
-          <w:color w:val="6E6E6E"/>
-          <w:sz w:val="20"/>
-          <w:shd w:val="clear" w:color="auto" w:fill="EDE3C8"/>
-        </w:rPr>
-        <w:t>〈Anzahl Neukunden / Volumen einsetzen〉</w:t>
-      </w:r>
-    </w:p>
-    <w:p>
-      <w:pPr>
-        <w:spacing w:before="0" w:after="20" w:line="264" w:lineRule="auto"/>
-        <w:ind w:left="283" w:hanging="283"/>
-      </w:pPr>
-      <w:r>
-        <w:rPr>
-          <w:rFonts w:ascii="Calibri" w:hAnsi="Calibri"/>
-          <w:b w:val="0"/>
-          <w:i w:val="0"/>
-          <w:color w:val="1A1A1A"/>
-          <w:sz w:val="20"/>
-        </w:rPr>
-        <w:t xml:space="preserve">–  </w:t>
-      </w:r>
-      <w:r>
-        <w:rPr>
-          <w:rFonts w:ascii="Calibri" w:hAnsi="Calibri"/>
-          <w:b w:val="0"/>
-          <w:i w:val="0"/>
-          <w:color w:val="1A1A1A"/>
-          <w:sz w:val="20"/>
-        </w:rPr>
-        <w:t>Technische Beratung erklärungsbedürftiger Produkte von der Erstansprache bis zum Abschluss.</w:t>
-      </w:r>
-    </w:p>
-    <w:p>
-      <w:pPr>
-        <w:spacing w:before="0" w:after="20" w:line="264" w:lineRule="auto"/>
-        <w:ind w:left="283" w:hanging="283"/>
-      </w:pPr>
-      <w:r>
-        <w:rPr>
-          <w:rFonts w:ascii="Calibri" w:hAnsi="Calibri"/>
-          <w:b w:val="0"/>
-          <w:i w:val="0"/>
-          <w:color w:val="1A1A1A"/>
-          <w:sz w:val="20"/>
-        </w:rPr>
-        <w:t xml:space="preserve">–  </w:t>
-      </w:r>
-      <w:r>
-        <w:rPr>
-          <w:rFonts w:ascii="Calibri" w:hAnsi="Calibri"/>
-          <w:b w:val="0"/>
-          <w:i/>
-          <w:color w:val="6E6E6E"/>
-          <w:sz w:val="20"/>
-          <w:shd w:val="clear" w:color="auto" w:fill="EDE3C8"/>
-        </w:rPr>
-        <w:t>〈Konkretes Ergebnis / Projekt aus der Cortexia-Zeit ergänzen〉</w:t>
-      </w:r>
-    </w:p>
-    <w:p>
-      <w:pPr>
-        <w:tabs>
-          <w:tab w:pos="9638" w:val="right"/>
-        </w:tabs>
-        <w:spacing w:before="120" w:after="0" w:line="240" w:lineRule="auto"/>
-      </w:pPr>
-      <w:r>
-        <w:rPr>
-          <w:rFonts w:ascii="Calibri" w:hAnsi="Calibri"/>
-          <w:b/>
-          <w:i w:val="0"/>
-          <w:color w:val="1A1A1A"/>
-          <w:sz w:val="22"/>
-        </w:rPr>
-        <w:t>Aussendienst / Technischer Verkauf</w:t>
-      </w:r>
-      <w:r>
-        <w:rPr>
-          <w:rFonts w:ascii="Calibri" w:hAnsi="Calibri"/>
-          <w:b w:val="0"/>
-          <w:i w:val="0"/>
-          <w:color w:val="1A1A1A"/>
-          <w:sz w:val="20"/>
-        </w:rPr>
-        <w:tab/>
-      </w:r>
-      <w:r>
-        <w:rPr>
-          <w:rFonts w:ascii="Calibri" w:hAnsi="Calibri"/>
-          <w:b w:val="0"/>
-          <w:i/>
-          <w:color w:val="6E6E6E"/>
-          <w:sz w:val="20"/>
-          <w:shd w:val="clear" w:color="auto" w:fill="EDE3C8"/>
-        </w:rPr>
-        <w:t>〈MM.JJJJ – MM.JJJJ〉</w:t>
-      </w:r>
-    </w:p>
-    <w:p>
-      <w:pPr>
-        <w:spacing w:before="0" w:after="40" w:line="240" w:lineRule="auto"/>
-      </w:pPr>
-      <w:r>
-        <w:rPr>
-          <w:rFonts w:ascii="Calibri" w:hAnsi="Calibri"/>
-          <w:b/>
-          <w:i w:val="0"/>
-          <w:color w:val="1F3A5F"/>
-          <w:sz w:val="21"/>
-        </w:rPr>
-        <w:t>Camille Bauer Metrawatt AG</w:t>
-      </w:r>
-      <w:r>
-        <w:rPr>
-          <w:rFonts w:ascii="Calibri" w:hAnsi="Calibri"/>
-          <w:b w:val="0"/>
-          <w:i w:val="0"/>
-          <w:color w:val="6E6E6E"/>
-          <w:sz w:val="21"/>
-        </w:rPr>
-        <w:t xml:space="preserve">  ·  </w:t>
-      </w:r>
-      <w:r>
-        <w:rPr>
-          <w:rFonts w:ascii="Calibri" w:hAnsi="Calibri"/>
-          <w:b w:val="0"/>
-          <w:i/>
-          <w:color w:val="6E6E6E"/>
-          <w:sz w:val="20"/>
-          <w:shd w:val="clear" w:color="auto" w:fill="EDE3C8"/>
-        </w:rPr>
-        <w:t>〈Region / Ort〉</w:t>
-      </w:r>
-    </w:p>
-    <w:p>
-      <w:pPr>
-        <w:spacing w:before="0" w:after="20" w:line="264" w:lineRule="auto"/>
-        <w:ind w:left="283" w:hanging="283"/>
-      </w:pPr>
-      <w:r>
-        <w:rPr>
-          <w:rFonts w:ascii="Calibri" w:hAnsi="Calibri"/>
-          <w:b w:val="0"/>
-          <w:i w:val="0"/>
-          <w:color w:val="1A1A1A"/>
-          <w:sz w:val="20"/>
-        </w:rPr>
-        <w:t xml:space="preserve">–  </w:t>
-      </w:r>
-      <w:r>
-        <w:rPr>
-          <w:rFonts w:ascii="Calibri" w:hAnsi="Calibri"/>
-          <w:b w:val="0"/>
-          <w:i w:val="0"/>
-          <w:color w:val="1A1A1A"/>
-          <w:sz w:val="20"/>
-        </w:rPr>
-        <w:t>Betreuung eines definierten Verkaufsgebiets im technischen B2B-Umfeld.</w:t>
-      </w:r>
-    </w:p>
-    <w:p>
-      <w:pPr>
-        <w:spacing w:before="0" w:after="20" w:line="264" w:lineRule="auto"/>
-        <w:ind w:left="283" w:hanging="283"/>
-      </w:pPr>
-      <w:r>
-        <w:rPr>
-          <w:rFonts w:ascii="Calibri" w:hAnsi="Calibri"/>
-          <w:b w:val="0"/>
-          <w:i w:val="0"/>
-          <w:color w:val="1A1A1A"/>
-          <w:sz w:val="20"/>
-        </w:rPr>
-        <w:t xml:space="preserve">–  </w:t>
-      </w:r>
-      <w:r>
-        <w:rPr>
-          <w:rFonts w:ascii="Calibri" w:hAnsi="Calibri"/>
-          <w:b w:val="0"/>
-          <w:i w:val="0"/>
-          <w:color w:val="1A1A1A"/>
-          <w:sz w:val="20"/>
-        </w:rPr>
-        <w:t xml:space="preserve">Neukundengewinnung: </w:t>
-      </w:r>
-      <w:r>
-        <w:rPr>
-          <w:rFonts w:ascii="Calibri" w:hAnsi="Calibri"/>
-          <w:b w:val="0"/>
-          <w:i/>
-          <w:color w:val="6E6E6E"/>
-          <w:sz w:val="20"/>
-          <w:shd w:val="clear" w:color="auto" w:fill="EDE3C8"/>
-        </w:rPr>
-        <w:t>〈echte Neukundenzahl einsetzen〉</w:t>
-      </w:r>
-      <w:r>
-        <w:rPr>
-          <w:rFonts w:ascii="Calibri" w:hAnsi="Calibri"/>
-          <w:b w:val="0"/>
-          <w:i w:val="0"/>
-          <w:color w:val="1A1A1A"/>
-          <w:sz w:val="20"/>
-        </w:rPr>
-        <w:t xml:space="preserve"> – belastbare Zahl statt Prozentangabe.</w:t>
-      </w:r>
-    </w:p>
-    <w:p>
-      <w:pPr>
-        <w:spacing w:before="0" w:after="20" w:line="264" w:lineRule="auto"/>
-        <w:ind w:left="283" w:hanging="283"/>
-      </w:pPr>
-      <w:r>
-        <w:rPr>
-          <w:rFonts w:ascii="Calibri" w:hAnsi="Calibri"/>
-          <w:b w:val="0"/>
-          <w:i w:val="0"/>
-          <w:color w:val="1A1A1A"/>
-          <w:sz w:val="20"/>
-        </w:rPr>
-        <w:t xml:space="preserve">–  </w:t>
-      </w:r>
-      <w:r>
-        <w:rPr>
-          <w:rFonts w:ascii="Calibri" w:hAnsi="Calibri"/>
-          <w:b w:val="0"/>
-          <w:i/>
-          <w:color w:val="6E6E6E"/>
-          <w:sz w:val="20"/>
-          <w:shd w:val="clear" w:color="auto" w:fill="EDE3C8"/>
-        </w:rPr>
-        <w:t>〈Umsatzentwicklung / Marktsituation ergänzen (z. B. Umsatz im rückläufigen Markt gehalten und ausgebaut)〉</w:t>
-      </w:r>
-    </w:p>
-    <w:p>
-      <w:pPr>
-        <w:tabs>
-          <w:tab w:pos="9638" w:val="right"/>
-        </w:tabs>
-        <w:spacing w:before="120" w:after="0" w:line="240" w:lineRule="auto"/>
-      </w:pPr>
-      <w:r>
-        <w:rPr>
-          <w:rFonts w:ascii="Calibri" w:hAnsi="Calibri"/>
-          <w:b/>
-          <w:i w:val="0"/>
-          <w:color w:val="1A1A1A"/>
-          <w:sz w:val="22"/>
-        </w:rPr>
-        <w:t>Funktion / Titel</w:t>
-      </w:r>
-      <w:r>
-        <w:rPr>
-          <w:rFonts w:ascii="Calibri" w:hAnsi="Calibri"/>
-          <w:b w:val="0"/>
-          <w:i w:val="0"/>
-          <w:color w:val="1A1A1A"/>
-          <w:sz w:val="20"/>
-        </w:rPr>
-        <w:tab/>
-      </w:r>
-      <w:r>
-        <w:rPr>
-          <w:rFonts w:ascii="Calibri" w:hAnsi="Calibri"/>
-          <w:b w:val="0"/>
-          <w:i/>
-          <w:color w:val="6E6E6E"/>
-          <w:sz w:val="20"/>
-          <w:shd w:val="clear" w:color="auto" w:fill="EDE3C8"/>
-        </w:rPr>
-        <w:t>〈MM.JJJJ – MM.JJJJ〉</w:t>
-      </w:r>
-    </w:p>
-    <w:p>
-      <w:pPr>
-        <w:spacing w:before="0" w:after="40" w:line="240" w:lineRule="auto"/>
-      </w:pPr>
-      <w:r>
-        <w:rPr>
-          <w:rFonts w:ascii="Calibri" w:hAnsi="Calibri"/>
-          <w:b/>
-          <w:i w:val="0"/>
-          <w:color w:val="1F3A5F"/>
-          <w:sz w:val="21"/>
-        </w:rPr>
-        <w:t>MRK</w:t>
-      </w:r>
-      <w:r>
-        <w:rPr>
-          <w:rFonts w:ascii="Calibri" w:hAnsi="Calibri"/>
-          <w:b w:val="0"/>
-          <w:i w:val="0"/>
-          <w:color w:val="6E6E6E"/>
-          <w:sz w:val="21"/>
-        </w:rPr>
-        <w:t xml:space="preserve">  ·  </w:t>
-      </w:r>
-      <w:r>
-        <w:rPr>
-          <w:rFonts w:ascii="Calibri" w:hAnsi="Calibri"/>
-          <w:b w:val="0"/>
-          <w:i/>
-          <w:color w:val="6E6E6E"/>
-          <w:sz w:val="20"/>
-          <w:shd w:val="clear" w:color="auto" w:fill="EDE3C8"/>
-        </w:rPr>
-        <w:t>〈Ort〉</w:t>
-      </w:r>
-    </w:p>
-    <w:p>
-      <w:pPr>
-        <w:spacing w:before="0" w:after="20" w:line="264" w:lineRule="auto"/>
-        <w:ind w:left="283" w:hanging="283"/>
-      </w:pPr>
-      <w:r>
-        <w:rPr>
-          <w:rFonts w:ascii="Calibri" w:hAnsi="Calibri"/>
-          <w:b w:val="0"/>
-          <w:i w:val="0"/>
-          <w:color w:val="1A1A1A"/>
-          <w:sz w:val="20"/>
-        </w:rPr>
-        <w:t xml:space="preserve">–  </w:t>
-      </w:r>
-      <w:r>
-        <w:rPr>
-          <w:rFonts w:ascii="Calibri" w:hAnsi="Calibri"/>
-          <w:b w:val="0"/>
-          <w:i/>
-          <w:color w:val="6E6E6E"/>
-          <w:sz w:val="20"/>
-          <w:shd w:val="clear" w:color="auto" w:fill="EDE3C8"/>
-        </w:rPr>
-        <w:t>〈Kernaufgabe und ein messbares Ergebnis ergänzen〉</w:t>
-      </w:r>
-    </w:p>
-    <w:p>
-      <w:pPr>
-        <w:tabs>
-          <w:tab w:pos="9638" w:val="right"/>
-        </w:tabs>
-        <w:spacing w:before="120" w:after="0" w:line="240" w:lineRule="auto"/>
-      </w:pPr>
-      <w:r>
-        <w:rPr>
-          <w:rFonts w:ascii="Calibri" w:hAnsi="Calibri"/>
-          <w:b/>
-          <w:i w:val="0"/>
-          <w:color w:val="1A1A1A"/>
-          <w:sz w:val="22"/>
-        </w:rPr>
-        <w:t>Funktion / Titel</w:t>
-      </w:r>
-      <w:r>
-        <w:rPr>
-          <w:rFonts w:ascii="Calibri" w:hAnsi="Calibri"/>
-          <w:b w:val="0"/>
-          <w:i w:val="0"/>
-          <w:color w:val="1A1A1A"/>
-          <w:sz w:val="20"/>
-        </w:rPr>
-        <w:tab/>
-      </w:r>
-      <w:r>
-        <w:rPr>
-          <w:rFonts w:ascii="Calibri" w:hAnsi="Calibri"/>
-          <w:b w:val="0"/>
-          <w:i/>
-          <w:color w:val="6E6E6E"/>
-          <w:sz w:val="20"/>
-          <w:shd w:val="clear" w:color="auto" w:fill="EDE3C8"/>
-        </w:rPr>
-        <w:t>〈MM.JJJJ – MM.JJJJ〉</w:t>
-      </w:r>
-    </w:p>
-    <w:p>
-      <w:pPr>
-        <w:spacing w:before="0" w:after="40" w:line="240" w:lineRule="auto"/>
-      </w:pPr>
-      <w:r>
-        <w:rPr>
-          <w:rFonts w:ascii="Calibri" w:hAnsi="Calibri"/>
-          <w:b/>
-          <w:i w:val="0"/>
-          <w:color w:val="1F3A5F"/>
-          <w:sz w:val="21"/>
-        </w:rPr>
-        <w:t>Manz</w:t>
-      </w:r>
-      <w:r>
-        <w:rPr>
-          <w:rFonts w:ascii="Calibri" w:hAnsi="Calibri"/>
-          <w:b w:val="0"/>
-          <w:i w:val="0"/>
-          <w:color w:val="6E6E6E"/>
-          <w:sz w:val="21"/>
-        </w:rPr>
-        <w:t xml:space="preserve">  ·  </w:t>
-      </w:r>
-      <w:r>
-        <w:rPr>
-          <w:rFonts w:ascii="Calibri" w:hAnsi="Calibri"/>
-          <w:b w:val="0"/>
-          <w:i/>
-          <w:color w:val="6E6E6E"/>
-          <w:sz w:val="20"/>
-          <w:shd w:val="clear" w:color="auto" w:fill="EDE3C8"/>
-        </w:rPr>
-        <w:t>〈Ort〉</w:t>
-      </w:r>
-    </w:p>
-    <w:p>
-      <w:pPr>
-        <w:spacing w:before="0" w:after="20" w:line="264" w:lineRule="auto"/>
-        <w:ind w:left="283" w:hanging="283"/>
-      </w:pPr>
-      <w:r>
-        <w:rPr>
-          <w:rFonts w:ascii="Calibri" w:hAnsi="Calibri"/>
-          <w:b w:val="0"/>
-          <w:i w:val="0"/>
-          <w:color w:val="1A1A1A"/>
-          <w:sz w:val="20"/>
-        </w:rPr>
-        <w:t xml:space="preserve">–  </w:t>
-      </w:r>
-      <w:r>
-        <w:rPr>
-          <w:rFonts w:ascii="Calibri" w:hAnsi="Calibri"/>
-          <w:b w:val="0"/>
-          <w:i/>
-          <w:color w:val="6E6E6E"/>
-          <w:sz w:val="20"/>
-          <w:shd w:val="clear" w:color="auto" w:fill="EDE3C8"/>
-        </w:rPr>
-        <w:t>〈Kernaufgabe und ein messbares Ergebnis ergänzen〉</w:t>
-      </w:r>
-    </w:p>
-    <w:p>
-      <w:pPr>
-        <w:tabs>
-          <w:tab w:pos="9638" w:val="right"/>
-        </w:tabs>
-        <w:spacing w:before="120" w:after="0" w:line="240" w:lineRule="auto"/>
-      </w:pPr>
-      <w:r>
-        <w:rPr>
-          <w:rFonts w:ascii="Calibri" w:hAnsi="Calibri"/>
-          <w:b/>
-          <w:i w:val="0"/>
-          <w:color w:val="1A1A1A"/>
-          <w:sz w:val="22"/>
-        </w:rPr>
-        <w:t>Funktion / Titel</w:t>
-      </w:r>
-      <w:r>
-        <w:rPr>
-          <w:rFonts w:ascii="Calibri" w:hAnsi="Calibri"/>
-          <w:b w:val="0"/>
-          <w:i w:val="0"/>
-          <w:color w:val="1A1A1A"/>
-          <w:sz w:val="20"/>
-        </w:rPr>
-        <w:tab/>
-      </w:r>
-      <w:r>
-        <w:rPr>
-          <w:rFonts w:ascii="Calibri" w:hAnsi="Calibri"/>
-          <w:b w:val="0"/>
-          <w:i/>
-          <w:color w:val="6E6E6E"/>
-          <w:sz w:val="20"/>
-          <w:shd w:val="clear" w:color="auto" w:fill="EDE3C8"/>
-        </w:rPr>
-        <w:t>〈MM.JJJJ – MM.JJJJ〉</w:t>
-      </w:r>
-    </w:p>
-    <w:p>
-      <w:pPr>
-        <w:spacing w:before="0" w:after="40" w:line="240" w:lineRule="auto"/>
-      </w:pPr>
-      <w:r>
-        <w:rPr>
-          <w:rFonts w:ascii="Calibri" w:hAnsi="Calibri"/>
-          <w:b/>
-          <w:i w:val="0"/>
-          <w:color w:val="1F3A5F"/>
-          <w:sz w:val="21"/>
-        </w:rPr>
-        <w:t>Anadolu</w:t>
-      </w:r>
-      <w:r>
-        <w:rPr>
-          <w:rFonts w:ascii="Calibri" w:hAnsi="Calibri"/>
-          <w:b w:val="0"/>
-          <w:i w:val="0"/>
-          <w:color w:val="6E6E6E"/>
-          <w:sz w:val="21"/>
-        </w:rPr>
-        <w:t xml:space="preserve">  ·  </w:t>
-      </w:r>
-      <w:r>
-        <w:rPr>
-          <w:rFonts w:ascii="Calibri" w:hAnsi="Calibri"/>
-          <w:b w:val="0"/>
-          <w:i/>
-          <w:color w:val="6E6E6E"/>
-          <w:sz w:val="20"/>
-          <w:shd w:val="clear" w:color="auto" w:fill="EDE3C8"/>
-        </w:rPr>
-        <w:t>〈Ort〉</w:t>
-      </w:r>
-    </w:p>
-    <w:p>
-      <w:pPr>
-        <w:spacing w:before="0" w:after="20" w:line="264" w:lineRule="auto"/>
-        <w:ind w:left="283" w:hanging="283"/>
-      </w:pPr>
-      <w:r>
-        <w:rPr>
-          <w:rFonts w:ascii="Calibri" w:hAnsi="Calibri"/>
-          <w:b w:val="0"/>
-          <w:i w:val="0"/>
-          <w:color w:val="1A1A1A"/>
-          <w:sz w:val="20"/>
-        </w:rPr>
-        <w:t xml:space="preserve">–  </w:t>
-      </w:r>
-      <w:r>
-        <w:rPr>
-          <w:rFonts w:ascii="Calibri" w:hAnsi="Calibri"/>
-          <w:b w:val="0"/>
-          <w:i/>
-          <w:color w:val="6E6E6E"/>
-          <w:sz w:val="20"/>
-          <w:shd w:val="clear" w:color="auto" w:fill="EDE3C8"/>
-        </w:rPr>
-        <w:t>〈Kernaufgabe und ein messbares Ergebnis ergänzen〉</w:t>
-      </w:r>
-    </w:p>
-    <w:p>
-      <w:pPr>
-        <w:tabs>
-          <w:tab w:pos="9638" w:val="right"/>
-        </w:tabs>
-        <w:spacing w:before="120" w:after="0" w:line="240" w:lineRule="auto"/>
-      </w:pPr>
-      <w:r>
-        <w:rPr>
-          <w:rFonts w:ascii="Calibri" w:hAnsi="Calibri"/>
-          <w:b/>
-          <w:i w:val="0"/>
-          <w:color w:val="1A1A1A"/>
-          <w:sz w:val="22"/>
-        </w:rPr>
-        <w:t>Funktion / Titel</w:t>
-      </w:r>
-      <w:r>
-        <w:rPr>
-          <w:rFonts w:ascii="Calibri" w:hAnsi="Calibri"/>
-          <w:b w:val="0"/>
-          <w:i w:val="0"/>
-          <w:color w:val="1A1A1A"/>
-          <w:sz w:val="20"/>
-        </w:rPr>
-        <w:tab/>
-      </w:r>
-      <w:r>
-        <w:rPr>
-          <w:rFonts w:ascii="Calibri" w:hAnsi="Calibri"/>
-          <w:b w:val="0"/>
-          <w:i/>
-          <w:color w:val="6E6E6E"/>
-          <w:sz w:val="20"/>
-          <w:shd w:val="clear" w:color="auto" w:fill="EDE3C8"/>
-        </w:rPr>
-        <w:t>〈MM.JJJJ – MM.JJJJ〉</w:t>
-      </w:r>
-    </w:p>
-    <w:p>
-      <w:pPr>
-        <w:spacing w:before="0" w:after="40" w:line="240" w:lineRule="auto"/>
-      </w:pPr>
-      <w:r>
-        <w:rPr>
-          <w:rFonts w:ascii="Calibri" w:hAnsi="Calibri"/>
-          <w:b/>
-          <w:i w:val="0"/>
-          <w:color w:val="1F3A5F"/>
-          <w:sz w:val="21"/>
-        </w:rPr>
-        <w:t>Pflitsch</w:t>
-      </w:r>
-      <w:r>
-        <w:rPr>
-          <w:rFonts w:ascii="Calibri" w:hAnsi="Calibri"/>
-          <w:b w:val="0"/>
-          <w:i w:val="0"/>
-          <w:color w:val="6E6E6E"/>
-          <w:sz w:val="21"/>
-        </w:rPr>
-        <w:t xml:space="preserve">  ·  </w:t>
-      </w:r>
-      <w:r>
-        <w:rPr>
-          <w:rFonts w:ascii="Calibri" w:hAnsi="Calibri"/>
-          <w:b w:val="0"/>
-          <w:i/>
-          <w:color w:val="6E6E6E"/>
-          <w:sz w:val="20"/>
-          <w:shd w:val="clear" w:color="auto" w:fill="EDE3C8"/>
-        </w:rPr>
-        <w:t>〈Ort〉</w:t>
-      </w:r>
-    </w:p>
-    <w:p>
-      <w:pPr>
-        <w:spacing w:before="0" w:after="20" w:line="264" w:lineRule="auto"/>
-        <w:ind w:left="283" w:hanging="283"/>
-      </w:pPr>
-      <w:r>
-        <w:rPr>
-          <w:rFonts w:ascii="Calibri" w:hAnsi="Calibri"/>
-          <w:b w:val="0"/>
-          <w:i w:val="0"/>
-          <w:color w:val="1A1A1A"/>
-          <w:sz w:val="20"/>
-        </w:rPr>
-        <w:t xml:space="preserve">–  </w:t>
-      </w:r>
-      <w:r>
-        <w:rPr>
-          <w:rFonts w:ascii="Calibri" w:hAnsi="Calibri"/>
-          <w:b w:val="0"/>
-          <w:i/>
-          <w:color w:val="6E6E6E"/>
-          <w:sz w:val="20"/>
-          <w:shd w:val="clear" w:color="auto" w:fill="EDE3C8"/>
-        </w:rPr>
-        <w:t>〈Kernaufgabe und ein messbares Ergebnis ergänzen〉</w:t>
-      </w:r>
-    </w:p>
-    <w:p>
-      <w:pPr>
-        <w:tabs>
-          <w:tab w:pos="9638" w:val="right"/>
-        </w:tabs>
-        <w:spacing w:before="120" w:after="0" w:line="240" w:lineRule="auto"/>
-      </w:pPr>
-      <w:r>
-        <w:rPr>
-          <w:rFonts w:ascii="Calibri" w:hAnsi="Calibri"/>
-          <w:b/>
-          <w:i w:val="0"/>
-          <w:color w:val="1A1A1A"/>
-          <w:sz w:val="22"/>
-        </w:rPr>
-        <w:t>Funktion / Titel</w:t>
-      </w:r>
-      <w:r>
-        <w:rPr>
-          <w:rFonts w:ascii="Calibri" w:hAnsi="Calibri"/>
-          <w:b w:val="0"/>
-          <w:i w:val="0"/>
-          <w:color w:val="1A1A1A"/>
-          <w:sz w:val="20"/>
-        </w:rPr>
-        <w:tab/>
-      </w:r>
-      <w:r>
-        <w:rPr>
-          <w:rFonts w:ascii="Calibri" w:hAnsi="Calibri"/>
-          <w:b w:val="0"/>
-          <w:i/>
-          <w:color w:val="6E6E6E"/>
-          <w:sz w:val="20"/>
-          <w:shd w:val="clear" w:color="auto" w:fill="EDE3C8"/>
-        </w:rPr>
-        <w:t>〈MM.JJJJ – MM.JJJJ〉</w:t>
-      </w:r>
-    </w:p>
-    <w:p>
-      <w:pPr>
-        <w:spacing w:before="0" w:after="40" w:line="240" w:lineRule="auto"/>
-      </w:pPr>
-      <w:r>
-        <w:rPr>
-          <w:rFonts w:ascii="Calibri" w:hAnsi="Calibri"/>
-          <w:b/>
-          <w:i w:val="0"/>
-          <w:color w:val="1F3A5F"/>
-          <w:sz w:val="21"/>
-        </w:rPr>
-        <w:t>Kabuu</w:t>
-      </w:r>
-      <w:r>
-        <w:rPr>
-          <w:rFonts w:ascii="Calibri" w:hAnsi="Calibri"/>
-          <w:b w:val="0"/>
-          <w:i w:val="0"/>
-          <w:color w:val="6E6E6E"/>
-          <w:sz w:val="21"/>
-        </w:rPr>
-        <w:t xml:space="preserve">  ·  </w:t>
-      </w:r>
-      <w:r>
-        <w:rPr>
-          <w:rFonts w:ascii="Calibri" w:hAnsi="Calibri"/>
-          <w:b w:val="0"/>
-          <w:i/>
-          <w:color w:val="6E6E6E"/>
-          <w:sz w:val="20"/>
-          <w:shd w:val="clear" w:color="auto" w:fill="EDE3C8"/>
-        </w:rPr>
-        <w:t>〈Ort〉</w:t>
-      </w:r>
-    </w:p>
-    <w:p>
-      <w:pPr>
-        <w:spacing w:before="0" w:after="20" w:line="264" w:lineRule="auto"/>
-        <w:ind w:left="283" w:hanging="283"/>
-      </w:pPr>
-      <w:r>
-        <w:rPr>
-          <w:rFonts w:ascii="Calibri" w:hAnsi="Calibri"/>
-          <w:b w:val="0"/>
-          <w:i w:val="0"/>
-          <w:color w:val="1A1A1A"/>
-          <w:sz w:val="20"/>
-        </w:rPr>
-        <w:t xml:space="preserve">–  </w:t>
-      </w:r>
-      <w:r>
-        <w:rPr>
-          <w:rFonts w:ascii="Calibri" w:hAnsi="Calibri"/>
-          <w:b w:val="0"/>
-          <w:i w:val="0"/>
-          <w:color w:val="1A1A1A"/>
-          <w:sz w:val="20"/>
-        </w:rPr>
-        <w:t>Langjähriges Engagement – Beleg für Beständigkeit und nachhaltige Kundenbeziehungen.</w:t>
-      </w:r>
-    </w:p>
-    <w:p>
-      <w:pPr>
-        <w:spacing w:before="0" w:after="20" w:line="264" w:lineRule="auto"/>
-        <w:ind w:left="283" w:hanging="283"/>
-      </w:pPr>
-      <w:r>
-        <w:rPr>
-          <w:rFonts w:ascii="Calibri" w:hAnsi="Calibri"/>
-          <w:b w:val="0"/>
-          <w:i w:val="0"/>
-          <w:color w:val="1A1A1A"/>
-          <w:sz w:val="20"/>
-        </w:rPr>
-        <w:t xml:space="preserve">–  </w:t>
-      </w:r>
-      <w:r>
-        <w:rPr>
-          <w:rFonts w:ascii="Calibri" w:hAnsi="Calibri"/>
-          <w:b w:val="0"/>
-          <w:i/>
-          <w:color w:val="6E6E6E"/>
-          <w:sz w:val="20"/>
-          <w:shd w:val="clear" w:color="auto" w:fill="EDE3C8"/>
-        </w:rPr>
-        <w:t>〈Tätigkeit konkretisieren〉</w:t>
-      </w:r>
-    </w:p>
-    <w:p>
-      <w:pPr>
-        <w:tabs>
-          <w:tab w:pos="9638" w:val="right"/>
-        </w:tabs>
-        <w:spacing w:before="120" w:after="0" w:line="240" w:lineRule="auto"/>
-      </w:pPr>
-      <w:r>
-        <w:rPr>
-          <w:rFonts w:ascii="Calibri" w:hAnsi="Calibri"/>
-          <w:b/>
-          <w:i w:val="0"/>
-          <w:color w:val="1A1A1A"/>
-          <w:sz w:val="22"/>
-        </w:rPr>
-        <w:t>Selbständige Tätigkeit</w:t>
-      </w:r>
-      <w:r>
-        <w:rPr>
-          <w:rFonts w:ascii="Calibri" w:hAnsi="Calibri"/>
-          <w:b w:val="0"/>
-          <w:i w:val="0"/>
-          <w:color w:val="1A1A1A"/>
-          <w:sz w:val="20"/>
-        </w:rPr>
-        <w:tab/>
-      </w:r>
-      <w:r>
-        <w:rPr>
-          <w:rFonts w:ascii="Calibri" w:hAnsi="Calibri"/>
-          <w:b w:val="0"/>
-          <w:i/>
-          <w:color w:val="6E6E6E"/>
-          <w:sz w:val="20"/>
-          <w:shd w:val="clear" w:color="auto" w:fill="EDE3C8"/>
-        </w:rPr>
-        <w:t>〈MM.JJJJ – MM.JJJJ〉</w:t>
-      </w:r>
-    </w:p>
-    <w:p>
-      <w:pPr>
-        <w:spacing w:before="0" w:after="40" w:line="240" w:lineRule="auto"/>
-      </w:pPr>
-      <w:r>
-        <w:rPr>
-          <w:rFonts w:ascii="Calibri" w:hAnsi="Calibri"/>
-          <w:b/>
-          <w:i w:val="0"/>
-          <w:color w:val="1F3A5F"/>
-          <w:sz w:val="21"/>
-        </w:rPr>
-        <w:t>Selbständig / Freelance</w:t>
-      </w:r>
-      <w:r>
-        <w:rPr>
-          <w:rFonts w:ascii="Calibri" w:hAnsi="Calibri"/>
-          <w:b w:val="0"/>
-          <w:i w:val="0"/>
-          <w:color w:val="6E6E6E"/>
-          <w:sz w:val="21"/>
-        </w:rPr>
-        <w:t xml:space="preserve">  ·  </w:t>
-      </w:r>
-      <w:r>
-        <w:rPr>
-          <w:rFonts w:ascii="Calibri" w:hAnsi="Calibri"/>
-          <w:b w:val="0"/>
-          <w:i/>
-          <w:color w:val="6E6E6E"/>
-          <w:sz w:val="20"/>
-          <w:shd w:val="clear" w:color="auto" w:fill="EDE3C8"/>
-        </w:rPr>
-        <w:t>〈Ort〉</w:t>
-      </w:r>
-    </w:p>
-    <w:p>
-      <w:pPr>
-        <w:spacing w:before="0" w:after="20" w:line="264" w:lineRule="auto"/>
-        <w:ind w:left="283" w:hanging="283"/>
-      </w:pPr>
-      <w:r>
-        <w:rPr>
-          <w:rFonts w:ascii="Calibri" w:hAnsi="Calibri"/>
-          <w:b w:val="0"/>
-          <w:i w:val="0"/>
-          <w:color w:val="1A1A1A"/>
-          <w:sz w:val="20"/>
-        </w:rPr>
-        <w:t xml:space="preserve">–  </w:t>
-      </w:r>
-      <w:r>
-        <w:rPr>
-          <w:rFonts w:ascii="Calibri" w:hAnsi="Calibri"/>
-          <w:b w:val="0"/>
-          <w:i/>
-          <w:color w:val="6E6E6E"/>
-          <w:sz w:val="20"/>
-          <w:shd w:val="clear" w:color="auto" w:fill="EDE3C8"/>
-        </w:rPr>
-        <w:t>〈Schwerpunkt und Reihenfolge der Freelance-Phase einordnen〉</w:t>
-      </w:r>
-    </w:p>
-    <w:p>
-      <w:pPr>
-        <w:spacing w:before="200" w:after="80" w:line="240" w:lineRule="auto"/>
-        <w:pBdr>
-          <w:bottom w:val="single" w:sz="6" w:space="4" w:color="BFBFBF"/>
-        </w:pBdr>
-      </w:pPr>
-      <w:r>
-        <w:rPr>
-          <w:rFonts w:ascii="Calibri" w:hAnsi="Calibri"/>
-          <w:b/>
-          <w:i w:val="0"/>
-          <w:color w:val="1F3A5F"/>
-          <w:sz w:val="22"/>
-          <w:spacing w:val="20"/>
-        </w:rPr>
-        <w:t>AUSBILDUNG</w:t>
-      </w:r>
-    </w:p>
-    <w:p>
-      <w:pPr>
-        <w:tabs>
-          <w:tab w:pos="9638" w:val="right"/>
-        </w:tabs>
-        <w:spacing w:before="80" w:after="0" w:line="240" w:lineRule="auto"/>
-      </w:pPr>
-      <w:r>
-        <w:rPr>
-          <w:rFonts w:ascii="Calibri" w:hAnsi="Calibri"/>
-          <w:b w:val="0"/>
-          <w:i/>
-          <w:color w:val="6E6E6E"/>
-          <w:sz w:val="21"/>
-          <w:shd w:val="clear" w:color="auto" w:fill="EDE3C8"/>
-        </w:rPr>
-        <w:t>〈Abschluss / Titel〉</w:t>
-      </w:r>
-      <w:r>
-        <w:rPr>
-          <w:rFonts w:ascii="Calibri" w:hAnsi="Calibri"/>
-          <w:b w:val="0"/>
-          <w:i w:val="0"/>
-          <w:color w:val="1A1A1A"/>
-          <w:sz w:val="21"/>
-        </w:rPr>
-        <w:tab/>
-      </w:r>
-      <w:r>
-        <w:rPr>
-          <w:rFonts w:ascii="Calibri" w:hAnsi="Calibri"/>
-          <w:b w:val="0"/>
-          <w:i/>
-          <w:color w:val="6E6E6E"/>
-          <w:sz w:val="20"/>
-          <w:shd w:val="clear" w:color="auto" w:fill="EDE3C8"/>
-        </w:rPr>
-        <w:t>〈JJJJ – JJJJ〉</w:t>
-      </w:r>
-    </w:p>
-    <w:p>
-      <w:pPr>
-        <w:spacing w:before="0" w:after="80" w:line="240" w:lineRule="auto"/>
-      </w:pPr>
-      <w:r>
-        <w:rPr>
-          <w:rFonts w:ascii="Calibri" w:hAnsi="Calibri"/>
-          <w:b w:val="0"/>
-          <w:i/>
-          <w:color w:val="6E6E6E"/>
-          <w:sz w:val="20"/>
-          <w:shd w:val="clear" w:color="auto" w:fill="EDE3C8"/>
-        </w:rPr>
-        <w:t>〈Fachrichtung〉</w:t>
-      </w:r>
-      <w:r>
-        <w:rPr>
-          <w:rFonts w:ascii="Calibri" w:hAnsi="Calibri"/>
-          <w:b w:val="0"/>
-          <w:i w:val="0"/>
-          <w:color w:val="6E6E6E"/>
-          <w:sz w:val="21"/>
-        </w:rPr>
-        <w:t xml:space="preserve">  ·  </w:t>
-      </w:r>
-      <w:r>
-        <w:rPr>
-          <w:rFonts w:ascii="Calibri" w:hAnsi="Calibri"/>
-          <w:b w:val="0"/>
-          <w:i/>
-          <w:color w:val="6E6E6E"/>
-          <w:sz w:val="20"/>
-          <w:shd w:val="clear" w:color="auto" w:fill="EDE3C8"/>
-        </w:rPr>
-        <w:t>〈Hochschule / Institution, Ort〉</w:t>
-      </w:r>
-    </w:p>
-    <w:p>
-      <w:pPr>
-        <w:spacing w:before="200" w:after="80" w:line="240" w:lineRule="auto"/>
-        <w:pBdr>
-          <w:bottom w:val="single" w:sz="6" w:space="4" w:color="BFBFBF"/>
-        </w:pBdr>
-      </w:pPr>
-      <w:r>
-        <w:rPr>
-          <w:rFonts w:ascii="Calibri" w:hAnsi="Calibri"/>
-          <w:b/>
-          <w:i w:val="0"/>
-          <w:color w:val="1F3A5F"/>
-          <w:sz w:val="22"/>
-          <w:spacing w:val="20"/>
-        </w:rPr>
-        <w:t>SPRACHEN</w:t>
-      </w:r>
-    </w:p>
-    <w:p>
-      <w:pPr>
-        <w:tabs>
-          <w:tab w:pos="2268" w:val="left"/>
-        </w:tabs>
-        <w:spacing w:before="0" w:after="20" w:line="240" w:lineRule="auto"/>
-      </w:pPr>
-      <w:r>
-        <w:rPr>
-          <w:rFonts w:ascii="Calibri" w:hAnsi="Calibri"/>
-          <w:b/>
-          <w:i w:val="0"/>
-          <w:color w:val="1A1A1A"/>
-          <w:sz w:val="20"/>
-        </w:rPr>
-        <w:t>Deutsch</w:t>
-      </w:r>
-      <w:r>
-        <w:rPr>
-          <w:rFonts w:ascii="Calibri" w:hAnsi="Calibri"/>
-          <w:b w:val="0"/>
-          <w:i w:val="0"/>
-          <w:color w:val="1A1A1A"/>
-          <w:sz w:val="20"/>
-        </w:rPr>
-        <w:tab/>
-      </w:r>
-      <w:r>
-        <w:rPr>
-          <w:rFonts w:ascii="Calibri" w:hAnsi="Calibri"/>
-          <w:b w:val="0"/>
-          <w:i/>
-          <w:color w:val="6E6E6E"/>
-          <w:sz w:val="20"/>
-          <w:shd w:val="clear" w:color="auto" w:fill="EDE3C8"/>
-        </w:rPr>
-        <w:t>〈Muttersprache / Niveau〉</w:t>
-      </w:r>
-    </w:p>
-    <w:p>
-      <w:pPr>
-        <w:tabs>
-          <w:tab w:pos="2268" w:val="left"/>
-        </w:tabs>
-        <w:spacing w:before="0" w:after="20" w:line="240" w:lineRule="auto"/>
-      </w:pPr>
-      <w:r>
-        <w:rPr>
-          <w:rFonts w:ascii="Calibri" w:hAnsi="Calibri"/>
-          <w:b/>
-          <w:i w:val="0"/>
-          <w:color w:val="1A1A1A"/>
-          <w:sz w:val="20"/>
-        </w:rPr>
-        <w:t>Französisch</w:t>
-      </w:r>
-      <w:r>
-        <w:rPr>
-          <w:rFonts w:ascii="Calibri" w:hAnsi="Calibri"/>
-          <w:b w:val="0"/>
-          <w:i w:val="0"/>
-          <w:color w:val="1A1A1A"/>
-          <w:sz w:val="20"/>
-        </w:rPr>
-        <w:tab/>
-      </w:r>
-      <w:r>
-        <w:rPr>
-          <w:rFonts w:ascii="Calibri" w:hAnsi="Calibri"/>
-          <w:b w:val="0"/>
-          <w:i/>
-          <w:color w:val="6E6E6E"/>
-          <w:sz w:val="20"/>
-          <w:shd w:val="clear" w:color="auto" w:fill="EDE3C8"/>
-        </w:rPr>
-        <w:t>〈Niveau (z. B. B2)〉</w:t>
-      </w:r>
-    </w:p>
-    <w:p>
-      <w:pPr>
-        <w:tabs>
-          <w:tab w:pos="2268" w:val="left"/>
-        </w:tabs>
-        <w:spacing w:before="0" w:after="20" w:line="240" w:lineRule="auto"/>
-      </w:pPr>
-      <w:r>
-        <w:rPr>
-          <w:rFonts w:ascii="Calibri" w:hAnsi="Calibri"/>
-          <w:b/>
-          <w:i w:val="0"/>
-          <w:color w:val="1A1A1A"/>
-          <w:sz w:val="20"/>
-        </w:rPr>
-        <w:t>Englisch</w:t>
-      </w:r>
-      <w:r>
-        <w:rPr>
-          <w:rFonts w:ascii="Calibri" w:hAnsi="Calibri"/>
-          <w:b w:val="0"/>
-          <w:i w:val="0"/>
-          <w:color w:val="1A1A1A"/>
-          <w:sz w:val="20"/>
-        </w:rPr>
-        <w:tab/>
-      </w:r>
-      <w:r>
-        <w:rPr>
-          <w:rFonts w:ascii="Calibri" w:hAnsi="Calibri"/>
-          <w:b w:val="0"/>
-          <w:i/>
-          <w:color w:val="6E6E6E"/>
-          <w:sz w:val="20"/>
-          <w:shd w:val="clear" w:color="auto" w:fill="EDE3C8"/>
-        </w:rPr>
-        <w:t>〈Niveau (z. B. B2/C1)〉</w:t>
-      </w:r>
-    </w:p>
-    <w:p>
-      <w:pPr>
-        <w:tabs>
-          <w:tab w:pos="2268" w:val="left"/>
-        </w:tabs>
-        <w:spacing w:before="0" w:after="20" w:line="240" w:lineRule="auto"/>
-      </w:pPr>
-      <w:r>
-        <w:rPr>
-          <w:rFonts w:ascii="Calibri" w:hAnsi="Calibri"/>
-          <w:b/>
-          <w:i w:val="0"/>
-          <w:color w:val="1A1A1A"/>
-          <w:sz w:val="20"/>
-        </w:rPr>
-        <w:t>Türkisch</w:t>
-      </w:r>
-      <w:r>
-        <w:rPr>
-          <w:rFonts w:ascii="Calibri" w:hAnsi="Calibri"/>
-          <w:b w:val="0"/>
-          <w:i w:val="0"/>
-          <w:color w:val="1A1A1A"/>
-          <w:sz w:val="20"/>
-        </w:rPr>
-        <w:tab/>
-      </w:r>
-      <w:r>
-        <w:rPr>
-          <w:rFonts w:ascii="Calibri" w:hAnsi="Calibri"/>
-          <w:b w:val="0"/>
-          <w:i/>
-          <w:color w:val="6E6E6E"/>
-          <w:sz w:val="20"/>
-          <w:shd w:val="clear" w:color="auto" w:fill="EDE3C8"/>
-        </w:rPr>
-        <w:t>〈Niveau〉</w:t>
-      </w:r>
-    </w:p>
-    <w:p>
-      <w:pPr>
-        <w:tabs>
-          <w:tab w:pos="2268" w:val="left"/>
-        </w:tabs>
-        <w:spacing w:before="0" w:after="20" w:line="240" w:lineRule="auto"/>
-      </w:pPr>
-      <w:r>
-        <w:rPr>
-          <w:rFonts w:ascii="Calibri" w:hAnsi="Calibri"/>
-          <w:b/>
-          <w:i w:val="0"/>
-          <w:color w:val="1A1A1A"/>
-          <w:sz w:val="20"/>
-        </w:rPr>
-        <w:t>Weitere</w:t>
-      </w:r>
-      <w:r>
-        <w:rPr>
-          <w:rFonts w:ascii="Calibri" w:hAnsi="Calibri"/>
-          <w:b w:val="0"/>
-          <w:i w:val="0"/>
-          <w:color w:val="1A1A1A"/>
-          <w:sz w:val="20"/>
-        </w:rPr>
-        <w:tab/>
-      </w:r>
-      <w:r>
-        <w:rPr>
-          <w:rFonts w:ascii="Calibri" w:hAnsi="Calibri"/>
-          <w:b w:val="0"/>
-          <w:i/>
-          <w:color w:val="6E6E6E"/>
-          <w:sz w:val="20"/>
-          <w:shd w:val="clear" w:color="auto" w:fill="EDE3C8"/>
-        </w:rPr>
-        <w:t>〈Sprache / Niveau〉</w:t>
-      </w:r>
-    </w:p>
-    <w:p>
-      <w:pPr>
-        <w:spacing w:before="200" w:after="80" w:line="240" w:lineRule="auto"/>
-        <w:pBdr>
-          <w:bottom w:val="single" w:sz="6" w:space="4" w:color="BFBFBF"/>
-        </w:pBdr>
-      </w:pPr>
-      <w:r>
-        <w:rPr>
-          <w:rFonts w:ascii="Calibri" w:hAnsi="Calibri"/>
-          <w:b/>
-          <w:i w:val="0"/>
-          <w:color w:val="1F3A5F"/>
-          <w:sz w:val="22"/>
-          <w:spacing w:val="20"/>
-        </w:rPr>
-        <w:t>IT-KENNTNISSE &amp; WEITERES</w:t>
-      </w:r>
-    </w:p>
-    <w:p>
-      <w:pPr>
-        <w:tabs>
-          <w:tab w:pos="2268" w:val="left"/>
-        </w:tabs>
-        <w:spacing w:before="0" w:after="20" w:line="240" w:lineRule="auto"/>
-      </w:pPr>
-      <w:r>
-        <w:rPr>
-          <w:rFonts w:ascii="Calibri" w:hAnsi="Calibri"/>
-          <w:b/>
-          <w:i w:val="0"/>
-          <w:color w:val="1A1A1A"/>
-          <w:sz w:val="20"/>
-        </w:rPr>
-        <w:t>EDV / CRM</w:t>
-      </w:r>
-      <w:r>
-        <w:rPr>
-          <w:rFonts w:ascii="Calibri" w:hAnsi="Calibri"/>
-          <w:b w:val="0"/>
-          <w:i w:val="0"/>
-          <w:color w:val="1A1A1A"/>
-          <w:sz w:val="20"/>
-        </w:rPr>
-        <w:tab/>
-      </w:r>
-      <w:r>
-        <w:rPr>
-          <w:rFonts w:ascii="Calibri" w:hAnsi="Calibri"/>
-          <w:b w:val="0"/>
-          <w:i/>
-          <w:color w:val="6E6E6E"/>
-          <w:sz w:val="20"/>
-          <w:shd w:val="clear" w:color="auto" w:fill="EDE3C8"/>
-        </w:rPr>
-        <w:t>〈z. B. MS Office, CRM-System einsetzen〉</w:t>
-      </w:r>
-    </w:p>
-    <w:p>
-      <w:pPr>
-        <w:tabs>
-          <w:tab w:pos="2268" w:val="left"/>
-        </w:tabs>
-        <w:spacing w:before="0" w:after="20" w:line="240" w:lineRule="auto"/>
-      </w:pPr>
-      <w:r>
-        <w:rPr>
-          <w:rFonts w:ascii="Calibri" w:hAnsi="Calibri"/>
-          <w:b/>
-          <w:i w:val="0"/>
-          <w:color w:val="1A1A1A"/>
-          <w:sz w:val="20"/>
-        </w:rPr>
-        <w:t>Führerausweis</w:t>
-      </w:r>
-      <w:r>
-        <w:rPr>
-          <w:rFonts w:ascii="Calibri" w:hAnsi="Calibri"/>
-          <w:b w:val="0"/>
-          <w:i w:val="0"/>
-          <w:color w:val="1A1A1A"/>
-          <w:sz w:val="20"/>
-        </w:rPr>
-        <w:tab/>
-      </w:r>
-      <w:r>
-        <w:rPr>
-          <w:rFonts w:ascii="Calibri" w:hAnsi="Calibri"/>
-          <w:b w:val="0"/>
-          <w:i/>
-          <w:color w:val="6E6E6E"/>
-          <w:sz w:val="20"/>
-          <w:shd w:val="clear" w:color="auto" w:fill="EDE3C8"/>
-        </w:rPr>
-        <w:t>〈Kat. B (für Aussendienst relevant)〉</w:t>
-      </w:r>
-    </w:p>
-    <w:p>
-      <w:pPr>
-        <w:tabs>
-          <w:tab w:pos="2268" w:val="left"/>
-        </w:tabs>
-        <w:spacing w:before="0" w:after="20" w:line="240" w:lineRule="auto"/>
-      </w:pPr>
-      <w:r>
-        <w:rPr>
-          <w:rFonts w:ascii="Calibri" w:hAnsi="Calibri"/>
-          <w:b/>
-          <w:i w:val="0"/>
-          <w:color w:val="1A1A1A"/>
-          <w:sz w:val="20"/>
-        </w:rPr>
-        <w:t>Militärdienst</w:t>
-      </w:r>
-      <w:r>
-        <w:rPr>
-          <w:rFonts w:ascii="Calibri" w:hAnsi="Calibri"/>
-          <w:b w:val="0"/>
-          <w:i w:val="0"/>
-          <w:color w:val="1A1A1A"/>
-          <w:sz w:val="20"/>
-        </w:rPr>
-        <w:tab/>
-      </w:r>
-      <w:r>
-        <w:rPr>
-          <w:rFonts w:ascii="Calibri" w:hAnsi="Calibri"/>
-          <w:b w:val="0"/>
-          <w:i/>
-          <w:color w:val="6E6E6E"/>
-          <w:sz w:val="20"/>
-          <w:shd w:val="clear" w:color="auto" w:fill="EDE3C8"/>
-        </w:rPr>
-        <w:t>〈Funktion / Grad / abgeschlossen〉</w:t>
-      </w:r>
-    </w:p>
-    <w:p>
-      <w:pPr>
-        <w:spacing w:before="200" w:after="80" w:line="240" w:lineRule="auto"/>
-        <w:pBdr>
-          <w:bottom w:val="single" w:sz="6" w:space="4" w:color="BFBFBF"/>
-        </w:pBdr>
-      </w:pPr>
-      <w:r>
-        <w:rPr>
-          <w:rFonts w:ascii="Calibri" w:hAnsi="Calibri"/>
-          <w:b/>
-          <w:i w:val="0"/>
-          <w:color w:val="1F3A5F"/>
-          <w:sz w:val="22"/>
-          <w:spacing w:val="20"/>
-        </w:rPr>
-        <w:t>REFERENZEN</w:t>
-      </w:r>
-    </w:p>
-    <w:p>
-      <w:pPr>
-        <w:spacing w:before="40" w:after="0" w:line="240" w:lineRule="auto"/>
-      </w:pPr>
-      <w:r>
-        <w:rPr>
-          <w:rFonts w:ascii="Calibri" w:hAnsi="Calibri"/>
-          <w:b w:val="0"/>
-          <w:i w:val="0"/>
-          <w:color w:val="6E6E6E"/>
-          <w:sz w:val="20"/>
-        </w:rPr>
-        <w:t>Auf Anfrage gerne.</w:t>
-      </w:r>
-    </w:p>
+    <w:tbl>
+      <w:tblPr>
+        <w:tblW w:type="auto" w:w="0"/>
+        <w:jc w:val="center"/>
+        <w:tblLook w:firstColumn="1" w:firstRow="1" w:lastColumn="0" w:lastRow="0" w:noHBand="0" w:noVBand="1" w:val="04A0"/>
+        <w:tblLayout w:type="fixed"/>
+        <w:tblBorders>
+          <w:top w:val="none" w:sz="0"/>
+          <w:left w:val="none" w:sz="0"/>
+          <w:bottom w:val="none" w:sz="0"/>
+          <w:right w:val="none" w:sz="0"/>
+          <w:insideH w:val="none" w:sz="0"/>
+          <w:insideV w:val="none" w:sz="0"/>
+        </w:tblBorders>
+      </w:tblPr>
+      <w:tblGrid>
+        <w:gridCol w:w="5216"/>
+        <w:gridCol w:w="5216"/>
+      </w:tblGrid>
+      <w:tr>
+        <w:tc>
+          <w:tcPr>
+            <w:tcW w:type="dxa" w:w="3402"/>
+            <w:vAlign w:val="top"/>
+            <w:shd w:val="clear" w:color="auto" w:fill="EEF2F6"/>
+            <w:tcMar>
+              <w:top w:w="240" w:type="dxa"/>
+              <w:bottom w:w="240" w:type="dxa"/>
+              <w:start w:w="240" w:type="dxa"/>
+              <w:end w:w="240" w:type="dxa"/>
+              <w:left w:w="240" w:type="dxa"/>
+              <w:right w:w="240" w:type="dxa"/>
+            </w:tcMar>
+          </w:tcPr>
+          <w:p>
+            <w:pPr>
+              <w:spacing w:before="0" w:after="160" w:line="240" w:lineRule="auto"/>
+              <w:jc w:val="center"/>
+              <w:pBdr>
+                <w:top w:val="single" w:sz="6" w:space="18" w:color="B7C2CE"/>
+                <w:bottom w:val="single" w:sz="6" w:space="18" w:color="B7C2CE"/>
+                <w:left w:val="single" w:sz="6" w:space="18" w:color="B7C2CE"/>
+                <w:right w:val="single" w:sz="6" w:space="18" w:color="B7C2CE"/>
+              </w:pBdr>
+            </w:pPr>
+            <w:r>
+              <w:rPr>
+                <w:rFonts w:ascii="Calibri" w:hAnsi="Calibri"/>
+                <w:b w:val="0"/>
+                <w:i/>
+                <w:color w:val="6B7280"/>
+                <w:sz w:val="20"/>
+              </w:rPr>
+              <w:t xml:space="preserve">  Foto  </w:t>
+            </w:r>
+          </w:p>
+          <w:p>
+            <w:pPr>
+              <w:spacing w:before="0" w:after="200" w:line="240" w:lineRule="auto"/>
+              <w:jc w:val="center"/>
+            </w:pPr>
+            <w:r>
+              <w:rPr>
+                <w:rFonts w:ascii="Calibri" w:hAnsi="Calibri"/>
+                <w:b w:val="0"/>
+                <w:i/>
+                <w:color w:val="6B7280"/>
+                <w:sz w:val="15"/>
+              </w:rPr>
+              <w:t>optional · CH-üblich</w:t>
+            </w:r>
+          </w:p>
+          <w:p>
+            <w:pPr>
+              <w:spacing w:before="280" w:after="100" w:line="240" w:lineRule="auto"/>
+              <w:pBdr>
+                <w:bottom w:val="single" w:sz="6" w:space="3" w:color="C9D2DC"/>
+              </w:pBdr>
+            </w:pPr>
+            <w:r>
+              <w:rPr>
+                <w:rFonts w:ascii="Calibri" w:hAnsi="Calibri"/>
+                <w:b/>
+                <w:i w:val="0"/>
+                <w:color w:val="162A43"/>
+                <w:sz w:val="21"/>
+                <w:spacing w:val="24"/>
+                <w:caps w:val="true"/>
+              </w:rPr>
+              <w:t>Kontakt</w:t>
+            </w:r>
+          </w:p>
+          <w:p>
+            <w:pPr>
+              <w:spacing w:before="0" w:after="60" w:line="252" w:lineRule="auto"/>
+            </w:pPr>
+            <w:r>
+              <w:rPr>
+                <w:rFonts w:ascii="Calibri" w:hAnsi="Calibri"/>
+                <w:b/>
+                <w:i w:val="0"/>
+                <w:color w:val="2C5F8A"/>
+                <w:sz w:val="17"/>
+                <w:spacing w:val="8"/>
+                <w:caps w:val="true"/>
+              </w:rPr>
+              <w:t>Adresse</w:t>
+              <w:br/>
+            </w:r>
+            <w:r>
+              <w:rPr>
+                <w:rFonts w:ascii="Calibri" w:hAnsi="Calibri"/>
+                <w:b w:val="0"/>
+                <w:i/>
+                <w:color w:val="9A7A2E"/>
+                <w:sz w:val="19"/>
+                <w:shd w:val="clear" w:color="auto" w:fill="FBF1D8"/>
+              </w:rPr>
+              <w:t>〈Strasse Nr.</w:t>
+              <w:br/>
+              <w:t>PLZ Ort〉</w:t>
+            </w:r>
+          </w:p>
+          <w:p>
+            <w:pPr>
+              <w:spacing w:before="0" w:after="60" w:line="252" w:lineRule="auto"/>
+            </w:pPr>
+            <w:r>
+              <w:rPr>
+                <w:rFonts w:ascii="Calibri" w:hAnsi="Calibri"/>
+                <w:b/>
+                <w:i w:val="0"/>
+                <w:color w:val="2C5F8A"/>
+                <w:sz w:val="17"/>
+                <w:spacing w:val="8"/>
+                <w:caps w:val="true"/>
+              </w:rPr>
+              <w:t>Telefon</w:t>
+              <w:br/>
+            </w:r>
+            <w:r>
+              <w:rPr>
+                <w:rFonts w:ascii="Calibri" w:hAnsi="Calibri"/>
+                <w:b w:val="0"/>
+                <w:i/>
+                <w:color w:val="9A7A2E"/>
+                <w:sz w:val="19"/>
+                <w:shd w:val="clear" w:color="auto" w:fill="FBF1D8"/>
+              </w:rPr>
+              <w:t>〈+41 ...〉</w:t>
+            </w:r>
+          </w:p>
+          <w:p>
+            <w:pPr>
+              <w:spacing w:before="0" w:after="60" w:line="252" w:lineRule="auto"/>
+            </w:pPr>
+            <w:r>
+              <w:rPr>
+                <w:rFonts w:ascii="Calibri" w:hAnsi="Calibri"/>
+                <w:b/>
+                <w:i w:val="0"/>
+                <w:color w:val="2C5F8A"/>
+                <w:sz w:val="17"/>
+                <w:spacing w:val="8"/>
+                <w:caps w:val="true"/>
+              </w:rPr>
+              <w:t>E-Mail</w:t>
+              <w:br/>
+            </w:r>
+            <w:r>
+              <w:rPr>
+                <w:rFonts w:ascii="Calibri" w:hAnsi="Calibri"/>
+                <w:b w:val="0"/>
+                <w:i w:val="0"/>
+                <w:color w:val="22262B"/>
+                <w:sz w:val="19"/>
+              </w:rPr>
+              <w:t>b.s.uecoez@gmail.com</w:t>
+            </w:r>
+          </w:p>
+          <w:p>
+            <w:pPr>
+              <w:spacing w:before="0" w:after="60" w:line="252" w:lineRule="auto"/>
+            </w:pPr>
+            <w:r>
+              <w:rPr>
+                <w:rFonts w:ascii="Calibri" w:hAnsi="Calibri"/>
+                <w:b/>
+                <w:i w:val="0"/>
+                <w:color w:val="2C5F8A"/>
+                <w:sz w:val="17"/>
+                <w:spacing w:val="8"/>
+                <w:caps w:val="true"/>
+              </w:rPr>
+              <w:t>LinkedIn</w:t>
+              <w:br/>
+            </w:r>
+            <w:r>
+              <w:rPr>
+                <w:rFonts w:ascii="Calibri" w:hAnsi="Calibri"/>
+                <w:b w:val="0"/>
+                <w:i/>
+                <w:color w:val="9A7A2E"/>
+                <w:sz w:val="19"/>
+                <w:shd w:val="clear" w:color="auto" w:fill="FBF1D8"/>
+              </w:rPr>
+              <w:t>〈linkedin.com/in/...〉</w:t>
+            </w:r>
+          </w:p>
+          <w:p>
+            <w:pPr>
+              <w:spacing w:before="280" w:after="100" w:line="240" w:lineRule="auto"/>
+              <w:pBdr>
+                <w:bottom w:val="single" w:sz="6" w:space="3" w:color="C9D2DC"/>
+              </w:pBdr>
+            </w:pPr>
+            <w:r>
+              <w:rPr>
+                <w:rFonts w:ascii="Calibri" w:hAnsi="Calibri"/>
+                <w:b/>
+                <w:i w:val="0"/>
+                <w:color w:val="162A43"/>
+                <w:sz w:val="21"/>
+                <w:spacing w:val="24"/>
+                <w:caps w:val="true"/>
+              </w:rPr>
+              <w:t>Persönliches</w:t>
+            </w:r>
+          </w:p>
+          <w:p>
+            <w:pPr>
+              <w:spacing w:before="0" w:after="60" w:line="252" w:lineRule="auto"/>
+            </w:pPr>
+            <w:r>
+              <w:rPr>
+                <w:rFonts w:ascii="Calibri" w:hAnsi="Calibri"/>
+                <w:b/>
+                <w:i w:val="0"/>
+                <w:color w:val="2C5F8A"/>
+                <w:sz w:val="17"/>
+                <w:spacing w:val="8"/>
+                <w:caps w:val="true"/>
+              </w:rPr>
+              <w:t>Geburtsdatum</w:t>
+              <w:br/>
+            </w:r>
+            <w:r>
+              <w:rPr>
+                <w:rFonts w:ascii="Calibri" w:hAnsi="Calibri"/>
+                <w:b w:val="0"/>
+                <w:i/>
+                <w:color w:val="9A7A2E"/>
+                <w:sz w:val="19"/>
+                <w:shd w:val="clear" w:color="auto" w:fill="FBF1D8"/>
+              </w:rPr>
+              <w:t>〈TT.MM.JJJJ〉</w:t>
+            </w:r>
+          </w:p>
+          <w:p>
+            <w:pPr>
+              <w:spacing w:before="0" w:after="60" w:line="252" w:lineRule="auto"/>
+            </w:pPr>
+            <w:r>
+              <w:rPr>
+                <w:rFonts w:ascii="Calibri" w:hAnsi="Calibri"/>
+                <w:b/>
+                <w:i w:val="0"/>
+                <w:color w:val="2C5F8A"/>
+                <w:sz w:val="17"/>
+                <w:spacing w:val="8"/>
+                <w:caps w:val="true"/>
+              </w:rPr>
+              <w:t>Nationalität</w:t>
+              <w:br/>
+            </w:r>
+            <w:r>
+              <w:rPr>
+                <w:rFonts w:ascii="Calibri" w:hAnsi="Calibri"/>
+                <w:b w:val="0"/>
+                <w:i/>
+                <w:color w:val="9A7A2E"/>
+                <w:sz w:val="19"/>
+                <w:shd w:val="clear" w:color="auto" w:fill="FBF1D8"/>
+              </w:rPr>
+              <w:t>〈...〉</w:t>
+            </w:r>
+          </w:p>
+          <w:p>
+            <w:pPr>
+              <w:spacing w:before="0" w:after="60" w:line="252" w:lineRule="auto"/>
+            </w:pPr>
+            <w:r>
+              <w:rPr>
+                <w:rFonts w:ascii="Calibri" w:hAnsi="Calibri"/>
+                <w:b/>
+                <w:i w:val="0"/>
+                <w:color w:val="2C5F8A"/>
+                <w:sz w:val="17"/>
+                <w:spacing w:val="8"/>
+                <w:caps w:val="true"/>
+              </w:rPr>
+              <w:t>Bewilligung / Bürgerort</w:t>
+              <w:br/>
+            </w:r>
+            <w:r>
+              <w:rPr>
+                <w:rFonts w:ascii="Calibri" w:hAnsi="Calibri"/>
+                <w:b w:val="0"/>
+                <w:i/>
+                <w:color w:val="9A7A2E"/>
+                <w:sz w:val="19"/>
+                <w:shd w:val="clear" w:color="auto" w:fill="FBF1D8"/>
+              </w:rPr>
+              <w:t>〈...〉</w:t>
+            </w:r>
+          </w:p>
+          <w:p>
+            <w:pPr>
+              <w:spacing w:before="0" w:after="60" w:line="252" w:lineRule="auto"/>
+            </w:pPr>
+            <w:r>
+              <w:rPr>
+                <w:rFonts w:ascii="Calibri" w:hAnsi="Calibri"/>
+                <w:b/>
+                <w:i w:val="0"/>
+                <w:color w:val="2C5F8A"/>
+                <w:sz w:val="17"/>
+                <w:spacing w:val="8"/>
+                <w:caps w:val="true"/>
+              </w:rPr>
+              <w:t>Führerausweis</w:t>
+              <w:br/>
+            </w:r>
+            <w:r>
+              <w:rPr>
+                <w:rFonts w:ascii="Calibri" w:hAnsi="Calibri"/>
+                <w:b w:val="0"/>
+                <w:i/>
+                <w:color w:val="9A7A2E"/>
+                <w:sz w:val="19"/>
+                <w:shd w:val="clear" w:color="auto" w:fill="FBF1D8"/>
+              </w:rPr>
+              <w:t>〈Kat. B〉</w:t>
+            </w:r>
+          </w:p>
+          <w:p>
+            <w:pPr>
+              <w:spacing w:before="280" w:after="100" w:line="240" w:lineRule="auto"/>
+              <w:pBdr>
+                <w:bottom w:val="single" w:sz="6" w:space="3" w:color="C9D2DC"/>
+              </w:pBdr>
+            </w:pPr>
+            <w:r>
+              <w:rPr>
+                <w:rFonts w:ascii="Calibri" w:hAnsi="Calibri"/>
+                <w:b/>
+                <w:i w:val="0"/>
+                <w:color w:val="162A43"/>
+                <w:sz w:val="21"/>
+                <w:spacing w:val="24"/>
+                <w:caps w:val="true"/>
+              </w:rPr>
+              <w:t>Sprachen</w:t>
+            </w:r>
+          </w:p>
+          <w:p>
+            <w:pPr>
+              <w:spacing w:before="0" w:after="80" w:line="240" w:lineRule="auto"/>
+            </w:pPr>
+            <w:r>
+              <w:rPr>
+                <w:rFonts w:ascii="Calibri" w:hAnsi="Calibri"/>
+                <w:b/>
+                <w:i w:val="0"/>
+                <w:color w:val="22262B"/>
+                <w:sz w:val="19"/>
+              </w:rPr>
+              <w:t>Deutsch</w:t>
+            </w:r>
+            <w:r>
+              <w:rPr>
+                <w:rFonts w:ascii="Calibri" w:hAnsi="Calibri"/>
+                <w:b w:val="0"/>
+                <w:i w:val="0"/>
+                <w:color w:val="22262B"/>
+                <w:sz w:val="19"/>
+              </w:rPr>
+              <w:t xml:space="preserve">   </w:t>
+            </w:r>
+            <w:r>
+              <w:rPr>
+                <w:rFonts w:ascii="Calibri" w:hAnsi="Calibri"/>
+                <w:b w:val="0"/>
+                <w:i/>
+                <w:color w:val="9A7A2E"/>
+                <w:sz w:val="17"/>
+                <w:shd w:val="clear" w:color="auto" w:fill="FBF1D8"/>
+              </w:rPr>
+              <w:t>〈Muttersprache / Niveau〉</w:t>
+            </w:r>
+          </w:p>
+          <w:p>
+            <w:pPr>
+              <w:spacing w:before="0" w:after="80" w:line="240" w:lineRule="auto"/>
+            </w:pPr>
+            <w:r>
+              <w:rPr>
+                <w:rFonts w:ascii="Calibri" w:hAnsi="Calibri"/>
+                <w:b/>
+                <w:i w:val="0"/>
+                <w:color w:val="22262B"/>
+                <w:sz w:val="19"/>
+              </w:rPr>
+              <w:t>Französisch</w:t>
+            </w:r>
+            <w:r>
+              <w:rPr>
+                <w:rFonts w:ascii="Calibri" w:hAnsi="Calibri"/>
+                <w:b w:val="0"/>
+                <w:i w:val="0"/>
+                <w:color w:val="22262B"/>
+                <w:sz w:val="19"/>
+              </w:rPr>
+              <w:t xml:space="preserve">   </w:t>
+            </w:r>
+            <w:r>
+              <w:rPr>
+                <w:rFonts w:ascii="Calibri" w:hAnsi="Calibri"/>
+                <w:b w:val="0"/>
+                <w:i/>
+                <w:color w:val="9A7A2E"/>
+                <w:sz w:val="17"/>
+                <w:shd w:val="clear" w:color="auto" w:fill="FBF1D8"/>
+              </w:rPr>
+              <w:t>〈z. B. B2〉</w:t>
+            </w:r>
+          </w:p>
+          <w:p>
+            <w:pPr>
+              <w:spacing w:before="0" w:after="80" w:line="240" w:lineRule="auto"/>
+            </w:pPr>
+            <w:r>
+              <w:rPr>
+                <w:rFonts w:ascii="Calibri" w:hAnsi="Calibri"/>
+                <w:b/>
+                <w:i w:val="0"/>
+                <w:color w:val="22262B"/>
+                <w:sz w:val="19"/>
+              </w:rPr>
+              <w:t>Englisch</w:t>
+            </w:r>
+            <w:r>
+              <w:rPr>
+                <w:rFonts w:ascii="Calibri" w:hAnsi="Calibri"/>
+                <w:b w:val="0"/>
+                <w:i w:val="0"/>
+                <w:color w:val="22262B"/>
+                <w:sz w:val="19"/>
+              </w:rPr>
+              <w:t xml:space="preserve">   </w:t>
+            </w:r>
+            <w:r>
+              <w:rPr>
+                <w:rFonts w:ascii="Calibri" w:hAnsi="Calibri"/>
+                <w:b w:val="0"/>
+                <w:i/>
+                <w:color w:val="9A7A2E"/>
+                <w:sz w:val="17"/>
+                <w:shd w:val="clear" w:color="auto" w:fill="FBF1D8"/>
+              </w:rPr>
+              <w:t>〈z. B. B2/C1〉</w:t>
+            </w:r>
+          </w:p>
+          <w:p>
+            <w:pPr>
+              <w:spacing w:before="0" w:after="80" w:line="240" w:lineRule="auto"/>
+            </w:pPr>
+            <w:r>
+              <w:rPr>
+                <w:rFonts w:ascii="Calibri" w:hAnsi="Calibri"/>
+                <w:b/>
+                <w:i w:val="0"/>
+                <w:color w:val="22262B"/>
+                <w:sz w:val="19"/>
+              </w:rPr>
+              <w:t>Türkisch</w:t>
+            </w:r>
+            <w:r>
+              <w:rPr>
+                <w:rFonts w:ascii="Calibri" w:hAnsi="Calibri"/>
+                <w:b w:val="0"/>
+                <w:i w:val="0"/>
+                <w:color w:val="22262B"/>
+                <w:sz w:val="19"/>
+              </w:rPr>
+              <w:t xml:space="preserve">   </w:t>
+            </w:r>
+            <w:r>
+              <w:rPr>
+                <w:rFonts w:ascii="Calibri" w:hAnsi="Calibri"/>
+                <w:b w:val="0"/>
+                <w:i/>
+                <w:color w:val="9A7A2E"/>
+                <w:sz w:val="17"/>
+                <w:shd w:val="clear" w:color="auto" w:fill="FBF1D8"/>
+              </w:rPr>
+              <w:t>〈Niveau〉</w:t>
+            </w:r>
+          </w:p>
+          <w:p>
+            <w:pPr>
+              <w:spacing w:before="280" w:after="100" w:line="240" w:lineRule="auto"/>
+              <w:pBdr>
+                <w:bottom w:val="single" w:sz="6" w:space="3" w:color="C9D2DC"/>
+              </w:pBdr>
+            </w:pPr>
+            <w:r>
+              <w:rPr>
+                <w:rFonts w:ascii="Calibri" w:hAnsi="Calibri"/>
+                <w:b/>
+                <w:i w:val="0"/>
+                <w:color w:val="162A43"/>
+                <w:sz w:val="21"/>
+                <w:spacing w:val="24"/>
+                <w:caps w:val="true"/>
+              </w:rPr>
+              <w:t>Kompetenzen</w:t>
+            </w:r>
+          </w:p>
+          <w:p>
+            <w:pPr>
+              <w:spacing w:before="0" w:after="60" w:line="252" w:lineRule="auto"/>
+            </w:pPr>
+            <w:r>
+              <w:rPr>
+                <w:rFonts w:ascii="Calibri" w:hAnsi="Calibri"/>
+                <w:b w:val="0"/>
+                <w:i w:val="0"/>
+                <w:color w:val="2C5F8A"/>
+                <w:sz w:val="18"/>
+              </w:rPr>
+              <w:t xml:space="preserve">▪ </w:t>
+            </w:r>
+            <w:r>
+              <w:rPr>
+                <w:rFonts w:ascii="Calibri" w:hAnsi="Calibri"/>
+                <w:b w:val="0"/>
+                <w:i w:val="0"/>
+                <w:color w:val="22262B"/>
+                <w:sz w:val="19"/>
+              </w:rPr>
+              <w:t>Neukundenakquise</w:t>
+            </w:r>
+          </w:p>
+          <w:p>
+            <w:pPr>
+              <w:spacing w:before="0" w:after="60" w:line="252" w:lineRule="auto"/>
+            </w:pPr>
+            <w:r>
+              <w:rPr>
+                <w:rFonts w:ascii="Calibri" w:hAnsi="Calibri"/>
+                <w:b w:val="0"/>
+                <w:i w:val="0"/>
+                <w:color w:val="2C5F8A"/>
+                <w:sz w:val="18"/>
+              </w:rPr>
+              <w:t xml:space="preserve">▪ </w:t>
+            </w:r>
+            <w:r>
+              <w:rPr>
+                <w:rFonts w:ascii="Calibri" w:hAnsi="Calibri"/>
+                <w:b w:val="0"/>
+                <w:i w:val="0"/>
+                <w:color w:val="22262B"/>
+                <w:sz w:val="19"/>
+              </w:rPr>
+              <w:t>Gebiets- &amp; Budgetverantwortung</w:t>
+            </w:r>
+          </w:p>
+          <w:p>
+            <w:pPr>
+              <w:spacing w:before="0" w:after="60" w:line="252" w:lineRule="auto"/>
+            </w:pPr>
+            <w:r>
+              <w:rPr>
+                <w:rFonts w:ascii="Calibri" w:hAnsi="Calibri"/>
+                <w:b w:val="0"/>
+                <w:i w:val="0"/>
+                <w:color w:val="2C5F8A"/>
+                <w:sz w:val="18"/>
+              </w:rPr>
+              <w:t xml:space="preserve">▪ </w:t>
+            </w:r>
+            <w:r>
+              <w:rPr>
+                <w:rFonts w:ascii="Calibri" w:hAnsi="Calibri"/>
+                <w:b w:val="0"/>
+                <w:i w:val="0"/>
+                <w:color w:val="22262B"/>
+                <w:sz w:val="19"/>
+              </w:rPr>
+              <w:t>Technische Beratung</w:t>
+            </w:r>
+          </w:p>
+          <w:p>
+            <w:pPr>
+              <w:spacing w:before="0" w:after="60" w:line="252" w:lineRule="auto"/>
+            </w:pPr>
+            <w:r>
+              <w:rPr>
+                <w:rFonts w:ascii="Calibri" w:hAnsi="Calibri"/>
+                <w:b w:val="0"/>
+                <w:i w:val="0"/>
+                <w:color w:val="2C5F8A"/>
+                <w:sz w:val="18"/>
+              </w:rPr>
+              <w:t xml:space="preserve">▪ </w:t>
+            </w:r>
+            <w:r>
+              <w:rPr>
+                <w:rFonts w:ascii="Calibri" w:hAnsi="Calibri"/>
+                <w:b w:val="0"/>
+                <w:i w:val="0"/>
+                <w:color w:val="22262B"/>
+                <w:sz w:val="19"/>
+              </w:rPr>
+              <w:t>Verhandlung &amp; Abschluss</w:t>
+            </w:r>
+          </w:p>
+          <w:p>
+            <w:pPr>
+              <w:spacing w:before="0" w:after="60" w:line="252" w:lineRule="auto"/>
+            </w:pPr>
+            <w:r>
+              <w:rPr>
+                <w:rFonts w:ascii="Calibri" w:hAnsi="Calibri"/>
+                <w:b w:val="0"/>
+                <w:i w:val="0"/>
+                <w:color w:val="2C5F8A"/>
+                <w:sz w:val="18"/>
+              </w:rPr>
+              <w:t xml:space="preserve">▪ </w:t>
+            </w:r>
+            <w:r>
+              <w:rPr>
+                <w:rFonts w:ascii="Calibri" w:hAnsi="Calibri"/>
+                <w:b w:val="0"/>
+                <w:i w:val="0"/>
+                <w:color w:val="22262B"/>
+                <w:sz w:val="19"/>
+              </w:rPr>
+              <w:t xml:space="preserve">CRM </w:t>
+            </w:r>
+            <w:r>
+              <w:rPr>
+                <w:rFonts w:ascii="Calibri" w:hAnsi="Calibri"/>
+                <w:b w:val="0"/>
+                <w:i/>
+                <w:color w:val="9A7A2E"/>
+                <w:sz w:val="17"/>
+                <w:shd w:val="clear" w:color="auto" w:fill="FBF1D8"/>
+              </w:rPr>
+              <w:t>〈System〉</w:t>
+            </w:r>
+            <w:r>
+              <w:rPr>
+                <w:rFonts w:ascii="Calibri" w:hAnsi="Calibri"/>
+                <w:b w:val="0"/>
+                <w:i w:val="0"/>
+                <w:color w:val="22262B"/>
+                <w:sz w:val="19"/>
+              </w:rPr>
+              <w:t xml:space="preserve"> · MS Office</w:t>
+            </w:r>
+          </w:p>
+          <w:p>
+            <w:pPr>
+              <w:spacing w:before="280" w:after="100" w:line="240" w:lineRule="auto"/>
+              <w:pBdr>
+                <w:bottom w:val="single" w:sz="6" w:space="3" w:color="C9D2DC"/>
+              </w:pBdr>
+            </w:pPr>
+            <w:r>
+              <w:rPr>
+                <w:rFonts w:ascii="Calibri" w:hAnsi="Calibri"/>
+                <w:b/>
+                <w:i w:val="0"/>
+                <w:color w:val="162A43"/>
+                <w:sz w:val="21"/>
+                <w:spacing w:val="24"/>
+                <w:caps w:val="true"/>
+              </w:rPr>
+              <w:t>Militärdienst</w:t>
+            </w:r>
+          </w:p>
+          <w:p>
+            <w:pPr>
+              <w:spacing w:before="0" w:after="0" w:line="252" w:lineRule="auto"/>
+            </w:pPr>
+            <w:r>
+              <w:rPr>
+                <w:rFonts w:ascii="Calibri" w:hAnsi="Calibri"/>
+                <w:b w:val="0"/>
+                <w:i/>
+                <w:color w:val="9A7A2E"/>
+                <w:sz w:val="18"/>
+                <w:shd w:val="clear" w:color="auto" w:fill="FBF1D8"/>
+              </w:rPr>
+              <w:t>〈Funktion / Grad / abgeschlossen〉</w:t>
+            </w:r>
+          </w:p>
+        </w:tc>
+        <w:tc>
+          <w:tcPr>
+            <w:tcW w:type="dxa" w:w="7030"/>
+            <w:vAlign w:val="top"/>
+            <w:tcMar>
+              <w:top w:w="240" w:type="dxa"/>
+              <w:bottom w:w="240" w:type="dxa"/>
+              <w:start w:w="360" w:type="dxa"/>
+              <w:end w:w="200" w:type="dxa"/>
+              <w:left w:w="360" w:type="dxa"/>
+              <w:right w:w="200" w:type="dxa"/>
+            </w:tcMar>
+          </w:tcPr>
+          <w:p/>
+          <w:p>
+            <w:pPr>
+              <w:spacing w:before="0" w:after="100" w:line="240" w:lineRule="auto"/>
+              <w:pBdr>
+                <w:bottom w:val="single" w:sz="10" w:space="3" w:color="162A43"/>
+              </w:pBdr>
+            </w:pPr>
+            <w:r>
+              <w:rPr>
+                <w:rFonts w:ascii="Calibri" w:hAnsi="Calibri"/>
+                <w:b/>
+                <w:i w:val="0"/>
+                <w:color w:val="162A43"/>
+                <w:sz w:val="25"/>
+                <w:spacing w:val="18"/>
+                <w:caps w:val="true"/>
+              </w:rPr>
+              <w:t>Kurzprofil</w:t>
+            </w:r>
+          </w:p>
+          <w:p>
+            <w:pPr>
+              <w:spacing w:before="0" w:after="40" w:line="283" w:lineRule="auto"/>
+            </w:pPr>
+            <w:r>
+              <w:rPr>
+                <w:rFonts w:ascii="Calibri" w:hAnsi="Calibri"/>
+                <w:b w:val="0"/>
+                <w:i w:val="0"/>
+                <w:color w:val="22262B"/>
+                <w:sz w:val="19"/>
+              </w:rPr>
+              <w:t xml:space="preserve">Technischer Vertriebsprofi mit Schwerpunkt Aussendienst und Gebietsverkauf erklärungsbedürftiger Produkte. Eigenverantwortung für ein Gebietsbudget von rund </w:t>
+            </w:r>
+            <w:r>
+              <w:rPr>
+                <w:rFonts w:ascii="Calibri" w:hAnsi="Calibri"/>
+                <w:b/>
+                <w:i w:val="0"/>
+                <w:color w:val="162A43"/>
+                <w:sz w:val="19"/>
+              </w:rPr>
+              <w:t>CHF 2,5 Mio.</w:t>
+            </w:r>
+            <w:r>
+              <w:rPr>
+                <w:rFonts w:ascii="Calibri" w:hAnsi="Calibri"/>
+                <w:b w:val="0"/>
+                <w:i w:val="0"/>
+                <w:color w:val="22262B"/>
+                <w:sz w:val="19"/>
+              </w:rPr>
+              <w:t xml:space="preserve"> Stärken in Neukundenakquise, technischer Beratung und langfristiger Kundenbindung. Führungserfahrung vorhanden und als persönliche Reife eingebracht – der Fokus bleibt klar auf Gebiets- und Kundenverantwortung. Verlässlich, abschlussstark und auf nachhaltige Geschäftsbeziehungen ausgerichtet.</w:t>
+            </w:r>
+          </w:p>
+          <w:p>
+            <w:pPr>
+              <w:spacing w:before="240" w:after="100" w:line="240" w:lineRule="auto"/>
+              <w:pBdr>
+                <w:bottom w:val="single" w:sz="10" w:space="3" w:color="162A43"/>
+              </w:pBdr>
+            </w:pPr>
+            <w:r>
+              <w:rPr>
+                <w:rFonts w:ascii="Calibri" w:hAnsi="Calibri"/>
+                <w:b/>
+                <w:i w:val="0"/>
+                <w:color w:val="162A43"/>
+                <w:sz w:val="25"/>
+                <w:spacing w:val="18"/>
+                <w:caps w:val="true"/>
+              </w:rPr>
+              <w:t>Berufserfahrung</w:t>
+            </w:r>
+          </w:p>
+          <w:p>
+            <w:pPr>
+              <w:tabs>
+                <w:tab w:pos="6712" w:val="right"/>
+              </w:tabs>
+              <w:spacing w:before="160" w:after="0" w:line="252" w:lineRule="auto"/>
+            </w:pPr>
+            <w:r>
+              <w:rPr>
+                <w:rFonts w:ascii="Calibri" w:hAnsi="Calibri"/>
+                <w:b/>
+                <w:i w:val="0"/>
+                <w:color w:val="22262B"/>
+                <w:sz w:val="22"/>
+              </w:rPr>
+              <w:t>Gebietsverkaufsleiter / Area Sales Manager</w:t>
+            </w:r>
+            <w:r>
+              <w:rPr>
+                <w:rFonts w:ascii="Calibri" w:hAnsi="Calibri"/>
+                <w:b w:val="0"/>
+                <w:i w:val="0"/>
+                <w:color w:val="22262B"/>
+                <w:sz w:val="19"/>
+              </w:rPr>
+              <w:tab/>
+            </w:r>
+            <w:r>
+              <w:rPr>
+                <w:rFonts w:ascii="Calibri" w:hAnsi="Calibri"/>
+                <w:b w:val="0"/>
+                <w:i/>
+                <w:color w:val="9A7A2E"/>
+                <w:sz w:val="18"/>
+                <w:shd w:val="clear" w:color="auto" w:fill="FBF1D8"/>
+              </w:rPr>
+              <w:t>〈MM.JJJJ – heute〉</w:t>
+            </w:r>
+          </w:p>
+          <w:p>
+            <w:pPr>
+              <w:spacing w:before="0" w:after="60" w:line="240" w:lineRule="auto"/>
+            </w:pPr>
+            <w:r>
+              <w:rPr>
+                <w:rFonts w:ascii="Calibri" w:hAnsi="Calibri"/>
+                <w:b/>
+                <w:i w:val="0"/>
+                <w:color w:val="2C5F8A"/>
+                <w:sz w:val="20"/>
+              </w:rPr>
+              <w:t>Cortexia SA</w:t>
+            </w:r>
+            <w:r>
+              <w:rPr>
+                <w:rFonts w:ascii="Calibri" w:hAnsi="Calibri"/>
+                <w:b w:val="0"/>
+                <w:i w:val="0"/>
+                <w:color w:val="6B7280"/>
+                <w:sz w:val="19"/>
+              </w:rPr>
+              <w:t xml:space="preserve">   ·   </w:t>
+            </w:r>
+            <w:r>
+              <w:rPr>
+                <w:rFonts w:ascii="Calibri" w:hAnsi="Calibri"/>
+                <w:b w:val="0"/>
+                <w:i/>
+                <w:color w:val="9A7A2E"/>
+                <w:sz w:val="18"/>
+                <w:shd w:val="clear" w:color="auto" w:fill="FBF1D8"/>
+              </w:rPr>
+              <w:t>〈Region / Ort〉</w:t>
+            </w:r>
+            <w:r>
+              <w:rPr>
+                <w:rFonts w:ascii="Calibri" w:hAnsi="Calibri"/>
+                <w:b w:val="0"/>
+                <w:i w:val="0"/>
+                <w:color w:val="22262B"/>
+                <w:sz w:val="16"/>
+              </w:rPr>
+              <w:t xml:space="preserve">    </w:t>
+            </w:r>
+            <w:r>
+              <w:rPr>
+                <w:rFonts w:ascii="Calibri" w:hAnsi="Calibri"/>
+                <w:b/>
+                <w:i w:val="0"/>
+                <w:color w:val="FFFFFF"/>
+                <w:sz w:val="15"/>
+                <w:shd w:val="clear" w:color="auto" w:fill="2C5F8A"/>
+              </w:rPr>
+              <w:t xml:space="preserve"> Ankerstation </w:t>
+            </w:r>
+          </w:p>
+          <w:p>
+            <w:pPr>
+              <w:spacing w:before="0" w:after="40" w:line="264" w:lineRule="auto"/>
+              <w:ind w:left="238" w:hanging="238"/>
+            </w:pPr>
+            <w:r>
+              <w:rPr>
+                <w:rFonts w:ascii="Calibri" w:hAnsi="Calibri"/>
+                <w:b w:val="0"/>
+                <w:i w:val="0"/>
+                <w:color w:val="2C5F8A"/>
+                <w:sz w:val="18"/>
+              </w:rPr>
+              <w:t xml:space="preserve">▪  </w:t>
+            </w:r>
+            <w:r>
+              <w:rPr>
+                <w:rFonts w:ascii="Calibri" w:hAnsi="Calibri"/>
+                <w:b w:val="0"/>
+                <w:i w:val="0"/>
+                <w:color w:val="22262B"/>
+                <w:sz w:val="19"/>
+              </w:rPr>
+              <w:t xml:space="preserve">Eigenverantwortliche Entwicklung des Verkaufsgebiets mit Budgetvolumen von rund </w:t>
+            </w:r>
+            <w:r>
+              <w:rPr>
+                <w:rFonts w:ascii="Calibri" w:hAnsi="Calibri"/>
+                <w:b w:val="0"/>
+                <w:i w:val="0"/>
+                <w:color w:val="22262B"/>
+                <w:sz w:val="19"/>
+              </w:rPr>
+              <w:t>CHF 2,5 Mio.</w:t>
+            </w:r>
+          </w:p>
+          <w:p>
+            <w:pPr>
+              <w:spacing w:before="0" w:after="40" w:line="264" w:lineRule="auto"/>
+              <w:ind w:left="238" w:hanging="238"/>
+            </w:pPr>
+            <w:r>
+              <w:rPr>
+                <w:rFonts w:ascii="Calibri" w:hAnsi="Calibri"/>
+                <w:b w:val="0"/>
+                <w:i w:val="0"/>
+                <w:color w:val="2C5F8A"/>
+                <w:sz w:val="18"/>
+              </w:rPr>
+              <w:t xml:space="preserve">▪  </w:t>
+            </w:r>
+            <w:r>
+              <w:rPr>
+                <w:rFonts w:ascii="Calibri" w:hAnsi="Calibri"/>
+                <w:b w:val="0"/>
+                <w:i w:val="0"/>
+                <w:color w:val="22262B"/>
+                <w:sz w:val="19"/>
+              </w:rPr>
+              <w:t xml:space="preserve">Neukundenakquise und Ausbau bestehender Kunden; gewonnen: </w:t>
+            </w:r>
+            <w:r>
+              <w:rPr>
+                <w:rFonts w:ascii="Calibri" w:hAnsi="Calibri"/>
+                <w:b w:val="0"/>
+                <w:i/>
+                <w:color w:val="9A7A2E"/>
+                <w:sz w:val="19"/>
+                <w:shd w:val="clear" w:color="auto" w:fill="FBF1D8"/>
+              </w:rPr>
+              <w:t>〈Anzahl Neukunden / Volumen〉</w:t>
+            </w:r>
+          </w:p>
+          <w:p>
+            <w:pPr>
+              <w:spacing w:before="0" w:after="40" w:line="264" w:lineRule="auto"/>
+              <w:ind w:left="238" w:hanging="238"/>
+            </w:pPr>
+            <w:r>
+              <w:rPr>
+                <w:rFonts w:ascii="Calibri" w:hAnsi="Calibri"/>
+                <w:b w:val="0"/>
+                <w:i w:val="0"/>
+                <w:color w:val="2C5F8A"/>
+                <w:sz w:val="18"/>
+              </w:rPr>
+              <w:t xml:space="preserve">▪  </w:t>
+            </w:r>
+            <w:r>
+              <w:rPr>
+                <w:rFonts w:ascii="Calibri" w:hAnsi="Calibri"/>
+                <w:b w:val="0"/>
+                <w:i w:val="0"/>
+                <w:color w:val="22262B"/>
+                <w:sz w:val="19"/>
+              </w:rPr>
+              <w:t>Technische Beratung erklärungsbedürftiger Produkte – Erstansprache bis Abschluss.</w:t>
+            </w:r>
+          </w:p>
+          <w:p>
+            <w:pPr>
+              <w:spacing w:before="0" w:after="40" w:line="264" w:lineRule="auto"/>
+              <w:ind w:left="238" w:hanging="238"/>
+            </w:pPr>
+            <w:r>
+              <w:rPr>
+                <w:rFonts w:ascii="Calibri" w:hAnsi="Calibri"/>
+                <w:b w:val="0"/>
+                <w:i w:val="0"/>
+                <w:color w:val="2C5F8A"/>
+                <w:sz w:val="18"/>
+              </w:rPr>
+              <w:t xml:space="preserve">▪  </w:t>
+            </w:r>
+            <w:r>
+              <w:rPr>
+                <w:rFonts w:ascii="Calibri" w:hAnsi="Calibri"/>
+                <w:b w:val="0"/>
+                <w:i/>
+                <w:color w:val="9A7A2E"/>
+                <w:sz w:val="19"/>
+                <w:shd w:val="clear" w:color="auto" w:fill="FBF1D8"/>
+              </w:rPr>
+              <w:t>〈Konkretes Ergebnis / Projekt aus der Cortexia-Zeit〉</w:t>
+            </w:r>
+          </w:p>
+          <w:p>
+            <w:pPr>
+              <w:tabs>
+                <w:tab w:pos="6712" w:val="right"/>
+              </w:tabs>
+              <w:spacing w:before="160" w:after="0" w:line="252" w:lineRule="auto"/>
+            </w:pPr>
+            <w:r>
+              <w:rPr>
+                <w:rFonts w:ascii="Calibri" w:hAnsi="Calibri"/>
+                <w:b/>
+                <w:i w:val="0"/>
+                <w:color w:val="22262B"/>
+                <w:sz w:val="22"/>
+              </w:rPr>
+              <w:t>Aussendienst / Technischer Verkauf</w:t>
+            </w:r>
+            <w:r>
+              <w:rPr>
+                <w:rFonts w:ascii="Calibri" w:hAnsi="Calibri"/>
+                <w:b w:val="0"/>
+                <w:i w:val="0"/>
+                <w:color w:val="22262B"/>
+                <w:sz w:val="19"/>
+              </w:rPr>
+              <w:tab/>
+            </w:r>
+            <w:r>
+              <w:rPr>
+                <w:rFonts w:ascii="Calibri" w:hAnsi="Calibri"/>
+                <w:b w:val="0"/>
+                <w:i/>
+                <w:color w:val="9A7A2E"/>
+                <w:sz w:val="18"/>
+                <w:shd w:val="clear" w:color="auto" w:fill="FBF1D8"/>
+              </w:rPr>
+              <w:t>〈MM.JJJJ – MM.JJJJ〉</w:t>
+            </w:r>
+          </w:p>
+          <w:p>
+            <w:pPr>
+              <w:spacing w:before="0" w:after="60" w:line="240" w:lineRule="auto"/>
+            </w:pPr>
+            <w:r>
+              <w:rPr>
+                <w:rFonts w:ascii="Calibri" w:hAnsi="Calibri"/>
+                <w:b/>
+                <w:i w:val="0"/>
+                <w:color w:val="2C5F8A"/>
+                <w:sz w:val="20"/>
+              </w:rPr>
+              <w:t>Camille Bauer Metrawatt AG</w:t>
+            </w:r>
+            <w:r>
+              <w:rPr>
+                <w:rFonts w:ascii="Calibri" w:hAnsi="Calibri"/>
+                <w:b w:val="0"/>
+                <w:i w:val="0"/>
+                <w:color w:val="6B7280"/>
+                <w:sz w:val="19"/>
+              </w:rPr>
+              <w:t xml:space="preserve">   ·   </w:t>
+            </w:r>
+            <w:r>
+              <w:rPr>
+                <w:rFonts w:ascii="Calibri" w:hAnsi="Calibri"/>
+                <w:b w:val="0"/>
+                <w:i/>
+                <w:color w:val="9A7A2E"/>
+                <w:sz w:val="18"/>
+                <w:shd w:val="clear" w:color="auto" w:fill="FBF1D8"/>
+              </w:rPr>
+              <w:t>〈Region / Ort〉</w:t>
+            </w:r>
+          </w:p>
+          <w:p>
+            <w:pPr>
+              <w:spacing w:before="0" w:after="40" w:line="264" w:lineRule="auto"/>
+              <w:ind w:left="238" w:hanging="238"/>
+            </w:pPr>
+            <w:r>
+              <w:rPr>
+                <w:rFonts w:ascii="Calibri" w:hAnsi="Calibri"/>
+                <w:b w:val="0"/>
+                <w:i w:val="0"/>
+                <w:color w:val="2C5F8A"/>
+                <w:sz w:val="18"/>
+              </w:rPr>
+              <w:t xml:space="preserve">▪  </w:t>
+            </w:r>
+            <w:r>
+              <w:rPr>
+                <w:rFonts w:ascii="Calibri" w:hAnsi="Calibri"/>
+                <w:b w:val="0"/>
+                <w:i w:val="0"/>
+                <w:color w:val="22262B"/>
+                <w:sz w:val="19"/>
+              </w:rPr>
+              <w:t>Betreuung eines definierten Verkaufsgebiets im technischen B2B-Umfeld.</w:t>
+            </w:r>
+          </w:p>
+          <w:p>
+            <w:pPr>
+              <w:spacing w:before="0" w:after="40" w:line="264" w:lineRule="auto"/>
+              <w:ind w:left="238" w:hanging="238"/>
+            </w:pPr>
+            <w:r>
+              <w:rPr>
+                <w:rFonts w:ascii="Calibri" w:hAnsi="Calibri"/>
+                <w:b w:val="0"/>
+                <w:i w:val="0"/>
+                <w:color w:val="2C5F8A"/>
+                <w:sz w:val="18"/>
+              </w:rPr>
+              <w:t xml:space="preserve">▪  </w:t>
+            </w:r>
+            <w:r>
+              <w:rPr>
+                <w:rFonts w:ascii="Calibri" w:hAnsi="Calibri"/>
+                <w:b w:val="0"/>
+                <w:i w:val="0"/>
+                <w:color w:val="22262B"/>
+                <w:sz w:val="19"/>
+              </w:rPr>
+              <w:t xml:space="preserve">Neukundengewinnung: </w:t>
+            </w:r>
+            <w:r>
+              <w:rPr>
+                <w:rFonts w:ascii="Calibri" w:hAnsi="Calibri"/>
+                <w:b w:val="0"/>
+                <w:i/>
+                <w:color w:val="9A7A2E"/>
+                <w:sz w:val="19"/>
+                <w:shd w:val="clear" w:color="auto" w:fill="FBF1D8"/>
+              </w:rPr>
+              <w:t>〈echte Neukundenzahl〉</w:t>
+            </w:r>
+            <w:r>
+              <w:rPr>
+                <w:rFonts w:ascii="Calibri" w:hAnsi="Calibri"/>
+                <w:b w:val="0"/>
+                <w:i w:val="0"/>
+                <w:color w:val="22262B"/>
+                <w:sz w:val="19"/>
+              </w:rPr>
+              <w:t xml:space="preserve"> – belastbare Zahl statt Prozent.</w:t>
+            </w:r>
+          </w:p>
+          <w:p>
+            <w:pPr>
+              <w:spacing w:before="0" w:after="40" w:line="264" w:lineRule="auto"/>
+              <w:ind w:left="238" w:hanging="238"/>
+            </w:pPr>
+            <w:r>
+              <w:rPr>
+                <w:rFonts w:ascii="Calibri" w:hAnsi="Calibri"/>
+                <w:b w:val="0"/>
+                <w:i w:val="0"/>
+                <w:color w:val="2C5F8A"/>
+                <w:sz w:val="18"/>
+              </w:rPr>
+              <w:t xml:space="preserve">▪  </w:t>
+            </w:r>
+            <w:r>
+              <w:rPr>
+                <w:rFonts w:ascii="Calibri" w:hAnsi="Calibri"/>
+                <w:b w:val="0"/>
+                <w:i/>
+                <w:color w:val="9A7A2E"/>
+                <w:sz w:val="19"/>
+                <w:shd w:val="clear" w:color="auto" w:fill="FBF1D8"/>
+              </w:rPr>
+              <w:t>〈Umsatzentwicklung / Marktsituation (z. B. Umsatz im rückläufigen Markt gehalten und ausgebaut)〉</w:t>
+            </w:r>
+          </w:p>
+          <w:p>
+            <w:pPr>
+              <w:tabs>
+                <w:tab w:pos="6712" w:val="right"/>
+              </w:tabs>
+              <w:spacing w:before="160" w:after="0" w:line="252" w:lineRule="auto"/>
+            </w:pPr>
+            <w:r>
+              <w:rPr>
+                <w:rFonts w:ascii="Calibri" w:hAnsi="Calibri"/>
+                <w:b/>
+                <w:i w:val="0"/>
+                <w:color w:val="22262B"/>
+                <w:sz w:val="22"/>
+              </w:rPr>
+              <w:t>Funktion / Titel</w:t>
+            </w:r>
+            <w:r>
+              <w:rPr>
+                <w:rFonts w:ascii="Calibri" w:hAnsi="Calibri"/>
+                <w:b w:val="0"/>
+                <w:i w:val="0"/>
+                <w:color w:val="22262B"/>
+                <w:sz w:val="19"/>
+              </w:rPr>
+              <w:tab/>
+            </w:r>
+            <w:r>
+              <w:rPr>
+                <w:rFonts w:ascii="Calibri" w:hAnsi="Calibri"/>
+                <w:b w:val="0"/>
+                <w:i/>
+                <w:color w:val="9A7A2E"/>
+                <w:sz w:val="18"/>
+                <w:shd w:val="clear" w:color="auto" w:fill="FBF1D8"/>
+              </w:rPr>
+              <w:t>〈MM.JJJJ – MM.JJJJ〉</w:t>
+            </w:r>
+          </w:p>
+          <w:p>
+            <w:pPr>
+              <w:spacing w:before="0" w:after="60" w:line="240" w:lineRule="auto"/>
+            </w:pPr>
+            <w:r>
+              <w:rPr>
+                <w:rFonts w:ascii="Calibri" w:hAnsi="Calibri"/>
+                <w:b/>
+                <w:i w:val="0"/>
+                <w:color w:val="2C5F8A"/>
+                <w:sz w:val="20"/>
+              </w:rPr>
+              <w:t>MRK</w:t>
+            </w:r>
+            <w:r>
+              <w:rPr>
+                <w:rFonts w:ascii="Calibri" w:hAnsi="Calibri"/>
+                <w:b w:val="0"/>
+                <w:i w:val="0"/>
+                <w:color w:val="6B7280"/>
+                <w:sz w:val="19"/>
+              </w:rPr>
+              <w:t xml:space="preserve">   ·   </w:t>
+            </w:r>
+            <w:r>
+              <w:rPr>
+                <w:rFonts w:ascii="Calibri" w:hAnsi="Calibri"/>
+                <w:b w:val="0"/>
+                <w:i/>
+                <w:color w:val="9A7A2E"/>
+                <w:sz w:val="18"/>
+                <w:shd w:val="clear" w:color="auto" w:fill="FBF1D8"/>
+              </w:rPr>
+              <w:t>〈Ort〉</w:t>
+            </w:r>
+          </w:p>
+          <w:p>
+            <w:pPr>
+              <w:spacing w:before="0" w:after="40" w:line="264" w:lineRule="auto"/>
+              <w:ind w:left="238" w:hanging="238"/>
+            </w:pPr>
+            <w:r>
+              <w:rPr>
+                <w:rFonts w:ascii="Calibri" w:hAnsi="Calibri"/>
+                <w:b w:val="0"/>
+                <w:i w:val="0"/>
+                <w:color w:val="2C5F8A"/>
+                <w:sz w:val="18"/>
+              </w:rPr>
+              <w:t xml:space="preserve">▪  </w:t>
+            </w:r>
+            <w:r>
+              <w:rPr>
+                <w:rFonts w:ascii="Calibri" w:hAnsi="Calibri"/>
+                <w:b w:val="0"/>
+                <w:i/>
+                <w:color w:val="9A7A2E"/>
+                <w:sz w:val="19"/>
+                <w:shd w:val="clear" w:color="auto" w:fill="FBF1D8"/>
+              </w:rPr>
+              <w:t>〈Kernaufgabe und ein messbares Ergebnis〉</w:t>
+            </w:r>
+          </w:p>
+          <w:p>
+            <w:pPr>
+              <w:tabs>
+                <w:tab w:pos="6712" w:val="right"/>
+              </w:tabs>
+              <w:spacing w:before="160" w:after="0" w:line="252" w:lineRule="auto"/>
+            </w:pPr>
+            <w:r>
+              <w:rPr>
+                <w:rFonts w:ascii="Calibri" w:hAnsi="Calibri"/>
+                <w:b/>
+                <w:i w:val="0"/>
+                <w:color w:val="22262B"/>
+                <w:sz w:val="22"/>
+              </w:rPr>
+              <w:t>Funktion / Titel</w:t>
+            </w:r>
+            <w:r>
+              <w:rPr>
+                <w:rFonts w:ascii="Calibri" w:hAnsi="Calibri"/>
+                <w:b w:val="0"/>
+                <w:i w:val="0"/>
+                <w:color w:val="22262B"/>
+                <w:sz w:val="19"/>
+              </w:rPr>
+              <w:tab/>
+            </w:r>
+            <w:r>
+              <w:rPr>
+                <w:rFonts w:ascii="Calibri" w:hAnsi="Calibri"/>
+                <w:b w:val="0"/>
+                <w:i/>
+                <w:color w:val="9A7A2E"/>
+                <w:sz w:val="18"/>
+                <w:shd w:val="clear" w:color="auto" w:fill="FBF1D8"/>
+              </w:rPr>
+              <w:t>〈MM.JJJJ – MM.JJJJ〉</w:t>
+            </w:r>
+          </w:p>
+          <w:p>
+            <w:pPr>
+              <w:spacing w:before="0" w:after="60" w:line="240" w:lineRule="auto"/>
+            </w:pPr>
+            <w:r>
+              <w:rPr>
+                <w:rFonts w:ascii="Calibri" w:hAnsi="Calibri"/>
+                <w:b/>
+                <w:i w:val="0"/>
+                <w:color w:val="2C5F8A"/>
+                <w:sz w:val="20"/>
+              </w:rPr>
+              <w:t>Manz</w:t>
+            </w:r>
+            <w:r>
+              <w:rPr>
+                <w:rFonts w:ascii="Calibri" w:hAnsi="Calibri"/>
+                <w:b w:val="0"/>
+                <w:i w:val="0"/>
+                <w:color w:val="6B7280"/>
+                <w:sz w:val="19"/>
+              </w:rPr>
+              <w:t xml:space="preserve">   ·   </w:t>
+            </w:r>
+            <w:r>
+              <w:rPr>
+                <w:rFonts w:ascii="Calibri" w:hAnsi="Calibri"/>
+                <w:b w:val="0"/>
+                <w:i/>
+                <w:color w:val="9A7A2E"/>
+                <w:sz w:val="18"/>
+                <w:shd w:val="clear" w:color="auto" w:fill="FBF1D8"/>
+              </w:rPr>
+              <w:t>〈Ort〉</w:t>
+            </w:r>
+          </w:p>
+          <w:p>
+            <w:pPr>
+              <w:spacing w:before="0" w:after="40" w:line="264" w:lineRule="auto"/>
+              <w:ind w:left="238" w:hanging="238"/>
+            </w:pPr>
+            <w:r>
+              <w:rPr>
+                <w:rFonts w:ascii="Calibri" w:hAnsi="Calibri"/>
+                <w:b w:val="0"/>
+                <w:i w:val="0"/>
+                <w:color w:val="2C5F8A"/>
+                <w:sz w:val="18"/>
+              </w:rPr>
+              <w:t xml:space="preserve">▪  </w:t>
+            </w:r>
+            <w:r>
+              <w:rPr>
+                <w:rFonts w:ascii="Calibri" w:hAnsi="Calibri"/>
+                <w:b w:val="0"/>
+                <w:i/>
+                <w:color w:val="9A7A2E"/>
+                <w:sz w:val="19"/>
+                <w:shd w:val="clear" w:color="auto" w:fill="FBF1D8"/>
+              </w:rPr>
+              <w:t>〈Kernaufgabe und ein messbares Ergebnis〉</w:t>
+            </w:r>
+          </w:p>
+          <w:p>
+            <w:pPr>
+              <w:tabs>
+                <w:tab w:pos="6712" w:val="right"/>
+              </w:tabs>
+              <w:spacing w:before="160" w:after="0" w:line="252" w:lineRule="auto"/>
+            </w:pPr>
+            <w:r>
+              <w:rPr>
+                <w:rFonts w:ascii="Calibri" w:hAnsi="Calibri"/>
+                <w:b/>
+                <w:i w:val="0"/>
+                <w:color w:val="22262B"/>
+                <w:sz w:val="22"/>
+              </w:rPr>
+              <w:t>Funktion / Titel</w:t>
+            </w:r>
+            <w:r>
+              <w:rPr>
+                <w:rFonts w:ascii="Calibri" w:hAnsi="Calibri"/>
+                <w:b w:val="0"/>
+                <w:i w:val="0"/>
+                <w:color w:val="22262B"/>
+                <w:sz w:val="19"/>
+              </w:rPr>
+              <w:tab/>
+            </w:r>
+            <w:r>
+              <w:rPr>
+                <w:rFonts w:ascii="Calibri" w:hAnsi="Calibri"/>
+                <w:b w:val="0"/>
+                <w:i/>
+                <w:color w:val="9A7A2E"/>
+                <w:sz w:val="18"/>
+                <w:shd w:val="clear" w:color="auto" w:fill="FBF1D8"/>
+              </w:rPr>
+              <w:t>〈MM.JJJJ – MM.JJJJ〉</w:t>
+            </w:r>
+          </w:p>
+          <w:p>
+            <w:pPr>
+              <w:spacing w:before="0" w:after="60" w:line="240" w:lineRule="auto"/>
+            </w:pPr>
+            <w:r>
+              <w:rPr>
+                <w:rFonts w:ascii="Calibri" w:hAnsi="Calibri"/>
+                <w:b/>
+                <w:i w:val="0"/>
+                <w:color w:val="2C5F8A"/>
+                <w:sz w:val="20"/>
+              </w:rPr>
+              <w:t>Anadolu</w:t>
+            </w:r>
+            <w:r>
+              <w:rPr>
+                <w:rFonts w:ascii="Calibri" w:hAnsi="Calibri"/>
+                <w:b w:val="0"/>
+                <w:i w:val="0"/>
+                <w:color w:val="6B7280"/>
+                <w:sz w:val="19"/>
+              </w:rPr>
+              <w:t xml:space="preserve">   ·   </w:t>
+            </w:r>
+            <w:r>
+              <w:rPr>
+                <w:rFonts w:ascii="Calibri" w:hAnsi="Calibri"/>
+                <w:b w:val="0"/>
+                <w:i/>
+                <w:color w:val="9A7A2E"/>
+                <w:sz w:val="18"/>
+                <w:shd w:val="clear" w:color="auto" w:fill="FBF1D8"/>
+              </w:rPr>
+              <w:t>〈Ort〉</w:t>
+            </w:r>
+          </w:p>
+          <w:p>
+            <w:pPr>
+              <w:spacing w:before="0" w:after="40" w:line="264" w:lineRule="auto"/>
+              <w:ind w:left="238" w:hanging="238"/>
+            </w:pPr>
+            <w:r>
+              <w:rPr>
+                <w:rFonts w:ascii="Calibri" w:hAnsi="Calibri"/>
+                <w:b w:val="0"/>
+                <w:i w:val="0"/>
+                <w:color w:val="2C5F8A"/>
+                <w:sz w:val="18"/>
+              </w:rPr>
+              <w:t xml:space="preserve">▪  </w:t>
+            </w:r>
+            <w:r>
+              <w:rPr>
+                <w:rFonts w:ascii="Calibri" w:hAnsi="Calibri"/>
+                <w:b w:val="0"/>
+                <w:i/>
+                <w:color w:val="9A7A2E"/>
+                <w:sz w:val="19"/>
+                <w:shd w:val="clear" w:color="auto" w:fill="FBF1D8"/>
+              </w:rPr>
+              <w:t>〈Kernaufgabe und ein messbares Ergebnis〉</w:t>
+            </w:r>
+          </w:p>
+          <w:p>
+            <w:pPr>
+              <w:tabs>
+                <w:tab w:pos="6712" w:val="right"/>
+              </w:tabs>
+              <w:spacing w:before="160" w:after="0" w:line="252" w:lineRule="auto"/>
+            </w:pPr>
+            <w:r>
+              <w:rPr>
+                <w:rFonts w:ascii="Calibri" w:hAnsi="Calibri"/>
+                <w:b/>
+                <w:i w:val="0"/>
+                <w:color w:val="22262B"/>
+                <w:sz w:val="22"/>
+              </w:rPr>
+              <w:t>Funktion / Titel</w:t>
+            </w:r>
+            <w:r>
+              <w:rPr>
+                <w:rFonts w:ascii="Calibri" w:hAnsi="Calibri"/>
+                <w:b w:val="0"/>
+                <w:i w:val="0"/>
+                <w:color w:val="22262B"/>
+                <w:sz w:val="19"/>
+              </w:rPr>
+              <w:tab/>
+            </w:r>
+            <w:r>
+              <w:rPr>
+                <w:rFonts w:ascii="Calibri" w:hAnsi="Calibri"/>
+                <w:b w:val="0"/>
+                <w:i/>
+                <w:color w:val="9A7A2E"/>
+                <w:sz w:val="18"/>
+                <w:shd w:val="clear" w:color="auto" w:fill="FBF1D8"/>
+              </w:rPr>
+              <w:t>〈MM.JJJJ – MM.JJJJ〉</w:t>
+            </w:r>
+          </w:p>
+          <w:p>
+            <w:pPr>
+              <w:spacing w:before="0" w:after="60" w:line="240" w:lineRule="auto"/>
+            </w:pPr>
+            <w:r>
+              <w:rPr>
+                <w:rFonts w:ascii="Calibri" w:hAnsi="Calibri"/>
+                <w:b/>
+                <w:i w:val="0"/>
+                <w:color w:val="2C5F8A"/>
+                <w:sz w:val="20"/>
+              </w:rPr>
+              <w:t>Pflitsch</w:t>
+            </w:r>
+            <w:r>
+              <w:rPr>
+                <w:rFonts w:ascii="Calibri" w:hAnsi="Calibri"/>
+                <w:b w:val="0"/>
+                <w:i w:val="0"/>
+                <w:color w:val="6B7280"/>
+                <w:sz w:val="19"/>
+              </w:rPr>
+              <w:t xml:space="preserve">   ·   </w:t>
+            </w:r>
+            <w:r>
+              <w:rPr>
+                <w:rFonts w:ascii="Calibri" w:hAnsi="Calibri"/>
+                <w:b w:val="0"/>
+                <w:i/>
+                <w:color w:val="9A7A2E"/>
+                <w:sz w:val="18"/>
+                <w:shd w:val="clear" w:color="auto" w:fill="FBF1D8"/>
+              </w:rPr>
+              <w:t>〈Ort〉</w:t>
+            </w:r>
+          </w:p>
+          <w:p>
+            <w:pPr>
+              <w:spacing w:before="0" w:after="40" w:line="264" w:lineRule="auto"/>
+              <w:ind w:left="238" w:hanging="238"/>
+            </w:pPr>
+            <w:r>
+              <w:rPr>
+                <w:rFonts w:ascii="Calibri" w:hAnsi="Calibri"/>
+                <w:b w:val="0"/>
+                <w:i w:val="0"/>
+                <w:color w:val="2C5F8A"/>
+                <w:sz w:val="18"/>
+              </w:rPr>
+              <w:t xml:space="preserve">▪  </w:t>
+            </w:r>
+            <w:r>
+              <w:rPr>
+                <w:rFonts w:ascii="Calibri" w:hAnsi="Calibri"/>
+                <w:b w:val="0"/>
+                <w:i/>
+                <w:color w:val="9A7A2E"/>
+                <w:sz w:val="19"/>
+                <w:shd w:val="clear" w:color="auto" w:fill="FBF1D8"/>
+              </w:rPr>
+              <w:t>〈Kernaufgabe und ein messbares Ergebnis〉</w:t>
+            </w:r>
+          </w:p>
+          <w:p>
+            <w:pPr>
+              <w:tabs>
+                <w:tab w:pos="6712" w:val="right"/>
+              </w:tabs>
+              <w:spacing w:before="160" w:after="0" w:line="252" w:lineRule="auto"/>
+            </w:pPr>
+            <w:r>
+              <w:rPr>
+                <w:rFonts w:ascii="Calibri" w:hAnsi="Calibri"/>
+                <w:b/>
+                <w:i w:val="0"/>
+                <w:color w:val="22262B"/>
+                <w:sz w:val="22"/>
+              </w:rPr>
+              <w:t>Funktion / Titel</w:t>
+            </w:r>
+            <w:r>
+              <w:rPr>
+                <w:rFonts w:ascii="Calibri" w:hAnsi="Calibri"/>
+                <w:b w:val="0"/>
+                <w:i w:val="0"/>
+                <w:color w:val="22262B"/>
+                <w:sz w:val="19"/>
+              </w:rPr>
+              <w:tab/>
+            </w:r>
+            <w:r>
+              <w:rPr>
+                <w:rFonts w:ascii="Calibri" w:hAnsi="Calibri"/>
+                <w:b w:val="0"/>
+                <w:i/>
+                <w:color w:val="9A7A2E"/>
+                <w:sz w:val="18"/>
+                <w:shd w:val="clear" w:color="auto" w:fill="FBF1D8"/>
+              </w:rPr>
+              <w:t>〈MM.JJJJ – MM.JJJJ〉</w:t>
+            </w:r>
+          </w:p>
+          <w:p>
+            <w:pPr>
+              <w:spacing w:before="0" w:after="60" w:line="240" w:lineRule="auto"/>
+            </w:pPr>
+            <w:r>
+              <w:rPr>
+                <w:rFonts w:ascii="Calibri" w:hAnsi="Calibri"/>
+                <w:b/>
+                <w:i w:val="0"/>
+                <w:color w:val="2C5F8A"/>
+                <w:sz w:val="20"/>
+              </w:rPr>
+              <w:t>Kabuu</w:t>
+            </w:r>
+            <w:r>
+              <w:rPr>
+                <w:rFonts w:ascii="Calibri" w:hAnsi="Calibri"/>
+                <w:b w:val="0"/>
+                <w:i w:val="0"/>
+                <w:color w:val="6B7280"/>
+                <w:sz w:val="19"/>
+              </w:rPr>
+              <w:t xml:space="preserve">   ·   </w:t>
+            </w:r>
+            <w:r>
+              <w:rPr>
+                <w:rFonts w:ascii="Calibri" w:hAnsi="Calibri"/>
+                <w:b w:val="0"/>
+                <w:i/>
+                <w:color w:val="9A7A2E"/>
+                <w:sz w:val="18"/>
+                <w:shd w:val="clear" w:color="auto" w:fill="FBF1D8"/>
+              </w:rPr>
+              <w:t>〈Ort〉</w:t>
+            </w:r>
+          </w:p>
+          <w:p>
+            <w:pPr>
+              <w:spacing w:before="0" w:after="40" w:line="264" w:lineRule="auto"/>
+              <w:ind w:left="238" w:hanging="238"/>
+            </w:pPr>
+            <w:r>
+              <w:rPr>
+                <w:rFonts w:ascii="Calibri" w:hAnsi="Calibri"/>
+                <w:b w:val="0"/>
+                <w:i w:val="0"/>
+                <w:color w:val="2C5F8A"/>
+                <w:sz w:val="18"/>
+              </w:rPr>
+              <w:t xml:space="preserve">▪  </w:t>
+            </w:r>
+            <w:r>
+              <w:rPr>
+                <w:rFonts w:ascii="Calibri" w:hAnsi="Calibri"/>
+                <w:b w:val="0"/>
+                <w:i w:val="0"/>
+                <w:color w:val="22262B"/>
+                <w:sz w:val="19"/>
+              </w:rPr>
+              <w:t>Langjähriges Engagement – Beleg für Beständigkeit und nachhaltige Kundenbeziehungen.</w:t>
+            </w:r>
+          </w:p>
+          <w:p>
+            <w:pPr>
+              <w:spacing w:before="0" w:after="40" w:line="264" w:lineRule="auto"/>
+              <w:ind w:left="238" w:hanging="238"/>
+            </w:pPr>
+            <w:r>
+              <w:rPr>
+                <w:rFonts w:ascii="Calibri" w:hAnsi="Calibri"/>
+                <w:b w:val="0"/>
+                <w:i w:val="0"/>
+                <w:color w:val="2C5F8A"/>
+                <w:sz w:val="18"/>
+              </w:rPr>
+              <w:t xml:space="preserve">▪  </w:t>
+            </w:r>
+            <w:r>
+              <w:rPr>
+                <w:rFonts w:ascii="Calibri" w:hAnsi="Calibri"/>
+                <w:b w:val="0"/>
+                <w:i/>
+                <w:color w:val="9A7A2E"/>
+                <w:sz w:val="19"/>
+                <w:shd w:val="clear" w:color="auto" w:fill="FBF1D8"/>
+              </w:rPr>
+              <w:t>〈Tätigkeit konkretisieren〉</w:t>
+            </w:r>
+          </w:p>
+          <w:p>
+            <w:pPr>
+              <w:tabs>
+                <w:tab w:pos="6712" w:val="right"/>
+              </w:tabs>
+              <w:spacing w:before="160" w:after="0" w:line="252" w:lineRule="auto"/>
+            </w:pPr>
+            <w:r>
+              <w:rPr>
+                <w:rFonts w:ascii="Calibri" w:hAnsi="Calibri"/>
+                <w:b/>
+                <w:i w:val="0"/>
+                <w:color w:val="22262B"/>
+                <w:sz w:val="22"/>
+              </w:rPr>
+              <w:t>Selbständige Tätigkeit</w:t>
+            </w:r>
+            <w:r>
+              <w:rPr>
+                <w:rFonts w:ascii="Calibri" w:hAnsi="Calibri"/>
+                <w:b w:val="0"/>
+                <w:i w:val="0"/>
+                <w:color w:val="22262B"/>
+                <w:sz w:val="19"/>
+              </w:rPr>
+              <w:tab/>
+            </w:r>
+            <w:r>
+              <w:rPr>
+                <w:rFonts w:ascii="Calibri" w:hAnsi="Calibri"/>
+                <w:b w:val="0"/>
+                <w:i/>
+                <w:color w:val="9A7A2E"/>
+                <w:sz w:val="18"/>
+                <w:shd w:val="clear" w:color="auto" w:fill="FBF1D8"/>
+              </w:rPr>
+              <w:t>〈MM.JJJJ – MM.JJJJ〉</w:t>
+            </w:r>
+          </w:p>
+          <w:p>
+            <w:pPr>
+              <w:spacing w:before="0" w:after="60" w:line="240" w:lineRule="auto"/>
+            </w:pPr>
+            <w:r>
+              <w:rPr>
+                <w:rFonts w:ascii="Calibri" w:hAnsi="Calibri"/>
+                <w:b/>
+                <w:i w:val="0"/>
+                <w:color w:val="2C5F8A"/>
+                <w:sz w:val="20"/>
+              </w:rPr>
+              <w:t>Selbständig / Freelance</w:t>
+            </w:r>
+            <w:r>
+              <w:rPr>
+                <w:rFonts w:ascii="Calibri" w:hAnsi="Calibri"/>
+                <w:b w:val="0"/>
+                <w:i w:val="0"/>
+                <w:color w:val="6B7280"/>
+                <w:sz w:val="19"/>
+              </w:rPr>
+              <w:t xml:space="preserve">   ·   </w:t>
+            </w:r>
+            <w:r>
+              <w:rPr>
+                <w:rFonts w:ascii="Calibri" w:hAnsi="Calibri"/>
+                <w:b w:val="0"/>
+                <w:i/>
+                <w:color w:val="9A7A2E"/>
+                <w:sz w:val="18"/>
+                <w:shd w:val="clear" w:color="auto" w:fill="FBF1D8"/>
+              </w:rPr>
+              <w:t>〈Ort〉</w:t>
+            </w:r>
+          </w:p>
+          <w:p>
+            <w:pPr>
+              <w:spacing w:before="0" w:after="40" w:line="264" w:lineRule="auto"/>
+              <w:ind w:left="238" w:hanging="238"/>
+            </w:pPr>
+            <w:r>
+              <w:rPr>
+                <w:rFonts w:ascii="Calibri" w:hAnsi="Calibri"/>
+                <w:b w:val="0"/>
+                <w:i w:val="0"/>
+                <w:color w:val="2C5F8A"/>
+                <w:sz w:val="18"/>
+              </w:rPr>
+              <w:t xml:space="preserve">▪  </w:t>
+            </w:r>
+            <w:r>
+              <w:rPr>
+                <w:rFonts w:ascii="Calibri" w:hAnsi="Calibri"/>
+                <w:b w:val="0"/>
+                <w:i/>
+                <w:color w:val="9A7A2E"/>
+                <w:sz w:val="19"/>
+                <w:shd w:val="clear" w:color="auto" w:fill="FBF1D8"/>
+              </w:rPr>
+              <w:t>〈Schwerpunkt und Reihenfolge der Freelance-Phase einordnen〉</w:t>
+            </w:r>
+          </w:p>
+          <w:p>
+            <w:pPr>
+              <w:spacing w:before="240" w:after="100" w:line="240" w:lineRule="auto"/>
+              <w:pBdr>
+                <w:bottom w:val="single" w:sz="10" w:space="3" w:color="162A43"/>
+              </w:pBdr>
+            </w:pPr>
+            <w:r>
+              <w:rPr>
+                <w:rFonts w:ascii="Calibri" w:hAnsi="Calibri"/>
+                <w:b/>
+                <w:i w:val="0"/>
+                <w:color w:val="162A43"/>
+                <w:sz w:val="25"/>
+                <w:spacing w:val="18"/>
+                <w:caps w:val="true"/>
+              </w:rPr>
+              <w:t>Ausbildung</w:t>
+            </w:r>
+          </w:p>
+          <w:p>
+            <w:pPr>
+              <w:tabs>
+                <w:tab w:pos="6712" w:val="right"/>
+              </w:tabs>
+              <w:spacing w:before="40" w:after="0" w:line="252" w:lineRule="auto"/>
+            </w:pPr>
+            <w:r>
+              <w:rPr>
+                <w:rFonts w:ascii="Calibri" w:hAnsi="Calibri"/>
+                <w:b w:val="0"/>
+                <w:i/>
+                <w:color w:val="9A7A2E"/>
+                <w:sz w:val="20"/>
+                <w:shd w:val="clear" w:color="auto" w:fill="FBF1D8"/>
+              </w:rPr>
+              <w:t>〈Abschluss / Titel〉</w:t>
+            </w:r>
+            <w:r>
+              <w:rPr>
+                <w:rFonts w:ascii="Calibri" w:hAnsi="Calibri"/>
+                <w:b w:val="0"/>
+                <w:i w:val="0"/>
+                <w:color w:val="22262B"/>
+                <w:sz w:val="21"/>
+              </w:rPr>
+              <w:tab/>
+            </w:r>
+            <w:r>
+              <w:rPr>
+                <w:rFonts w:ascii="Calibri" w:hAnsi="Calibri"/>
+                <w:b w:val="0"/>
+                <w:i/>
+                <w:color w:val="9A7A2E"/>
+                <w:sz w:val="18"/>
+                <w:shd w:val="clear" w:color="auto" w:fill="FBF1D8"/>
+              </w:rPr>
+              <w:t>〈JJJJ – JJJJ〉</w:t>
+            </w:r>
+          </w:p>
+          <w:p>
+            <w:pPr>
+              <w:spacing w:before="0" w:after="0" w:line="240" w:lineRule="auto"/>
+            </w:pPr>
+            <w:r>
+              <w:rPr>
+                <w:rFonts w:ascii="Calibri" w:hAnsi="Calibri"/>
+                <w:b w:val="0"/>
+                <w:i/>
+                <w:color w:val="9A7A2E"/>
+                <w:sz w:val="19"/>
+                <w:shd w:val="clear" w:color="auto" w:fill="FBF1D8"/>
+              </w:rPr>
+              <w:t>〈Fachrichtung〉</w:t>
+            </w:r>
+            <w:r>
+              <w:rPr>
+                <w:rFonts w:ascii="Calibri" w:hAnsi="Calibri"/>
+                <w:b w:val="0"/>
+                <w:i w:val="0"/>
+                <w:color w:val="6B7280"/>
+                <w:sz w:val="19"/>
+              </w:rPr>
+              <w:t xml:space="preserve">   ·   </w:t>
+            </w:r>
+            <w:r>
+              <w:rPr>
+                <w:rFonts w:ascii="Calibri" w:hAnsi="Calibri"/>
+                <w:b w:val="0"/>
+                <w:i/>
+                <w:color w:val="9A7A2E"/>
+                <w:sz w:val="19"/>
+                <w:shd w:val="clear" w:color="auto" w:fill="FBF1D8"/>
+              </w:rPr>
+              <w:t>〈Hochschule / Institution, Ort〉</w:t>
+            </w:r>
+          </w:p>
+          <w:p>
+            <w:pPr>
+              <w:spacing w:before="240" w:after="100" w:line="240" w:lineRule="auto"/>
+              <w:pBdr>
+                <w:bottom w:val="single" w:sz="10" w:space="3" w:color="162A43"/>
+              </w:pBdr>
+            </w:pPr>
+            <w:r>
+              <w:rPr>
+                <w:rFonts w:ascii="Calibri" w:hAnsi="Calibri"/>
+                <w:b/>
+                <w:i w:val="0"/>
+                <w:color w:val="162A43"/>
+                <w:sz w:val="25"/>
+                <w:spacing w:val="18"/>
+                <w:caps w:val="true"/>
+              </w:rPr>
+              <w:t>Referenzen</w:t>
+            </w:r>
+          </w:p>
+          <w:p>
+            <w:pPr>
+              <w:spacing w:before="40" w:after="0" w:line="240" w:lineRule="auto"/>
+            </w:pPr>
+            <w:r>
+              <w:rPr>
+                <w:rFonts w:ascii="Calibri" w:hAnsi="Calibri"/>
+                <w:b w:val="0"/>
+                <w:i w:val="0"/>
+                <w:color w:val="6B7280"/>
+                <w:sz w:val="19"/>
+              </w:rPr>
+              <w:t>Auf Anfrage gerne.</w:t>
+            </w:r>
+          </w:p>
+        </w:tc>
+      </w:tr>
+    </w:tbl>
     <w:sectPr>
       <w:pgSz w:w="11906" w:h="16838"/>
-      <w:pgMar w:top="907" w:right="1134" w:bottom="850" w:left="1134" w:header="720" w:footer="720" w:gutter="0"/>
+      <w:pgMar w:top="0" w:right="737" w:bottom="624" w:left="737" w:header="0" w:footer="340" w:gutter="0"/>
       <w:cols w:space="720"/>
       <w:docGrid w:linePitch="360"/>
     </w:sectPr>
@@ -2263,9 +2438,12 @@
     <w:name w:val="Normal"/>
     <w:qFormat/>
     <w:rsid w:val="00FC693F"/>
+    <w:pPr>
+      <w:spacing w:after="0" w:line="269" w:lineRule="auto"/>
+    </w:pPr>
     <w:rPr>
       <w:rFonts w:ascii="Calibri" w:hAnsi="Calibri"/>
-      <w:color w:val="1A1A1A"/>
+      <w:color w:val="22262B"/>
       <w:sz w:val="21"/>
     </w:rPr>
   </w:style>

</xml_diff>

<commit_message>
CV mit echten, verifizierten Daten gefuellt (Profil, Stationen, Ausbildung, Sprachen); nur Datumsfelder als Platzhalter
</commit_message>
<xml_diff>
--- a/bewerbung/Lebenslauf_Burak_Uecoez.docx
+++ b/bewerbung/Lebenslauf_Burak_Uecoez.docx
@@ -64,10 +64,10 @@
                 <w:i w:val="0"/>
                 <w:color w:val="E8ECF1"/>
                 <w:sz w:val="23"/>
-                <w:spacing w:val="14"/>
+                <w:spacing w:val="12"/>
                 <w:caps w:val="true"/>
               </w:rPr>
-              <w:t>Technischer Vertrieb im Aussendienst</w:t>
+              <w:t>Sales Engineer · Technischer Vertrieb</w:t>
             </w:r>
           </w:p>
           <w:p>
@@ -81,9 +81,9 @@
                 <w:i w:val="0"/>
                 <w:color w:val="9FB2C7"/>
                 <w:sz w:val="20"/>
-                <w:spacing w:val="10"/>
+                <w:spacing w:val="8"/>
               </w:rPr>
-              <w:t>Gebietsverkauf  ·  Neukundenakquise  ·  Key-Account</w:t>
+              <w:t>Investitionsgüter  ·  Neukundenakquise  ·  Gebietsverantwortung</w:t>
             </w:r>
           </w:p>
         </w:tc>
@@ -198,23 +198,19 @@
                 <w:color w:val="2C5F8A"/>
                 <w:sz w:val="17"/>
                 <w:spacing w:val="8"/>
-                <w:caps w:val="true"/>
               </w:rPr>
-              <w:t>Adresse</w:t>
+              <w:t>ADRESSE</w:t>
               <w:br/>
             </w:r>
             <w:r>
               <w:rPr>
                 <w:rFonts w:ascii="Calibri" w:hAnsi="Calibri"/>
                 <w:b w:val="0"/>
-                <w:i/>
-                <w:color w:val="9A7A2E"/>
+                <w:i w:val="0"/>
+                <w:color w:val="22262B"/>
                 <w:sz w:val="19"/>
-                <w:shd w:val="clear" w:color="auto" w:fill="FBF1D8"/>
               </w:rPr>
-              <w:t>〈Strasse Nr.</w:t>
-              <w:br/>
-              <w:t>PLZ Ort〉</w:t>
+              <w:t>Im Abt 9a, 8240 Thayngen</w:t>
             </w:r>
           </w:p>
           <w:p>
@@ -229,21 +225,19 @@
                 <w:color w:val="2C5F8A"/>
                 <w:sz w:val="17"/>
                 <w:spacing w:val="8"/>
-                <w:caps w:val="true"/>
               </w:rPr>
-              <w:t>Telefon</w:t>
+              <w:t>TELEFON</w:t>
               <w:br/>
             </w:r>
             <w:r>
               <w:rPr>
                 <w:rFonts w:ascii="Calibri" w:hAnsi="Calibri"/>
                 <w:b w:val="0"/>
-                <w:i/>
-                <w:color w:val="9A7A2E"/>
+                <w:i w:val="0"/>
+                <w:color w:val="22262B"/>
                 <w:sz w:val="19"/>
-                <w:shd w:val="clear" w:color="auto" w:fill="FBF1D8"/>
               </w:rPr>
-              <w:t>〈+41 ...〉</w:t>
+              <w:t>+41 76 202 01 70</w:t>
             </w:r>
           </w:p>
           <w:p>
@@ -258,9 +252,8 @@
                 <w:color w:val="2C5F8A"/>
                 <w:sz w:val="17"/>
                 <w:spacing w:val="8"/>
-                <w:caps w:val="true"/>
               </w:rPr>
-              <w:t>E-Mail</w:t>
+              <w:t>E-MAIL</w:t>
               <w:br/>
             </w:r>
             <w:r>
@@ -286,9 +279,8 @@
                 <w:color w:val="2C5F8A"/>
                 <w:sz w:val="17"/>
                 <w:spacing w:val="8"/>
-                <w:caps w:val="true"/>
               </w:rPr>
-              <w:t>LinkedIn</w:t>
+              <w:t>LINKEDIN</w:t>
               <w:br/>
             </w:r>
             <w:r>
@@ -300,7 +292,7 @@
                 <w:sz w:val="19"/>
                 <w:shd w:val="clear" w:color="auto" w:fill="FBF1D8"/>
               </w:rPr>
-              <w:t>〈linkedin.com/in/...〉</w:t>
+              <w:t>〈Profil-URL ergänzen〉</w:t>
             </w:r>
           </w:p>
           <w:p>
@@ -335,21 +327,19 @@
                 <w:color w:val="2C5F8A"/>
                 <w:sz w:val="17"/>
                 <w:spacing w:val="8"/>
-                <w:caps w:val="true"/>
               </w:rPr>
-              <w:t>Geburtsdatum</w:t>
+              <w:t>GEBURTSDATUM</w:t>
               <w:br/>
             </w:r>
             <w:r>
               <w:rPr>
                 <w:rFonts w:ascii="Calibri" w:hAnsi="Calibri"/>
                 <w:b w:val="0"/>
-                <w:i/>
-                <w:color w:val="9A7A2E"/>
+                <w:i w:val="0"/>
+                <w:color w:val="22262B"/>
                 <w:sz w:val="19"/>
-                <w:shd w:val="clear" w:color="auto" w:fill="FBF1D8"/>
               </w:rPr>
-              <w:t>〈TT.MM.JJJJ〉</w:t>
+              <w:t>29.03.1986</w:t>
             </w:r>
           </w:p>
           <w:p>
@@ -364,21 +354,19 @@
                 <w:color w:val="2C5F8A"/>
                 <w:sz w:val="17"/>
                 <w:spacing w:val="8"/>
-                <w:caps w:val="true"/>
               </w:rPr>
-              <w:t>Nationalität</w:t>
+              <w:t>NATIONALITÄT</w:t>
               <w:br/>
             </w:r>
             <w:r>
               <w:rPr>
                 <w:rFonts w:ascii="Calibri" w:hAnsi="Calibri"/>
                 <w:b w:val="0"/>
-                <w:i/>
-                <w:color w:val="9A7A2E"/>
+                <w:i w:val="0"/>
+                <w:color w:val="22262B"/>
                 <w:sz w:val="19"/>
-                <w:shd w:val="clear" w:color="auto" w:fill="FBF1D8"/>
               </w:rPr>
-              <w:t>〈...〉</w:t>
+              <w:t>deutsch</w:t>
             </w:r>
           </w:p>
           <w:p>
@@ -393,9 +381,8 @@
                 <w:color w:val="2C5F8A"/>
                 <w:sz w:val="17"/>
                 <w:spacing w:val="8"/>
-                <w:caps w:val="true"/>
               </w:rPr>
-              <w:t>Bewilligung / Bürgerort</w:t>
+              <w:t>AUFENTHALT CH</w:t>
               <w:br/>
             </w:r>
             <w:r>
@@ -407,7 +394,7 @@
                 <w:sz w:val="19"/>
                 <w:shd w:val="clear" w:color="auto" w:fill="FBF1D8"/>
               </w:rPr>
-              <w:t>〈...〉</w:t>
+              <w:t>〈Ausweis C / B ergänzen〉</w:t>
             </w:r>
           </w:p>
           <w:p>
@@ -422,21 +409,19 @@
                 <w:color w:val="2C5F8A"/>
                 <w:sz w:val="17"/>
                 <w:spacing w:val="8"/>
-                <w:caps w:val="true"/>
               </w:rPr>
-              <w:t>Führerausweis</w:t>
+              <w:t>FÜHRERAUSWEIS</w:t>
               <w:br/>
             </w:r>
             <w:r>
               <w:rPr>
                 <w:rFonts w:ascii="Calibri" w:hAnsi="Calibri"/>
                 <w:b w:val="0"/>
-                <w:i/>
-                <w:color w:val="9A7A2E"/>
+                <w:i w:val="0"/>
+                <w:color w:val="22262B"/>
                 <w:sz w:val="19"/>
-                <w:shd w:val="clear" w:color="auto" w:fill="FBF1D8"/>
               </w:rPr>
-              <w:t>〈Kat. B〉</w:t>
+              <w:t>Kat. B</w:t>
             </w:r>
           </w:p>
           <w:p>
@@ -461,7 +446,7 @@
           </w:p>
           <w:p>
             <w:pPr>
-              <w:spacing w:before="0" w:after="80" w:line="240" w:lineRule="auto"/>
+              <w:spacing w:before="0" w:after="0" w:line="240" w:lineRule="auto"/>
             </w:pPr>
             <w:r>
               <w:rPr>
@@ -473,31 +458,55 @@
               </w:rPr>
               <w:t>Deutsch</w:t>
             </w:r>
+          </w:p>
+          <w:p>
+            <w:pPr>
+              <w:spacing w:before="0" w:after="80" w:line="240" w:lineRule="auto"/>
+            </w:pPr>
             <w:r>
               <w:rPr>
                 <w:rFonts w:ascii="Calibri" w:hAnsi="Calibri"/>
                 <w:b w:val="0"/>
                 <w:i w:val="0"/>
+                <w:color w:val="6B7280"/>
+                <w:sz w:val="17"/>
+              </w:rPr>
+              <w:t>Muttersprache</w:t>
+            </w:r>
+          </w:p>
+          <w:p>
+            <w:pPr>
+              <w:spacing w:before="0" w:after="0" w:line="240" w:lineRule="auto"/>
+            </w:pPr>
+            <w:r>
+              <w:rPr>
+                <w:rFonts w:ascii="Calibri" w:hAnsi="Calibri"/>
+                <w:b/>
+                <w:i w:val="0"/>
                 <w:color w:val="22262B"/>
                 <w:sz w:val="19"/>
               </w:rPr>
-              <w:t xml:space="preserve">   </w:t>
-            </w:r>
-            <w:r>
-              <w:rPr>
-                <w:rFonts w:ascii="Calibri" w:hAnsi="Calibri"/>
-                <w:b w:val="0"/>
-                <w:i/>
-                <w:color w:val="9A7A2E"/>
-                <w:sz w:val="17"/>
-                <w:shd w:val="clear" w:color="auto" w:fill="FBF1D8"/>
-              </w:rPr>
-              <w:t>〈Muttersprache / Niveau〉</w:t>
+              <w:t>Englisch</w:t>
             </w:r>
           </w:p>
           <w:p>
             <w:pPr>
               <w:spacing w:before="0" w:after="80" w:line="240" w:lineRule="auto"/>
+            </w:pPr>
+            <w:r>
+              <w:rPr>
+                <w:rFonts w:ascii="Calibri" w:hAnsi="Calibri"/>
+                <w:b w:val="0"/>
+                <w:i w:val="0"/>
+                <w:color w:val="6B7280"/>
+                <w:sz w:val="17"/>
+              </w:rPr>
+              <w:t>verhandlungssicher</w:t>
+            </w:r>
+          </w:p>
+          <w:p>
+            <w:pPr>
+              <w:spacing w:before="0" w:after="0" w:line="240" w:lineRule="auto"/>
             </w:pPr>
             <w:r>
               <w:rPr>
@@ -509,27 +518,6 @@
               </w:rPr>
               <w:t>Französisch</w:t>
             </w:r>
-            <w:r>
-              <w:rPr>
-                <w:rFonts w:ascii="Calibri" w:hAnsi="Calibri"/>
-                <w:b w:val="0"/>
-                <w:i w:val="0"/>
-                <w:color w:val="22262B"/>
-                <w:sz w:val="19"/>
-              </w:rPr>
-              <w:t xml:space="preserve">   </w:t>
-            </w:r>
-            <w:r>
-              <w:rPr>
-                <w:rFonts w:ascii="Calibri" w:hAnsi="Calibri"/>
-                <w:b w:val="0"/>
-                <w:i/>
-                <w:color w:val="9A7A2E"/>
-                <w:sz w:val="17"/>
-                <w:shd w:val="clear" w:color="auto" w:fill="FBF1D8"/>
-              </w:rPr>
-              <w:t>〈z. B. B2〉</w:t>
-            </w:r>
           </w:p>
           <w:p>
             <w:pPr>
@@ -538,38 +526,17 @@
             <w:r>
               <w:rPr>
                 <w:rFonts w:ascii="Calibri" w:hAnsi="Calibri"/>
-                <w:b/>
-                <w:i w:val="0"/>
-                <w:color w:val="22262B"/>
-                <w:sz w:val="19"/>
-              </w:rPr>
-              <w:t>Englisch</w:t>
-            </w:r>
-            <w:r>
-              <w:rPr>
-                <w:rFonts w:ascii="Calibri" w:hAnsi="Calibri"/>
                 <w:b w:val="0"/>
                 <w:i w:val="0"/>
-                <w:color w:val="22262B"/>
-                <w:sz w:val="19"/>
+                <w:color w:val="6B7280"/>
+                <w:sz w:val="17"/>
               </w:rPr>
-              <w:t xml:space="preserve">   </w:t>
-            </w:r>
-            <w:r>
-              <w:rPr>
-                <w:rFonts w:ascii="Calibri" w:hAnsi="Calibri"/>
-                <w:b w:val="0"/>
-                <w:i/>
-                <w:color w:val="9A7A2E"/>
-                <w:sz w:val="17"/>
-                <w:shd w:val="clear" w:color="auto" w:fill="FBF1D8"/>
-              </w:rPr>
-              <w:t>〈z. B. B2/C1〉</w:t>
+              <w:t>gute Kenntnisse</w:t>
             </w:r>
           </w:p>
           <w:p>
             <w:pPr>
-              <w:spacing w:before="0" w:after="80" w:line="240" w:lineRule="auto"/>
+              <w:spacing w:before="0" w:after="0" w:line="240" w:lineRule="auto"/>
             </w:pPr>
             <w:r>
               <w:rPr>
@@ -581,26 +548,50 @@
               </w:rPr>
               <w:t>Türkisch</w:t>
             </w:r>
+          </w:p>
+          <w:p>
+            <w:pPr>
+              <w:spacing w:before="0" w:after="80" w:line="240" w:lineRule="auto"/>
+            </w:pPr>
             <w:r>
               <w:rPr>
                 <w:rFonts w:ascii="Calibri" w:hAnsi="Calibri"/>
                 <w:b w:val="0"/>
                 <w:i w:val="0"/>
+                <w:color w:val="6B7280"/>
+                <w:sz w:val="17"/>
+              </w:rPr>
+              <w:t>fliessend</w:t>
+            </w:r>
+          </w:p>
+          <w:p>
+            <w:pPr>
+              <w:spacing w:before="0" w:after="0" w:line="240" w:lineRule="auto"/>
+            </w:pPr>
+            <w:r>
+              <w:rPr>
+                <w:rFonts w:ascii="Calibri" w:hAnsi="Calibri"/>
+                <w:b/>
+                <w:i w:val="0"/>
                 <w:color w:val="22262B"/>
                 <w:sz w:val="19"/>
               </w:rPr>
-              <w:t xml:space="preserve">   </w:t>
+              <w:t>Schweizerdeutsch</w:t>
             </w:r>
+          </w:p>
+          <w:p>
+            <w:pPr>
+              <w:spacing w:before="0" w:after="80" w:line="240" w:lineRule="auto"/>
+            </w:pPr>
             <w:r>
               <w:rPr>
                 <w:rFonts w:ascii="Calibri" w:hAnsi="Calibri"/>
                 <w:b w:val="0"/>
-                <w:i/>
-                <w:color w:val="9A7A2E"/>
+                <w:i w:val="0"/>
+                <w:color w:val="6B7280"/>
                 <w:sz w:val="17"/>
-                <w:shd w:val="clear" w:color="auto" w:fill="FBF1D8"/>
               </w:rPr>
-              <w:t>〈Niveau〉</w:t>
+              <w:t>gutes Verständnis</w:t>
             </w:r>
           </w:p>
           <w:p>
@@ -645,7 +636,7 @@
                 <w:color w:val="22262B"/>
                 <w:sz w:val="19"/>
               </w:rPr>
-              <w:t>Neukundenakquise</w:t>
+              <w:t>Technischer Vertrieb Investitionsgüter</w:t>
             </w:r>
           </w:p>
           <w:p>
@@ -670,7 +661,7 @@
                 <w:color w:val="22262B"/>
                 <w:sz w:val="19"/>
               </w:rPr>
-              <w:t>Gebiets- &amp; Budgetverantwortung</w:t>
+              <w:t>Aktive Neukundenakquise (Hunter)</w:t>
             </w:r>
           </w:p>
           <w:p>
@@ -695,7 +686,32 @@
                 <w:color w:val="22262B"/>
                 <w:sz w:val="19"/>
               </w:rPr>
-              <w:t>Technische Beratung</w:t>
+              <w:t>Consultative / Beratungsverkauf</w:t>
+            </w:r>
+          </w:p>
+          <w:p>
+            <w:pPr>
+              <w:spacing w:before="0" w:after="60" w:line="252" w:lineRule="auto"/>
+            </w:pPr>
+            <w:r>
+              <w:rPr>
+                <w:rFonts w:ascii="Calibri" w:hAnsi="Calibri"/>
+                <w:b w:val="0"/>
+                <w:i w:val="0"/>
+                <w:color w:val="2C5F8A"/>
+                <w:sz w:val="18"/>
+              </w:rPr>
+              <w:t xml:space="preserve">▪ </w:t>
+            </w:r>
+            <w:r>
+              <w:rPr>
+                <w:rFonts w:ascii="Calibri" w:hAnsi="Calibri"/>
+                <w:b w:val="0"/>
+                <w:i w:val="0"/>
+                <w:color w:val="22262B"/>
+                <w:sz w:val="19"/>
+              </w:rPr>
+              <w:t>Angebots- &amp; Projektabwicklung</w:t>
             </w:r>
           </w:p>
           <w:p>
@@ -745,28 +761,7 @@
                 <w:color w:val="22262B"/>
                 <w:sz w:val="19"/>
               </w:rPr>
-              <w:t xml:space="preserve">CRM </w:t>
-            </w:r>
-            <w:r>
-              <w:rPr>
-                <w:rFonts w:ascii="Calibri" w:hAnsi="Calibri"/>
-                <w:b w:val="0"/>
-                <w:i/>
-                <w:color w:val="9A7A2E"/>
-                <w:sz w:val="17"/>
-                <w:shd w:val="clear" w:color="auto" w:fill="FBF1D8"/>
-              </w:rPr>
-              <w:t>〈System〉</w:t>
-            </w:r>
-            <w:r>
-              <w:rPr>
-                <w:rFonts w:ascii="Calibri" w:hAnsi="Calibri"/>
-                <w:b w:val="0"/>
-                <w:i w:val="0"/>
-                <w:color w:val="22262B"/>
-                <w:sz w:val="19"/>
-              </w:rPr>
-              <w:t xml:space="preserve"> · MS Office</w:t>
+              <w:t>CRM · MS Office</w:t>
             </w:r>
           </w:p>
           <w:p>
@@ -786,23 +781,107 @@
                 <w:spacing w:val="24"/>
                 <w:caps w:val="true"/>
               </w:rPr>
-              <w:t>Militärdienst</w:t>
+              <w:t>Zusatzqualifikationen</w:t>
             </w:r>
           </w:p>
           <w:p>
             <w:pPr>
-              <w:spacing w:before="0" w:after="0" w:line="252" w:lineRule="auto"/>
+              <w:spacing w:before="0" w:after="40" w:line="252" w:lineRule="auto"/>
             </w:pPr>
             <w:r>
               <w:rPr>
                 <w:rFonts w:ascii="Calibri" w:hAnsi="Calibri"/>
                 <w:b w:val="0"/>
-                <w:i/>
-                <w:color w:val="9A7A2E"/>
+                <w:i w:val="0"/>
+                <w:color w:val="2C5F8A"/>
                 <w:sz w:val="18"/>
-                <w:shd w:val="clear" w:color="auto" w:fill="FBF1D8"/>
               </w:rPr>
-              <w:t>〈Funktion / Grad / abgeschlossen〉</w:t>
+              <w:t xml:space="preserve">▪ </w:t>
+            </w:r>
+            <w:r>
+              <w:rPr>
+                <w:rFonts w:ascii="Calibri" w:hAnsi="Calibri"/>
+                <w:b w:val="0"/>
+                <w:i w:val="0"/>
+                <w:color w:val="22262B"/>
+                <w:sz w:val="19"/>
+              </w:rPr>
+              <w:t>EMV-Fachkraft</w:t>
+            </w:r>
+          </w:p>
+          <w:p>
+            <w:pPr>
+              <w:spacing w:before="0" w:after="40" w:line="252" w:lineRule="auto"/>
+            </w:pPr>
+            <w:r>
+              <w:rPr>
+                <w:rFonts w:ascii="Calibri" w:hAnsi="Calibri"/>
+                <w:b w:val="0"/>
+                <w:i w:val="0"/>
+                <w:color w:val="2C5F8A"/>
+                <w:sz w:val="18"/>
+              </w:rPr>
+              <w:t xml:space="preserve">▪ </w:t>
+            </w:r>
+            <w:r>
+              <w:rPr>
+                <w:rFonts w:ascii="Calibri" w:hAnsi="Calibri"/>
+                <w:b w:val="0"/>
+                <w:i w:val="0"/>
+                <w:color w:val="22262B"/>
+                <w:sz w:val="19"/>
+              </w:rPr>
+              <w:t>Elektrofachkraft</w:t>
+            </w:r>
+          </w:p>
+          <w:p>
+            <w:pPr>
+              <w:spacing w:before="0" w:after="40" w:line="252" w:lineRule="auto"/>
+            </w:pPr>
+            <w:r>
+              <w:rPr>
+                <w:rFonts w:ascii="Calibri" w:hAnsi="Calibri"/>
+                <w:b w:val="0"/>
+                <w:i w:val="0"/>
+                <w:color w:val="2C5F8A"/>
+                <w:sz w:val="18"/>
+              </w:rPr>
+              <w:t xml:space="preserve">▪ </w:t>
+            </w:r>
+            <w:r>
+              <w:rPr>
+                <w:rFonts w:ascii="Calibri" w:hAnsi="Calibri"/>
+                <w:b w:val="0"/>
+                <w:i w:val="0"/>
+                <w:color w:val="22262B"/>
+                <w:sz w:val="19"/>
+              </w:rPr>
+              <w:t>BetrSichV</w:t>
+            </w:r>
+          </w:p>
+          <w:p>
+            <w:pPr>
+              <w:spacing w:before="0" w:after="40" w:line="252" w:lineRule="auto"/>
+            </w:pPr>
+            <w:r>
+              <w:rPr>
+                <w:rFonts w:ascii="Calibri" w:hAnsi="Calibri"/>
+                <w:b w:val="0"/>
+                <w:i w:val="0"/>
+                <w:color w:val="2C5F8A"/>
+                <w:sz w:val="18"/>
+              </w:rPr>
+              <w:t xml:space="preserve">▪ </w:t>
+            </w:r>
+            <w:r>
+              <w:rPr>
+                <w:rFonts w:ascii="Calibri" w:hAnsi="Calibri"/>
+                <w:b w:val="0"/>
+                <w:i w:val="0"/>
+                <w:color w:val="22262B"/>
+                <w:sz w:val="19"/>
+              </w:rPr>
+              <w:t>DGUV</w:t>
             </w:r>
           </w:p>
         </w:tc>
@@ -852,7 +931,7 @@
                 <w:color w:val="22262B"/>
                 <w:sz w:val="19"/>
               </w:rPr>
-              <w:t xml:space="preserve">Technischer Vertriebsprofi mit Schwerpunkt Aussendienst und Gebietsverkauf erklärungsbedürftiger Produkte. Eigenverantwortung für ein Gebietsbudget von rund </w:t>
+              <w:t xml:space="preserve">Erfahrener Sales Engineer mit </w:t>
             </w:r>
             <w:r>
               <w:rPr>
@@ -862,7 +941,7 @@
                 <w:color w:val="162A43"/>
                 <w:sz w:val="19"/>
               </w:rPr>
-              <w:t>CHF 2,5 Mio.</w:t>
+              <w:t>über 10 Jahren B2B-Erfahrung</w:t>
             </w:r>
             <w:r>
               <w:rPr>
@@ -872,7 +951,7 @@
                 <w:color w:val="22262B"/>
                 <w:sz w:val="19"/>
               </w:rPr>
-              <w:t xml:space="preserve"> Stärken in Neukundenakquise, technischer Beratung und langfristiger Kundenbindung. Führungserfahrung vorhanden und als persönliche Reife eingebracht – der Fokus bleibt klar auf Gebiets- und Kundenverantwortung. Verlässlich, abschlussstark und auf nachhaltige Geschäftsbeziehungen ausgerichtet.</w:t>
+              <w:t xml:space="preserve"> im technischen Vertrieb erklärungsbedürftiger Investitionsgüter. Fundierte technische Basis (Elektrotechnik B.Eng., EMV, Mess- &amp; Analysesysteme) kombiniert mit ausgeprägter Hunter-Mentalität in der aktiven Neukundenakquise. Stärken im consultativen Verkauf komplexer Systeme, in der Angebots- und Projektabwicklung bis zur Inbetriebnahme sowie im Aufbau langfristiger Kundenbeziehungen. Verlässlich, abschlussstark und gewohnt, Verkaufsgebiete eigenverantwortlich zu führen.</w:t>
             </w:r>
           </w:p>
           <w:p>
@@ -910,229 +989,7 @@
                 <w:color w:val="22262B"/>
                 <w:sz w:val="22"/>
               </w:rPr>
-              <w:t>Gebietsverkaufsleiter / Area Sales Manager</w:t>
-            </w:r>
-            <w:r>
-              <w:rPr>
-                <w:rFonts w:ascii="Calibri" w:hAnsi="Calibri"/>
-                <w:b w:val="0"/>
-                <w:i w:val="0"/>
-                <w:color w:val="22262B"/>
-                <w:sz w:val="19"/>
-              </w:rPr>
-              <w:tab/>
-            </w:r>
-            <w:r>
-              <w:rPr>
-                <w:rFonts w:ascii="Calibri" w:hAnsi="Calibri"/>
-                <w:b w:val="0"/>
-                <w:i/>
-                <w:color w:val="9A7A2E"/>
-                <w:sz w:val="18"/>
-                <w:shd w:val="clear" w:color="auto" w:fill="FBF1D8"/>
-              </w:rPr>
-              <w:t>〈MM.JJJJ – heute〉</w:t>
-            </w:r>
-          </w:p>
-          <w:p>
-            <w:pPr>
-              <w:spacing w:before="0" w:after="60" w:line="240" w:lineRule="auto"/>
-            </w:pPr>
-            <w:r>
-              <w:rPr>
-                <w:rFonts w:ascii="Calibri" w:hAnsi="Calibri"/>
-                <w:b/>
-                <w:i w:val="0"/>
-                <w:color w:val="2C5F8A"/>
-                <w:sz w:val="20"/>
-              </w:rPr>
-              <w:t>Cortexia SA</w:t>
-            </w:r>
-            <w:r>
-              <w:rPr>
-                <w:rFonts w:ascii="Calibri" w:hAnsi="Calibri"/>
-                <w:b w:val="0"/>
-                <w:i w:val="0"/>
-                <w:color w:val="6B7280"/>
-                <w:sz w:val="19"/>
-              </w:rPr>
-              <w:t xml:space="preserve">   ·   </w:t>
-            </w:r>
-            <w:r>
-              <w:rPr>
-                <w:rFonts w:ascii="Calibri" w:hAnsi="Calibri"/>
-                <w:b w:val="0"/>
-                <w:i/>
-                <w:color w:val="9A7A2E"/>
-                <w:sz w:val="18"/>
-                <w:shd w:val="clear" w:color="auto" w:fill="FBF1D8"/>
-              </w:rPr>
-              <w:t>〈Region / Ort〉</w:t>
-            </w:r>
-            <w:r>
-              <w:rPr>
-                <w:rFonts w:ascii="Calibri" w:hAnsi="Calibri"/>
-                <w:b w:val="0"/>
-                <w:i w:val="0"/>
-                <w:color w:val="22262B"/>
-                <w:sz w:val="16"/>
-              </w:rPr>
-              <w:t xml:space="preserve">    </w:t>
-            </w:r>
-            <w:r>
-              <w:rPr>
-                <w:rFonts w:ascii="Calibri" w:hAnsi="Calibri"/>
-                <w:b/>
-                <w:i w:val="0"/>
-                <w:color w:val="FFFFFF"/>
-                <w:sz w:val="15"/>
-                <w:shd w:val="clear" w:color="auto" w:fill="2C5F8A"/>
-              </w:rPr>
-              <w:t xml:space="preserve"> Ankerstation </w:t>
-            </w:r>
-          </w:p>
-          <w:p>
-            <w:pPr>
-              <w:spacing w:before="0" w:after="40" w:line="264" w:lineRule="auto"/>
-              <w:ind w:left="238" w:hanging="238"/>
-            </w:pPr>
-            <w:r>
-              <w:rPr>
-                <w:rFonts w:ascii="Calibri" w:hAnsi="Calibri"/>
-                <w:b w:val="0"/>
-                <w:i w:val="0"/>
-                <w:color w:val="2C5F8A"/>
-                <w:sz w:val="18"/>
-              </w:rPr>
-              <w:t xml:space="preserve">▪  </w:t>
-            </w:r>
-            <w:r>
-              <w:rPr>
-                <w:rFonts w:ascii="Calibri" w:hAnsi="Calibri"/>
-                <w:b w:val="0"/>
-                <w:i w:val="0"/>
-                <w:color w:val="22262B"/>
-                <w:sz w:val="19"/>
-              </w:rPr>
-              <w:t xml:space="preserve">Eigenverantwortliche Entwicklung des Verkaufsgebiets mit Budgetvolumen von rund </w:t>
-            </w:r>
-            <w:r>
-              <w:rPr>
-                <w:rFonts w:ascii="Calibri" w:hAnsi="Calibri"/>
-                <w:b w:val="0"/>
-                <w:i w:val="0"/>
-                <w:color w:val="22262B"/>
-                <w:sz w:val="19"/>
-              </w:rPr>
-              <w:t>CHF 2,5 Mio.</w:t>
-            </w:r>
-          </w:p>
-          <w:p>
-            <w:pPr>
-              <w:spacing w:before="0" w:after="40" w:line="264" w:lineRule="auto"/>
-              <w:ind w:left="238" w:hanging="238"/>
-            </w:pPr>
-            <w:r>
-              <w:rPr>
-                <w:rFonts w:ascii="Calibri" w:hAnsi="Calibri"/>
-                <w:b w:val="0"/>
-                <w:i w:val="0"/>
-                <w:color w:val="2C5F8A"/>
-                <w:sz w:val="18"/>
-              </w:rPr>
-              <w:t xml:space="preserve">▪  </w:t>
-            </w:r>
-            <w:r>
-              <w:rPr>
-                <w:rFonts w:ascii="Calibri" w:hAnsi="Calibri"/>
-                <w:b w:val="0"/>
-                <w:i w:val="0"/>
-                <w:color w:val="22262B"/>
-                <w:sz w:val="19"/>
-              </w:rPr>
-              <w:t xml:space="preserve">Neukundenakquise und Ausbau bestehender Kunden; gewonnen: </w:t>
-            </w:r>
-            <w:r>
-              <w:rPr>
-                <w:rFonts w:ascii="Calibri" w:hAnsi="Calibri"/>
-                <w:b w:val="0"/>
-                <w:i/>
-                <w:color w:val="9A7A2E"/>
-                <w:sz w:val="19"/>
-                <w:shd w:val="clear" w:color="auto" w:fill="FBF1D8"/>
-              </w:rPr>
-              <w:t>〈Anzahl Neukunden / Volumen〉</w:t>
-            </w:r>
-          </w:p>
-          <w:p>
-            <w:pPr>
-              <w:spacing w:before="0" w:after="40" w:line="264" w:lineRule="auto"/>
-              <w:ind w:left="238" w:hanging="238"/>
-            </w:pPr>
-            <w:r>
-              <w:rPr>
-                <w:rFonts w:ascii="Calibri" w:hAnsi="Calibri"/>
-                <w:b w:val="0"/>
-                <w:i w:val="0"/>
-                <w:color w:val="2C5F8A"/>
-                <w:sz w:val="18"/>
-              </w:rPr>
-              <w:t xml:space="preserve">▪  </w:t>
-            </w:r>
-            <w:r>
-              <w:rPr>
-                <w:rFonts w:ascii="Calibri" w:hAnsi="Calibri"/>
-                <w:b w:val="0"/>
-                <w:i w:val="0"/>
-                <w:color w:val="22262B"/>
-                <w:sz w:val="19"/>
-              </w:rPr>
-              <w:t>Technische Beratung erklärungsbedürftiger Produkte – Erstansprache bis Abschluss.</w:t>
-            </w:r>
-          </w:p>
-          <w:p>
-            <w:pPr>
-              <w:spacing w:before="0" w:after="40" w:line="264" w:lineRule="auto"/>
-              <w:ind w:left="238" w:hanging="238"/>
-            </w:pPr>
-            <w:r>
-              <w:rPr>
-                <w:rFonts w:ascii="Calibri" w:hAnsi="Calibri"/>
-                <w:b w:val="0"/>
-                <w:i w:val="0"/>
-                <w:color w:val="2C5F8A"/>
-                <w:sz w:val="18"/>
-              </w:rPr>
-              <w:t xml:space="preserve">▪  </w:t>
-            </w:r>
-            <w:r>
-              <w:rPr>
-                <w:rFonts w:ascii="Calibri" w:hAnsi="Calibri"/>
-                <w:b w:val="0"/>
-                <w:i/>
-                <w:color w:val="9A7A2E"/>
-                <w:sz w:val="19"/>
-                <w:shd w:val="clear" w:color="auto" w:fill="FBF1D8"/>
-              </w:rPr>
-              <w:t>〈Konkretes Ergebnis / Projekt aus der Cortexia-Zeit〉</w:t>
-            </w:r>
-          </w:p>
-          <w:p>
-            <w:pPr>
-              <w:tabs>
-                <w:tab w:pos="6712" w:val="right"/>
-              </w:tabs>
-              <w:spacing w:before="160" w:after="0" w:line="252" w:lineRule="auto"/>
-            </w:pPr>
-            <w:r>
-              <w:rPr>
-                <w:rFonts w:ascii="Calibri" w:hAnsi="Calibri"/>
-                <w:b/>
-                <w:i w:val="0"/>
-                <w:color w:val="22262B"/>
-                <w:sz w:val="22"/>
-              </w:rPr>
-              <w:t>Aussendienst / Technischer Verkauf</w:t>
+              <w:t>Sales Engineer · Technischer Vertrieb</w:t>
             </w:r>
             <w:r>
               <w:rPr>
@@ -1184,12 +1041,32 @@
               <w:rPr>
                 <w:rFonts w:ascii="Calibri" w:hAnsi="Calibri"/>
                 <w:b w:val="0"/>
-                <w:i/>
-                <w:color w:val="9A7A2E"/>
-                <w:sz w:val="18"/>
-                <w:shd w:val="clear" w:color="auto" w:fill="FBF1D8"/>
+                <w:i w:val="0"/>
+                <w:color w:val="6B7280"/>
+                <w:sz w:val="19"/>
               </w:rPr>
-              <w:t>〈Region / Ort〉</w:t>
+              <w:t>Wohlen AG</w:t>
+            </w:r>
+            <w:r>
+              <w:rPr>
+                <w:rFonts w:ascii="Calibri" w:hAnsi="Calibri"/>
+                <w:b w:val="0"/>
+                <w:i w:val="0"/>
+                <w:color w:val="22262B"/>
+                <w:sz w:val="16"/>
+              </w:rPr>
+              <w:t xml:space="preserve">    </w:t>
+            </w:r>
+            <w:r>
+              <w:rPr>
+                <w:rFonts w:ascii="Calibri" w:hAnsi="Calibri"/>
+                <w:b/>
+                <w:i w:val="0"/>
+                <w:color w:val="FFFFFF"/>
+                <w:sz w:val="15"/>
+                <w:shd w:val="clear" w:color="auto" w:fill="2C5F8A"/>
+              </w:rPr>
+              <w:t xml:space="preserve"> Aktuellste Position </w:t>
             </w:r>
           </w:p>
           <w:p>
@@ -1215,7 +1092,7 @@
                 <w:color w:val="22262B"/>
                 <w:sz w:val="19"/>
               </w:rPr>
-              <w:t>Betreuung eines definierten Verkaufsgebiets im technischen B2B-Umfeld.</w:t>
+              <w:t>Technischer Vertrieb von Mess- und Analysesystemen (u. a. Sineax, Messwandler / Signalumformer) im B2B-Umfeld.</w:t>
             </w:r>
           </w:p>
           <w:p>
@@ -1241,18 +1118,23 @@
                 <w:color w:val="22262B"/>
                 <w:sz w:val="19"/>
               </w:rPr>
-              <w:t xml:space="preserve">Neukundengewinnung: </w:t>
+              <w:t>Eigenverantwortliche Betreuung und Entwicklung von Kunden über mehrere Kantone.</w:t>
             </w:r>
+          </w:p>
+          <w:p>
+            <w:pPr>
+              <w:spacing w:before="0" w:after="40" w:line="264" w:lineRule="auto"/>
+              <w:ind w:left="238" w:hanging="238"/>
+            </w:pPr>
             <w:r>
               <w:rPr>
                 <w:rFonts w:ascii="Calibri" w:hAnsi="Calibri"/>
                 <w:b w:val="0"/>
-                <w:i/>
-                <w:color w:val="9A7A2E"/>
-                <w:sz w:val="19"/>
-                <w:shd w:val="clear" w:color="auto" w:fill="FBF1D8"/>
+                <w:i w:val="0"/>
+                <w:color w:val="2C5F8A"/>
+                <w:sz w:val="18"/>
               </w:rPr>
-              <w:t>〈echte Neukundenzahl〉</w:t>
+              <w:t xml:space="preserve">▪  </w:t>
             </w:r>
             <w:r>
               <w:rPr>
@@ -1262,7 +1144,7 @@
                 <w:color w:val="22262B"/>
                 <w:sz w:val="19"/>
               </w:rPr>
-              <w:t xml:space="preserve"> – belastbare Zahl statt Prozent.</w:t>
+              <w:t>Aktive Neukundenakquise und Ausbau bestehender Kundenbeziehungen.</w:t>
             </w:r>
           </w:p>
           <w:p>
@@ -1289,7 +1171,7 @@
                 <w:sz w:val="19"/>
                 <w:shd w:val="clear" w:color="auto" w:fill="FBF1D8"/>
               </w:rPr>
-              <w:t>〈Umsatzentwicklung / Marktsituation (z. B. Umsatz im rückläufigen Markt gehalten und ausgebaut)〉</w:t>
+              <w:t>〈Konkretes Ergebnis / Neukundenzahl einsetzen〉</w:t>
             </w:r>
           </w:p>
           <w:p>
@@ -1307,7 +1189,170 @@
                 <w:color w:val="22262B"/>
                 <w:sz w:val="22"/>
               </w:rPr>
-              <w:t>Funktion / Titel</w:t>
+              <w:t>Gebietsverkaufsleiter / Area Sales Manager</w:t>
+            </w:r>
+            <w:r>
+              <w:rPr>
+                <w:rFonts w:ascii="Calibri" w:hAnsi="Calibri"/>
+                <w:b w:val="0"/>
+                <w:i w:val="0"/>
+                <w:color w:val="22262B"/>
+                <w:sz w:val="19"/>
+              </w:rPr>
+              <w:tab/>
+            </w:r>
+            <w:r>
+              <w:rPr>
+                <w:rFonts w:ascii="Calibri" w:hAnsi="Calibri"/>
+                <w:b w:val="0"/>
+                <w:i/>
+                <w:color w:val="9A7A2E"/>
+                <w:sz w:val="18"/>
+                <w:shd w:val="clear" w:color="auto" w:fill="FBF1D8"/>
+              </w:rPr>
+              <w:t>〈MM.JJJJ – MM.JJJJ〉</w:t>
+            </w:r>
+          </w:p>
+          <w:p>
+            <w:pPr>
+              <w:spacing w:before="0" w:after="60" w:line="240" w:lineRule="auto"/>
+            </w:pPr>
+            <w:r>
+              <w:rPr>
+                <w:rFonts w:ascii="Calibri" w:hAnsi="Calibri"/>
+                <w:b/>
+                <w:i w:val="0"/>
+                <w:color w:val="2C5F8A"/>
+                <w:sz w:val="20"/>
+              </w:rPr>
+              <w:t>Cortexia SA</w:t>
+            </w:r>
+            <w:r>
+              <w:rPr>
+                <w:rFonts w:ascii="Calibri" w:hAnsi="Calibri"/>
+                <w:b w:val="0"/>
+                <w:i w:val="0"/>
+                <w:color w:val="6B7280"/>
+                <w:sz w:val="19"/>
+              </w:rPr>
+              <w:t xml:space="preserve">   ·   </w:t>
+            </w:r>
+            <w:r>
+              <w:rPr>
+                <w:rFonts w:ascii="Calibri" w:hAnsi="Calibri"/>
+                <w:b w:val="0"/>
+                <w:i w:val="0"/>
+                <w:color w:val="6B7280"/>
+                <w:sz w:val="19"/>
+              </w:rPr>
+              <w:t>Westschweiz</w:t>
+            </w:r>
+          </w:p>
+          <w:p>
+            <w:pPr>
+              <w:spacing w:before="0" w:after="40" w:line="264" w:lineRule="auto"/>
+              <w:ind w:left="238" w:hanging="238"/>
+            </w:pPr>
+            <w:r>
+              <w:rPr>
+                <w:rFonts w:ascii="Calibri" w:hAnsi="Calibri"/>
+                <w:b w:val="0"/>
+                <w:i w:val="0"/>
+                <w:color w:val="2C5F8A"/>
+                <w:sz w:val="18"/>
+              </w:rPr>
+              <w:t xml:space="preserve">▪  </w:t>
+            </w:r>
+            <w:r>
+              <w:rPr>
+                <w:rFonts w:ascii="Calibri" w:hAnsi="Calibri"/>
+                <w:b w:val="0"/>
+                <w:i w:val="0"/>
+                <w:color w:val="22262B"/>
+                <w:sz w:val="19"/>
+              </w:rPr>
+              <w:t xml:space="preserve">Eigenverantwortliche Entwicklung des Verkaufsgebiets mit einem Budgetvolumen von rund </w:t>
+            </w:r>
+            <w:r>
+              <w:rPr>
+                <w:rFonts w:ascii="Calibri" w:hAnsi="Calibri"/>
+                <w:b w:val="0"/>
+                <w:i w:val="0"/>
+                <w:color w:val="22262B"/>
+                <w:sz w:val="19"/>
+              </w:rPr>
+              <w:t>CHF 2,5 Mio.</w:t>
+            </w:r>
+          </w:p>
+          <w:p>
+            <w:pPr>
+              <w:spacing w:before="0" w:after="40" w:line="264" w:lineRule="auto"/>
+              <w:ind w:left="238" w:hanging="238"/>
+            </w:pPr>
+            <w:r>
+              <w:rPr>
+                <w:rFonts w:ascii="Calibri" w:hAnsi="Calibri"/>
+                <w:b w:val="0"/>
+                <w:i w:val="0"/>
+                <w:color w:val="2C5F8A"/>
+                <w:sz w:val="18"/>
+              </w:rPr>
+              <w:t xml:space="preserve">▪  </w:t>
+            </w:r>
+            <w:r>
+              <w:rPr>
+                <w:rFonts w:ascii="Calibri" w:hAnsi="Calibri"/>
+                <w:b w:val="0"/>
+                <w:i w:val="0"/>
+                <w:color w:val="22262B"/>
+                <w:sz w:val="19"/>
+              </w:rPr>
+              <w:t>Neukundenakquise und technische Beratung – von der Erstansprache bis zum Abschluss.</w:t>
+            </w:r>
+          </w:p>
+          <w:p>
+            <w:pPr>
+              <w:spacing w:before="0" w:after="40" w:line="264" w:lineRule="auto"/>
+              <w:ind w:left="238" w:hanging="238"/>
+            </w:pPr>
+            <w:r>
+              <w:rPr>
+                <w:rFonts w:ascii="Calibri" w:hAnsi="Calibri"/>
+                <w:b w:val="0"/>
+                <w:i w:val="0"/>
+                <w:color w:val="2C5F8A"/>
+                <w:sz w:val="18"/>
+              </w:rPr>
+              <w:t xml:space="preserve">▪  </w:t>
+            </w:r>
+            <w:r>
+              <w:rPr>
+                <w:rFonts w:ascii="Calibri" w:hAnsi="Calibri"/>
+                <w:b w:val="0"/>
+                <w:i/>
+                <w:color w:val="9A7A2E"/>
+                <w:sz w:val="19"/>
+                <w:shd w:val="clear" w:color="auto" w:fill="FBF1D8"/>
+              </w:rPr>
+              <w:t>〈Konkretes Ergebnis / Projekt aus der Cortexia-Zeit ergänzen〉</w:t>
+            </w:r>
+          </w:p>
+          <w:p>
+            <w:pPr>
+              <w:tabs>
+                <w:tab w:pos="6712" w:val="right"/>
+              </w:tabs>
+              <w:spacing w:before="160" w:after="0" w:line="252" w:lineRule="auto"/>
+            </w:pPr>
+            <w:r>
+              <w:rPr>
+                <w:rFonts w:ascii="Calibri" w:hAnsi="Calibri"/>
+                <w:b/>
+                <w:i w:val="0"/>
+                <w:color w:val="22262B"/>
+                <w:sz w:val="22"/>
+              </w:rPr>
+              <w:t>Funktion / Titel ergänzen</w:t>
             </w:r>
             <w:r>
               <w:rPr>
@@ -1359,12 +1404,11 @@
               <w:rPr>
                 <w:rFonts w:ascii="Calibri" w:hAnsi="Calibri"/>
                 <w:b w:val="0"/>
-                <w:i/>
-                <w:color w:val="9A7A2E"/>
-                <w:sz w:val="18"/>
-                <w:shd w:val="clear" w:color="auto" w:fill="FBF1D8"/>
+                <w:i w:val="0"/>
+                <w:color w:val="6B7280"/>
+                <w:sz w:val="19"/>
               </w:rPr>
-              <w:t>〈Ort〉</w:t>
+              <w:t>Ort</w:t>
             </w:r>
           </w:p>
           <w:p>
@@ -1386,12 +1430,22 @@
               <w:rPr>
                 <w:rFonts w:ascii="Calibri" w:hAnsi="Calibri"/>
                 <w:b w:val="0"/>
+                <w:i w:val="0"/>
+                <w:color w:val="22262B"/>
+                <w:sz w:val="19"/>
+              </w:rPr>
+              <w:t xml:space="preserve">Technischer Vertrieb / Aussendienst – </w:t>
+            </w:r>
+            <w:r>
+              <w:rPr>
+                <w:rFonts w:ascii="Calibri" w:hAnsi="Calibri"/>
+                <w:b w:val="0"/>
                 <w:i/>
                 <w:color w:val="9A7A2E"/>
                 <w:sz w:val="19"/>
                 <w:shd w:val="clear" w:color="auto" w:fill="FBF1D8"/>
               </w:rPr>
-              <w:t>〈Kernaufgabe und ein messbares Ergebnis〉</w:t>
+              <w:t>〈Kernaufgabe und ein messbares Ergebnis ergänzen〉</w:t>
             </w:r>
           </w:p>
           <w:p>
@@ -1409,7 +1463,7 @@
                 <w:color w:val="22262B"/>
                 <w:sz w:val="22"/>
               </w:rPr>
-              <w:t>Funktion / Titel</w:t>
+              <w:t>Funktion / Titel ergänzen</w:t>
             </w:r>
             <w:r>
               <w:rPr>
@@ -1461,12 +1515,259 @@
               <w:rPr>
                 <w:rFonts w:ascii="Calibri" w:hAnsi="Calibri"/>
                 <w:b w:val="0"/>
+                <w:i w:val="0"/>
+                <w:color w:val="6B7280"/>
+                <w:sz w:val="19"/>
+              </w:rPr>
+              <w:t>Ort</w:t>
+            </w:r>
+          </w:p>
+          <w:p>
+            <w:pPr>
+              <w:spacing w:before="0" w:after="40" w:line="264" w:lineRule="auto"/>
+              <w:ind w:left="238" w:hanging="238"/>
+            </w:pPr>
+            <w:r>
+              <w:rPr>
+                <w:rFonts w:ascii="Calibri" w:hAnsi="Calibri"/>
+                <w:b w:val="0"/>
+                <w:i w:val="0"/>
+                <w:color w:val="2C5F8A"/>
+                <w:sz w:val="18"/>
+              </w:rPr>
+              <w:t xml:space="preserve">▪  </w:t>
+            </w:r>
+            <w:r>
+              <w:rPr>
+                <w:rFonts w:ascii="Calibri" w:hAnsi="Calibri"/>
+                <w:b w:val="0"/>
+                <w:i w:val="0"/>
+                <w:color w:val="22262B"/>
+                <w:sz w:val="19"/>
+              </w:rPr>
+              <w:t xml:space="preserve">Technischer Vertrieb / Aussendienst – </w:t>
+            </w:r>
+            <w:r>
+              <w:rPr>
+                <w:rFonts w:ascii="Calibri" w:hAnsi="Calibri"/>
+                <w:b w:val="0"/>
+                <w:i/>
+                <w:color w:val="9A7A2E"/>
+                <w:sz w:val="19"/>
+                <w:shd w:val="clear" w:color="auto" w:fill="FBF1D8"/>
+              </w:rPr>
+              <w:t>〈Kernaufgabe und ein messbares Ergebnis ergänzen〉</w:t>
+            </w:r>
+          </w:p>
+          <w:p>
+            <w:pPr>
+              <w:tabs>
+                <w:tab w:pos="6712" w:val="right"/>
+              </w:tabs>
+              <w:spacing w:before="160" w:after="0" w:line="252" w:lineRule="auto"/>
+            </w:pPr>
+            <w:r>
+              <w:rPr>
+                <w:rFonts w:ascii="Calibri" w:hAnsi="Calibri"/>
+                <w:b/>
+                <w:i w:val="0"/>
+                <w:color w:val="22262B"/>
+                <w:sz w:val="22"/>
+              </w:rPr>
+              <w:t>Funktion / Titel ergänzen</w:t>
+            </w:r>
+            <w:r>
+              <w:rPr>
+                <w:rFonts w:ascii="Calibri" w:hAnsi="Calibri"/>
+                <w:b w:val="0"/>
+                <w:i w:val="0"/>
+                <w:color w:val="22262B"/>
+                <w:sz w:val="19"/>
+              </w:rPr>
+              <w:tab/>
+            </w:r>
+            <w:r>
+              <w:rPr>
+                <w:rFonts w:ascii="Calibri" w:hAnsi="Calibri"/>
+                <w:b w:val="0"/>
                 <w:i/>
                 <w:color w:val="9A7A2E"/>
                 <w:sz w:val="18"/>
                 <w:shd w:val="clear" w:color="auto" w:fill="FBF1D8"/>
               </w:rPr>
-              <w:t>〈Ort〉</w:t>
+              <w:t>〈MM.JJJJ – MM.JJJJ〉</w:t>
+            </w:r>
+          </w:p>
+          <w:p>
+            <w:pPr>
+              <w:spacing w:before="0" w:after="60" w:line="240" w:lineRule="auto"/>
+            </w:pPr>
+            <w:r>
+              <w:rPr>
+                <w:rFonts w:ascii="Calibri" w:hAnsi="Calibri"/>
+                <w:b/>
+                <w:i w:val="0"/>
+                <w:color w:val="2C5F8A"/>
+                <w:sz w:val="20"/>
+              </w:rPr>
+              <w:t>Pflitsch</w:t>
+            </w:r>
+            <w:r>
+              <w:rPr>
+                <w:rFonts w:ascii="Calibri" w:hAnsi="Calibri"/>
+                <w:b w:val="0"/>
+                <w:i w:val="0"/>
+                <w:color w:val="6B7280"/>
+                <w:sz w:val="19"/>
+              </w:rPr>
+              <w:t xml:space="preserve">   ·   </w:t>
+            </w:r>
+            <w:r>
+              <w:rPr>
+                <w:rFonts w:ascii="Calibri" w:hAnsi="Calibri"/>
+                <w:b w:val="0"/>
+                <w:i w:val="0"/>
+                <w:color w:val="6B7280"/>
+                <w:sz w:val="19"/>
+              </w:rPr>
+              <w:t>Ort</w:t>
+            </w:r>
+          </w:p>
+          <w:p>
+            <w:pPr>
+              <w:spacing w:before="0" w:after="40" w:line="264" w:lineRule="auto"/>
+              <w:ind w:left="238" w:hanging="238"/>
+            </w:pPr>
+            <w:r>
+              <w:rPr>
+                <w:rFonts w:ascii="Calibri" w:hAnsi="Calibri"/>
+                <w:b w:val="0"/>
+                <w:i w:val="0"/>
+                <w:color w:val="2C5F8A"/>
+                <w:sz w:val="18"/>
+              </w:rPr>
+              <w:t xml:space="preserve">▪  </w:t>
+            </w:r>
+            <w:r>
+              <w:rPr>
+                <w:rFonts w:ascii="Calibri" w:hAnsi="Calibri"/>
+                <w:b w:val="0"/>
+                <w:i w:val="0"/>
+                <w:color w:val="22262B"/>
+                <w:sz w:val="19"/>
+              </w:rPr>
+              <w:t xml:space="preserve">Technischer Vertrieb / Aussendienst – </w:t>
+            </w:r>
+            <w:r>
+              <w:rPr>
+                <w:rFonts w:ascii="Calibri" w:hAnsi="Calibri"/>
+                <w:b w:val="0"/>
+                <w:i/>
+                <w:color w:val="9A7A2E"/>
+                <w:sz w:val="19"/>
+                <w:shd w:val="clear" w:color="auto" w:fill="FBF1D8"/>
+              </w:rPr>
+              <w:t>〈Kernaufgabe und ein messbares Ergebnis ergänzen〉</w:t>
+            </w:r>
+          </w:p>
+          <w:p>
+            <w:pPr>
+              <w:tabs>
+                <w:tab w:pos="6712" w:val="right"/>
+              </w:tabs>
+              <w:spacing w:before="160" w:after="0" w:line="252" w:lineRule="auto"/>
+            </w:pPr>
+            <w:r>
+              <w:rPr>
+                <w:rFonts w:ascii="Calibri" w:hAnsi="Calibri"/>
+                <w:b/>
+                <w:i w:val="0"/>
+                <w:color w:val="22262B"/>
+                <w:sz w:val="22"/>
+              </w:rPr>
+              <w:t>Selbständige Ingenieur- &amp; Vertriebstätigkeit</w:t>
+            </w:r>
+            <w:r>
+              <w:rPr>
+                <w:rFonts w:ascii="Calibri" w:hAnsi="Calibri"/>
+                <w:b w:val="0"/>
+                <w:i w:val="0"/>
+                <w:color w:val="22262B"/>
+                <w:sz w:val="19"/>
+              </w:rPr>
+              <w:tab/>
+            </w:r>
+            <w:r>
+              <w:rPr>
+                <w:rFonts w:ascii="Calibri" w:hAnsi="Calibri"/>
+                <w:b w:val="0"/>
+                <w:i/>
+                <w:color w:val="9A7A2E"/>
+                <w:sz w:val="18"/>
+                <w:shd w:val="clear" w:color="auto" w:fill="FBF1D8"/>
+              </w:rPr>
+              <w:t>〈MM.JJJJ – MM.JJJJ〉</w:t>
+            </w:r>
+          </w:p>
+          <w:p>
+            <w:pPr>
+              <w:spacing w:before="0" w:after="60" w:line="240" w:lineRule="auto"/>
+            </w:pPr>
+            <w:r>
+              <w:rPr>
+                <w:rFonts w:ascii="Calibri" w:hAnsi="Calibri"/>
+                <w:b/>
+                <w:i w:val="0"/>
+                <w:color w:val="2C5F8A"/>
+                <w:sz w:val="20"/>
+              </w:rPr>
+              <w:t>Kabuu Engineering</w:t>
+            </w:r>
+            <w:r>
+              <w:rPr>
+                <w:rFonts w:ascii="Calibri" w:hAnsi="Calibri"/>
+                <w:b w:val="0"/>
+                <w:i w:val="0"/>
+                <w:color w:val="6B7280"/>
+                <w:sz w:val="19"/>
+              </w:rPr>
+              <w:t xml:space="preserve">   ·   </w:t>
+            </w:r>
+            <w:r>
+              <w:rPr>
+                <w:rFonts w:ascii="Calibri" w:hAnsi="Calibri"/>
+                <w:b w:val="0"/>
+                <w:i w:val="0"/>
+                <w:color w:val="6B7280"/>
+                <w:sz w:val="19"/>
+              </w:rPr>
+              <w:t>Hagen (DE)</w:t>
+            </w:r>
+          </w:p>
+          <w:p>
+            <w:pPr>
+              <w:spacing w:before="0" w:after="40" w:line="264" w:lineRule="auto"/>
+              <w:ind w:left="238" w:hanging="238"/>
+            </w:pPr>
+            <w:r>
+              <w:rPr>
+                <w:rFonts w:ascii="Calibri" w:hAnsi="Calibri"/>
+                <w:b w:val="0"/>
+                <w:i w:val="0"/>
+                <w:color w:val="2C5F8A"/>
+                <w:sz w:val="18"/>
+              </w:rPr>
+              <w:t xml:space="preserve">▪  </w:t>
+            </w:r>
+            <w:r>
+              <w:rPr>
+                <w:rFonts w:ascii="Calibri" w:hAnsi="Calibri"/>
+                <w:b w:val="0"/>
+                <w:i w:val="0"/>
+                <w:color w:val="22262B"/>
+                <w:sz w:val="19"/>
+              </w:rPr>
+              <w:t>Selbständige Tätigkeit im technischen Engineering- und Vertriebsumfeld (Freelance).</w:t>
             </w:r>
           </w:p>
           <w:p>
@@ -1493,7 +1794,7 @@
                 <w:sz w:val="19"/>
                 <w:shd w:val="clear" w:color="auto" w:fill="FBF1D8"/>
               </w:rPr>
-              <w:t>〈Kernaufgabe und ein messbares Ergebnis〉</w:t>
+              <w:t>〈Schwerpunkt / Projekte konkretisieren〉</w:t>
             </w:r>
           </w:p>
           <w:p>
@@ -1511,7 +1812,7 @@
                 <w:color w:val="22262B"/>
                 <w:sz w:val="22"/>
               </w:rPr>
-              <w:t>Funktion / Titel</w:t>
+              <w:t>Mithilfe Familienbetrieb</w:t>
             </w:r>
             <w:r>
               <w:rPr>
@@ -1563,12 +1864,11 @@
               <w:rPr>
                 <w:rFonts w:ascii="Calibri" w:hAnsi="Calibri"/>
                 <w:b w:val="0"/>
-                <w:i/>
-                <w:color w:val="9A7A2E"/>
-                <w:sz w:val="18"/>
-                <w:shd w:val="clear" w:color="auto" w:fill="FBF1D8"/>
+                <w:i w:val="0"/>
+                <w:color w:val="6B7280"/>
+                <w:sz w:val="19"/>
               </w:rPr>
-              <w:t>〈Ort〉</w:t>
+              <w:t>Ort</w:t>
             </w:r>
           </w:p>
           <w:p>
@@ -1595,339 +1895,7 @@
                 <w:sz w:val="19"/>
                 <w:shd w:val="clear" w:color="auto" w:fill="FBF1D8"/>
               </w:rPr>
-              <w:t>〈Kernaufgabe und ein messbares Ergebnis〉</w:t>
-            </w:r>
-          </w:p>
-          <w:p>
-            <w:pPr>
-              <w:tabs>
-                <w:tab w:pos="6712" w:val="right"/>
-              </w:tabs>
-              <w:spacing w:before="160" w:after="0" w:line="252" w:lineRule="auto"/>
-            </w:pPr>
-            <w:r>
-              <w:rPr>
-                <w:rFonts w:ascii="Calibri" w:hAnsi="Calibri"/>
-                <w:b/>
-                <w:i w:val="0"/>
-                <w:color w:val="22262B"/>
-                <w:sz w:val="22"/>
-              </w:rPr>
-              <w:t>Funktion / Titel</w:t>
-            </w:r>
-            <w:r>
-              <w:rPr>
-                <w:rFonts w:ascii="Calibri" w:hAnsi="Calibri"/>
-                <w:b w:val="0"/>
-                <w:i w:val="0"/>
-                <w:color w:val="22262B"/>
-                <w:sz w:val="19"/>
-              </w:rPr>
-              <w:tab/>
-            </w:r>
-            <w:r>
-              <w:rPr>
-                <w:rFonts w:ascii="Calibri" w:hAnsi="Calibri"/>
-                <w:b w:val="0"/>
-                <w:i/>
-                <w:color w:val="9A7A2E"/>
-                <w:sz w:val="18"/>
-                <w:shd w:val="clear" w:color="auto" w:fill="FBF1D8"/>
-              </w:rPr>
-              <w:t>〈MM.JJJJ – MM.JJJJ〉</w:t>
-            </w:r>
-          </w:p>
-          <w:p>
-            <w:pPr>
-              <w:spacing w:before="0" w:after="60" w:line="240" w:lineRule="auto"/>
-            </w:pPr>
-            <w:r>
-              <w:rPr>
-                <w:rFonts w:ascii="Calibri" w:hAnsi="Calibri"/>
-                <w:b/>
-                <w:i w:val="0"/>
-                <w:color w:val="2C5F8A"/>
-                <w:sz w:val="20"/>
-              </w:rPr>
-              <w:t>Pflitsch</w:t>
-            </w:r>
-            <w:r>
-              <w:rPr>
-                <w:rFonts w:ascii="Calibri" w:hAnsi="Calibri"/>
-                <w:b w:val="0"/>
-                <w:i w:val="0"/>
-                <w:color w:val="6B7280"/>
-                <w:sz w:val="19"/>
-              </w:rPr>
-              <w:t xml:space="preserve">   ·   </w:t>
-            </w:r>
-            <w:r>
-              <w:rPr>
-                <w:rFonts w:ascii="Calibri" w:hAnsi="Calibri"/>
-                <w:b w:val="0"/>
-                <w:i/>
-                <w:color w:val="9A7A2E"/>
-                <w:sz w:val="18"/>
-                <w:shd w:val="clear" w:color="auto" w:fill="FBF1D8"/>
-              </w:rPr>
-              <w:t>〈Ort〉</w:t>
-            </w:r>
-          </w:p>
-          <w:p>
-            <w:pPr>
-              <w:spacing w:before="0" w:after="40" w:line="264" w:lineRule="auto"/>
-              <w:ind w:left="238" w:hanging="238"/>
-            </w:pPr>
-            <w:r>
-              <w:rPr>
-                <w:rFonts w:ascii="Calibri" w:hAnsi="Calibri"/>
-                <w:b w:val="0"/>
-                <w:i w:val="0"/>
-                <w:color w:val="2C5F8A"/>
-                <w:sz w:val="18"/>
-              </w:rPr>
-              <w:t xml:space="preserve">▪  </w:t>
-            </w:r>
-            <w:r>
-              <w:rPr>
-                <w:rFonts w:ascii="Calibri" w:hAnsi="Calibri"/>
-                <w:b w:val="0"/>
-                <w:i/>
-                <w:color w:val="9A7A2E"/>
-                <w:sz w:val="19"/>
-                <w:shd w:val="clear" w:color="auto" w:fill="FBF1D8"/>
-              </w:rPr>
-              <w:t>〈Kernaufgabe und ein messbares Ergebnis〉</w:t>
-            </w:r>
-          </w:p>
-          <w:p>
-            <w:pPr>
-              <w:tabs>
-                <w:tab w:pos="6712" w:val="right"/>
-              </w:tabs>
-              <w:spacing w:before="160" w:after="0" w:line="252" w:lineRule="auto"/>
-            </w:pPr>
-            <w:r>
-              <w:rPr>
-                <w:rFonts w:ascii="Calibri" w:hAnsi="Calibri"/>
-                <w:b/>
-                <w:i w:val="0"/>
-                <w:color w:val="22262B"/>
-                <w:sz w:val="22"/>
-              </w:rPr>
-              <w:t>Funktion / Titel</w:t>
-            </w:r>
-            <w:r>
-              <w:rPr>
-                <w:rFonts w:ascii="Calibri" w:hAnsi="Calibri"/>
-                <w:b w:val="0"/>
-                <w:i w:val="0"/>
-                <w:color w:val="22262B"/>
-                <w:sz w:val="19"/>
-              </w:rPr>
-              <w:tab/>
-            </w:r>
-            <w:r>
-              <w:rPr>
-                <w:rFonts w:ascii="Calibri" w:hAnsi="Calibri"/>
-                <w:b w:val="0"/>
-                <w:i/>
-                <w:color w:val="9A7A2E"/>
-                <w:sz w:val="18"/>
-                <w:shd w:val="clear" w:color="auto" w:fill="FBF1D8"/>
-              </w:rPr>
-              <w:t>〈MM.JJJJ – MM.JJJJ〉</w:t>
-            </w:r>
-          </w:p>
-          <w:p>
-            <w:pPr>
-              <w:spacing w:before="0" w:after="60" w:line="240" w:lineRule="auto"/>
-            </w:pPr>
-            <w:r>
-              <w:rPr>
-                <w:rFonts w:ascii="Calibri" w:hAnsi="Calibri"/>
-                <w:b/>
-                <w:i w:val="0"/>
-                <w:color w:val="2C5F8A"/>
-                <w:sz w:val="20"/>
-              </w:rPr>
-              <w:t>Kabuu</w:t>
-            </w:r>
-            <w:r>
-              <w:rPr>
-                <w:rFonts w:ascii="Calibri" w:hAnsi="Calibri"/>
-                <w:b w:val="0"/>
-                <w:i w:val="0"/>
-                <w:color w:val="6B7280"/>
-                <w:sz w:val="19"/>
-              </w:rPr>
-              <w:t xml:space="preserve">   ·   </w:t>
-            </w:r>
-            <w:r>
-              <w:rPr>
-                <w:rFonts w:ascii="Calibri" w:hAnsi="Calibri"/>
-                <w:b w:val="0"/>
-                <w:i/>
-                <w:color w:val="9A7A2E"/>
-                <w:sz w:val="18"/>
-                <w:shd w:val="clear" w:color="auto" w:fill="FBF1D8"/>
-              </w:rPr>
-              <w:t>〈Ort〉</w:t>
-            </w:r>
-          </w:p>
-          <w:p>
-            <w:pPr>
-              <w:spacing w:before="0" w:after="40" w:line="264" w:lineRule="auto"/>
-              <w:ind w:left="238" w:hanging="238"/>
-            </w:pPr>
-            <w:r>
-              <w:rPr>
-                <w:rFonts w:ascii="Calibri" w:hAnsi="Calibri"/>
-                <w:b w:val="0"/>
-                <w:i w:val="0"/>
-                <w:color w:val="2C5F8A"/>
-                <w:sz w:val="18"/>
-              </w:rPr>
-              <w:t xml:space="preserve">▪  </w:t>
-            </w:r>
-            <w:r>
-              <w:rPr>
-                <w:rFonts w:ascii="Calibri" w:hAnsi="Calibri"/>
-                <w:b w:val="0"/>
-                <w:i w:val="0"/>
-                <w:color w:val="22262B"/>
-                <w:sz w:val="19"/>
-              </w:rPr>
-              <w:t>Langjähriges Engagement – Beleg für Beständigkeit und nachhaltige Kundenbeziehungen.</w:t>
-            </w:r>
-          </w:p>
-          <w:p>
-            <w:pPr>
-              <w:spacing w:before="0" w:after="40" w:line="264" w:lineRule="auto"/>
-              <w:ind w:left="238" w:hanging="238"/>
-            </w:pPr>
-            <w:r>
-              <w:rPr>
-                <w:rFonts w:ascii="Calibri" w:hAnsi="Calibri"/>
-                <w:b w:val="0"/>
-                <w:i w:val="0"/>
-                <w:color w:val="2C5F8A"/>
-                <w:sz w:val="18"/>
-              </w:rPr>
-              <w:t xml:space="preserve">▪  </w:t>
-            </w:r>
-            <w:r>
-              <w:rPr>
-                <w:rFonts w:ascii="Calibri" w:hAnsi="Calibri"/>
-                <w:b w:val="0"/>
-                <w:i/>
-                <w:color w:val="9A7A2E"/>
-                <w:sz w:val="19"/>
-                <w:shd w:val="clear" w:color="auto" w:fill="FBF1D8"/>
-              </w:rPr>
-              <w:t>〈Tätigkeit konkretisieren〉</w:t>
-            </w:r>
-          </w:p>
-          <w:p>
-            <w:pPr>
-              <w:tabs>
-                <w:tab w:pos="6712" w:val="right"/>
-              </w:tabs>
-              <w:spacing w:before="160" w:after="0" w:line="252" w:lineRule="auto"/>
-            </w:pPr>
-            <w:r>
-              <w:rPr>
-                <w:rFonts w:ascii="Calibri" w:hAnsi="Calibri"/>
-                <w:b/>
-                <w:i w:val="0"/>
-                <w:color w:val="22262B"/>
-                <w:sz w:val="22"/>
-              </w:rPr>
-              <w:t>Selbständige Tätigkeit</w:t>
-            </w:r>
-            <w:r>
-              <w:rPr>
-                <w:rFonts w:ascii="Calibri" w:hAnsi="Calibri"/>
-                <w:b w:val="0"/>
-                <w:i w:val="0"/>
-                <w:color w:val="22262B"/>
-                <w:sz w:val="19"/>
-              </w:rPr>
-              <w:tab/>
-            </w:r>
-            <w:r>
-              <w:rPr>
-                <w:rFonts w:ascii="Calibri" w:hAnsi="Calibri"/>
-                <w:b w:val="0"/>
-                <w:i/>
-                <w:color w:val="9A7A2E"/>
-                <w:sz w:val="18"/>
-                <w:shd w:val="clear" w:color="auto" w:fill="FBF1D8"/>
-              </w:rPr>
-              <w:t>〈MM.JJJJ – MM.JJJJ〉</w:t>
-            </w:r>
-          </w:p>
-          <w:p>
-            <w:pPr>
-              <w:spacing w:before="0" w:after="60" w:line="240" w:lineRule="auto"/>
-            </w:pPr>
-            <w:r>
-              <w:rPr>
-                <w:rFonts w:ascii="Calibri" w:hAnsi="Calibri"/>
-                <w:b/>
-                <w:i w:val="0"/>
-                <w:color w:val="2C5F8A"/>
-                <w:sz w:val="20"/>
-              </w:rPr>
-              <w:t>Selbständig / Freelance</w:t>
-            </w:r>
-            <w:r>
-              <w:rPr>
-                <w:rFonts w:ascii="Calibri" w:hAnsi="Calibri"/>
-                <w:b w:val="0"/>
-                <w:i w:val="0"/>
-                <w:color w:val="6B7280"/>
-                <w:sz w:val="19"/>
-              </w:rPr>
-              <w:t xml:space="preserve">   ·   </w:t>
-            </w:r>
-            <w:r>
-              <w:rPr>
-                <w:rFonts w:ascii="Calibri" w:hAnsi="Calibri"/>
-                <w:b w:val="0"/>
-                <w:i/>
-                <w:color w:val="9A7A2E"/>
-                <w:sz w:val="18"/>
-                <w:shd w:val="clear" w:color="auto" w:fill="FBF1D8"/>
-              </w:rPr>
-              <w:t>〈Ort〉</w:t>
-            </w:r>
-          </w:p>
-          <w:p>
-            <w:pPr>
-              <w:spacing w:before="0" w:after="40" w:line="264" w:lineRule="auto"/>
-              <w:ind w:left="238" w:hanging="238"/>
-            </w:pPr>
-            <w:r>
-              <w:rPr>
-                <w:rFonts w:ascii="Calibri" w:hAnsi="Calibri"/>
-                <w:b w:val="0"/>
-                <w:i w:val="0"/>
-                <w:color w:val="2C5F8A"/>
-                <w:sz w:val="18"/>
-              </w:rPr>
-              <w:t xml:space="preserve">▪  </w:t>
-            </w:r>
-            <w:r>
-              <w:rPr>
-                <w:rFonts w:ascii="Calibri" w:hAnsi="Calibri"/>
-                <w:b w:val="0"/>
-                <w:i/>
-                <w:color w:val="9A7A2E"/>
-                <w:sz w:val="19"/>
-                <w:shd w:val="clear" w:color="auto" w:fill="FBF1D8"/>
-              </w:rPr>
-              <w:t>〈Schwerpunkt und Reihenfolge der Freelance-Phase einordnen〉</w:t>
+              <w:t>〈Optional – nur aufnehmen, falls relevant; sonst diese Station löschen〉</w:t>
             </w:r>
           </w:p>
           <w:p>
@@ -1960,13 +1928,12 @@
             <w:r>
               <w:rPr>
                 <w:rFonts w:ascii="Calibri" w:hAnsi="Calibri"/>
-                <w:b w:val="0"/>
-                <w:i/>
-                <w:color w:val="9A7A2E"/>
+                <w:b/>
+                <w:i w:val="0"/>
+                <w:color w:val="22262B"/>
                 <w:sz w:val="20"/>
-                <w:shd w:val="clear" w:color="auto" w:fill="FBF1D8"/>
               </w:rPr>
-              <w:t>〈Abschluss / Titel〉</w:t>
+              <w:t>Bachelor of Engineering (B.Eng.) – Elektrotechnik</w:t>
             </w:r>
             <w:r>
               <w:rPr>
@@ -1998,33 +1965,46 @@
               <w:rPr>
                 <w:rFonts w:ascii="Calibri" w:hAnsi="Calibri"/>
                 <w:b w:val="0"/>
-                <w:i/>
-                <w:color w:val="9A7A2E"/>
+                <w:i w:val="0"/>
+                <w:color w:val="6B7280"/>
                 <w:sz w:val="19"/>
-                <w:shd w:val="clear" w:color="auto" w:fill="FBF1D8"/>
               </w:rPr>
-              <w:t>〈Fachrichtung〉</w:t>
+              <w:t>Hochschule Bochum, Deutschland</w:t>
             </w:r>
+          </w:p>
+          <w:p>
+            <w:pPr>
+              <w:spacing w:before="240" w:after="100" w:line="240" w:lineRule="auto"/>
+              <w:pBdr>
+                <w:bottom w:val="single" w:sz="10" w:space="3" w:color="162A43"/>
+              </w:pBdr>
+            </w:pPr>
+            <w:r>
+              <w:rPr>
+                <w:rFonts w:ascii="Calibri" w:hAnsi="Calibri"/>
+                <w:b/>
+                <w:i w:val="0"/>
+                <w:color w:val="162A43"/>
+                <w:sz w:val="25"/>
+                <w:spacing w:val="18"/>
+                <w:caps w:val="true"/>
+              </w:rPr>
+              <w:t>Weiterbildung &amp; Zertifikate</w:t>
+            </w:r>
+          </w:p>
+          <w:p>
+            <w:pPr>
+              <w:spacing w:before="40" w:after="0" w:line="264" w:lineRule="auto"/>
+            </w:pPr>
             <w:r>
               <w:rPr>
                 <w:rFonts w:ascii="Calibri" w:hAnsi="Calibri"/>
                 <w:b w:val="0"/>
                 <w:i w:val="0"/>
-                <w:color w:val="6B7280"/>
+                <w:color w:val="22262B"/>
                 <w:sz w:val="19"/>
               </w:rPr>
-              <w:t xml:space="preserve">   ·   </w:t>
-            </w:r>
-            <w:r>
-              <w:rPr>
-                <w:rFonts w:ascii="Calibri" w:hAnsi="Calibri"/>
-                <w:b w:val="0"/>
-                <w:i/>
-                <w:color w:val="9A7A2E"/>
-                <w:sz w:val="19"/>
-                <w:shd w:val="clear" w:color="auto" w:fill="FBF1D8"/>
-              </w:rPr>
-              <w:t>〈Hochschule / Institution, Ort〉</w:t>
+              <w:t>EMV-Fachkraft · Elektrofachkraft · Betriebssicherheitsverordnung (BetrSichV) · DGUV</w:t>
             </w:r>
           </w:p>
           <w:p>

</xml_diff>